<commit_message>
Clean up project structure: merge Documentation/ into docs/, remove DEPLOYMENT.md
- Move Documentation_Technique.md and Gestion_Projet.md to docs/
- Remove duplicate Charte_Graphique.md from Documentation/
- Delete DEPLOYMENT.md from root
- Update copie à rendre with deployment info

Co-Authored-By: Claude Opus 4.6 <noreply@anthropic.com>
</commit_message>
<xml_diff>
--- a/TP_DWWM_copiearendre.docx
+++ b/TP_DWWM_copiearendre.docx
@@ -32,23 +32,13 @@
           <w:lang w:val="fr-FR"/>
         </w:rPr>
       </w:pPr>
-      <w:proofErr w:type="spellStart"/>
       <w:r>
         <w:rPr>
           <w:color w:val="333333"/>
           <w:sz w:val="32"/>
           <w:lang w:val="fr-FR"/>
         </w:rPr>
-        <w:t>EcoRide</w:t>
-      </w:r>
-      <w:proofErr w:type="spellEnd"/>
-      <w:r>
-        <w:rPr>
-          <w:color w:val="333333"/>
-          <w:sz w:val="32"/>
-          <w:lang w:val="fr-FR"/>
-        </w:rPr>
-        <w:t xml:space="preserve"> – Plateforme de covoiturage écologique</w:t>
+        <w:t>EcoRide – Plateforme de covoiturage écologique</w:t>
       </w:r>
     </w:p>
     <w:p>
@@ -70,7 +60,13 @@
           <w:sz w:val="24"/>
           <w:lang w:val="fr-FR"/>
         </w:rPr>
-        <w:t>Référence : [À COMPLÉTER]</w:t>
+        <w:t xml:space="preserve">Référence : </w:t>
+      </w:r>
+      <w:r>
+        <w:rPr>
+          <w:sz w:val="24"/>
+        </w:rPr>
+        <w:t>EvaluationenCoursdeFormationECF__425370_20251222122827</w:t>
       </w:r>
       <w:r>
         <w:rPr>
@@ -80,7 +76,6 @@
         <w:br/>
         <w:t xml:space="preserve">Nom : </w:t>
       </w:r>
-      <w:proofErr w:type="spellStart"/>
       <w:r>
         <w:rPr>
           <w:sz w:val="24"/>
@@ -88,7 +83,6 @@
         </w:rPr>
         <w:t>Alajarin</w:t>
       </w:r>
-      <w:proofErr w:type="spellEnd"/>
       <w:r>
         <w:rPr>
           <w:sz w:val="24"/>
@@ -427,13 +421,7 @@
         <w:rPr>
           <w:lang w:val="fr-FR"/>
         </w:rPr>
-        <w:t>https://github.com/halajarin/StudyProject</w:t>
-      </w:r>
-      <w:r>
-        <w:rPr>
-          <w:lang w:val="fr-FR"/>
-        </w:rPr>
-        <w:t xml:space="preserve"> </w:t>
+        <w:t xml:space="preserve">https://github.com/halajarin/StudyProject </w:t>
       </w:r>
     </w:p>
     <w:p>
@@ -688,17 +676,8 @@
             <w:tcW w:w="4320" w:type="dxa"/>
           </w:tcPr>
           <w:p>
-            <w:pPr>
-              <w:cnfStyle w:val="000000100000" w:firstRow="0" w:lastRow="0" w:firstColumn="0" w:lastColumn="0" w:oddVBand="0" w:evenVBand="0" w:oddHBand="1" w:evenHBand="0" w:firstRowFirstColumn="0" w:firstRowLastColumn="0" w:lastRowFirstColumn="0" w:lastRowLastColumn="0"/>
-              <w:rPr>
-                <w:lang w:val="fr-FR"/>
-              </w:rPr>
-            </w:pPr>
             <w:r>
-              <w:rPr>
-                <w:lang w:val="fr-FR"/>
-              </w:rPr>
-              <w:t>[À COMPLÉTER – Azure / Railway / autre]</w:t>
+              <w:t>Kubernetes on-premise (myportal3e.io)</w:t>
             </w:r>
           </w:p>
         </w:tc>
@@ -732,19 +711,11 @@
           <w:lang w:val="fr-FR"/>
         </w:rPr>
       </w:pPr>
-      <w:proofErr w:type="spellStart"/>
-      <w:r>
-        <w:rPr>
-          <w:lang w:val="fr-FR"/>
-        </w:rPr>
-        <w:t>Angular</w:t>
-      </w:r>
-      <w:proofErr w:type="spellEnd"/>
-      <w:r>
-        <w:rPr>
-          <w:lang w:val="fr-FR"/>
-        </w:rPr>
-        <w:t xml:space="preserve"> 20</w:t>
+      <w:r>
+        <w:rPr>
+          <w:lang w:val="fr-FR"/>
+        </w:rPr>
+        <w:t>Angular 20</w:t>
       </w:r>
     </w:p>
     <w:p>
@@ -753,89 +724,11 @@
           <w:lang w:val="fr-FR"/>
         </w:rPr>
       </w:pPr>
-      <w:proofErr w:type="spellStart"/>
-      <w:r>
-        <w:rPr>
-          <w:lang w:val="fr-FR"/>
-        </w:rPr>
-        <w:t>Angular</w:t>
-      </w:r>
-      <w:proofErr w:type="spellEnd"/>
-      <w:r>
-        <w:rPr>
-          <w:lang w:val="fr-FR"/>
-        </w:rPr>
-        <w:t xml:space="preserve"> a été choisi pour le frontend car c'est un </w:t>
-      </w:r>
-      <w:proofErr w:type="spellStart"/>
-      <w:r>
-        <w:rPr>
-          <w:lang w:val="fr-FR"/>
-        </w:rPr>
-        <w:t>framework</w:t>
-      </w:r>
-      <w:proofErr w:type="spellEnd"/>
-      <w:r>
-        <w:rPr>
-          <w:lang w:val="fr-FR"/>
-        </w:rPr>
-        <w:t xml:space="preserve"> complet et structuré qui offre nativement le </w:t>
-      </w:r>
-      <w:proofErr w:type="spellStart"/>
-      <w:r>
-        <w:rPr>
-          <w:lang w:val="fr-FR"/>
-        </w:rPr>
-        <w:t>routing</w:t>
-      </w:r>
-      <w:proofErr w:type="spellEnd"/>
-      <w:r>
-        <w:rPr>
-          <w:lang w:val="fr-FR"/>
-        </w:rPr>
-        <w:t xml:space="preserve">, les formulaires réactifs, l'injection de dépendances et l'internationalisation. La version 20 apporte les standalone components (pas de </w:t>
-      </w:r>
-      <w:proofErr w:type="spellStart"/>
-      <w:r>
-        <w:rPr>
-          <w:lang w:val="fr-FR"/>
-        </w:rPr>
-        <w:t>NgModule</w:t>
-      </w:r>
-      <w:proofErr w:type="spellEnd"/>
-      <w:r>
-        <w:rPr>
-          <w:lang w:val="fr-FR"/>
-        </w:rPr>
-        <w:t xml:space="preserve">) et les </w:t>
-      </w:r>
-      <w:proofErr w:type="spellStart"/>
-      <w:r>
-        <w:rPr>
-          <w:lang w:val="fr-FR"/>
-        </w:rPr>
-        <w:t>signals</w:t>
-      </w:r>
-      <w:proofErr w:type="spellEnd"/>
-      <w:r>
-        <w:rPr>
-          <w:lang w:val="fr-FR"/>
-        </w:rPr>
-        <w:t xml:space="preserve"> pour une gestion réactive de l'état plus performante. Le typage strict de </w:t>
-      </w:r>
-      <w:proofErr w:type="spellStart"/>
-      <w:r>
-        <w:rPr>
-          <w:lang w:val="fr-FR"/>
-        </w:rPr>
-        <w:t>TypeScript</w:t>
-      </w:r>
-      <w:proofErr w:type="spellEnd"/>
-      <w:r>
-        <w:rPr>
-          <w:lang w:val="fr-FR"/>
-        </w:rPr>
-        <w:t xml:space="preserve"> réduit les erreurs à la compilation.</w:t>
+      <w:r>
+        <w:rPr>
+          <w:lang w:val="fr-FR"/>
+        </w:rPr>
+        <w:t>Angular a été choisi pour le frontend car c'est un framework complet et structuré qui offre nativement le routing, les formulaires réactifs, l'injection de dépendances et l'internationalisation. La version 20 apporte les standalone components (pas de NgModule) et les signals pour une gestion réactive de l'état plus performante. Le typage strict de TypeScript réduit les erreurs à la compilation.</w:t>
       </w:r>
     </w:p>
     <w:p>
@@ -862,49 +755,7 @@
         <w:rPr>
           <w:lang w:val="fr-FR"/>
         </w:rPr>
-        <w:t xml:space="preserve">Le backend utilise ASP.NET Core Web API pour sa robustesse, ses performances et son écosystème mature. </w:t>
-      </w:r>
-      <w:proofErr w:type="spellStart"/>
-      <w:r>
-        <w:rPr>
-          <w:lang w:val="fr-FR"/>
-        </w:rPr>
-        <w:t>Entity</w:t>
-      </w:r>
-      <w:proofErr w:type="spellEnd"/>
-      <w:r>
-        <w:rPr>
-          <w:lang w:val="fr-FR"/>
-        </w:rPr>
-        <w:t xml:space="preserve"> Framework Core permet un mapping objet-relationnel efficace avec PostgreSQL. L'architecture en couches (</w:t>
-      </w:r>
-      <w:proofErr w:type="spellStart"/>
-      <w:r>
-        <w:rPr>
-          <w:lang w:val="fr-FR"/>
-        </w:rPr>
-        <w:t>WebApi</w:t>
-      </w:r>
-      <w:proofErr w:type="spellEnd"/>
-      <w:r>
-        <w:rPr>
-          <w:lang w:val="fr-FR"/>
-        </w:rPr>
-        <w:t xml:space="preserve"> → Business → Data → </w:t>
-      </w:r>
-      <w:proofErr w:type="spellStart"/>
-      <w:r>
-        <w:rPr>
-          <w:lang w:val="fr-FR"/>
-        </w:rPr>
-        <w:t>Dtos</w:t>
-      </w:r>
-      <w:proofErr w:type="spellEnd"/>
-      <w:r>
-        <w:rPr>
-          <w:lang w:val="fr-FR"/>
-        </w:rPr>
-        <w:t>) assure une séparation claire des responsabilités et facilite la testabilité.</w:t>
+        <w:t>Le backend utilise ASP.NET Core Web API pour sa robustesse, ses performances et son écosystème mature. Entity Framework Core permet un mapping objet-relationnel efficace avec PostgreSQL. L'architecture en couches (WebApi → Business → Data → Dtos) assure une séparation claire des responsabilités et facilite la testabilité.</w:t>
       </w:r>
     </w:p>
     <w:p>
@@ -958,21 +809,7 @@
         <w:rPr>
           <w:lang w:val="fr-FR"/>
         </w:rPr>
-        <w:t xml:space="preserve">MongoDB est utilisé comme base de données NoSQL pour stocker la configuration applicative (paramètres, </w:t>
-      </w:r>
-      <w:proofErr w:type="spellStart"/>
-      <w:r>
-        <w:rPr>
-          <w:lang w:val="fr-FR"/>
-        </w:rPr>
-        <w:t>feature</w:t>
-      </w:r>
-      <w:proofErr w:type="spellEnd"/>
-      <w:r>
-        <w:rPr>
-          <w:lang w:val="fr-FR"/>
-        </w:rPr>
-        <w:t xml:space="preserve"> flags). Sa flexibilité de schéma permet d'ajouter de nouveaux paramètres sans migration de base de données.</w:t>
+        <w:t>MongoDB est utilisé comme base de données NoSQL pour stocker la configuration applicative (paramètres, feature flags). Sa flexibilité de schéma permet d'ajouter de nouveaux paramètres sans migration de base de données.</w:t>
       </w:r>
     </w:p>
     <w:p>
@@ -986,21 +823,7 @@
         <w:rPr>
           <w:lang w:val="fr-FR"/>
         </w:rPr>
-        <w:t>Internationalisation (</w:t>
-      </w:r>
-      <w:proofErr w:type="spellStart"/>
-      <w:r>
-        <w:rPr>
-          <w:lang w:val="fr-FR"/>
-        </w:rPr>
-        <w:t>ngx</w:t>
-      </w:r>
-      <w:proofErr w:type="spellEnd"/>
-      <w:r>
-        <w:rPr>
-          <w:lang w:val="fr-FR"/>
-        </w:rPr>
-        <w:t>-translate)</w:t>
+        <w:t>Internationalisation (ngx-translate)</w:t>
       </w:r>
     </w:p>
     <w:p>
@@ -1013,21 +836,7 @@
         <w:rPr>
           <w:lang w:val="fr-FR"/>
         </w:rPr>
-        <w:t xml:space="preserve">L'application est entièrement traduite en français et en anglais grâce à </w:t>
-      </w:r>
-      <w:proofErr w:type="spellStart"/>
-      <w:r>
-        <w:rPr>
-          <w:lang w:val="fr-FR"/>
-        </w:rPr>
-        <w:t>ngx</w:t>
-      </w:r>
-      <w:proofErr w:type="spellEnd"/>
-      <w:r>
-        <w:rPr>
-          <w:lang w:val="fr-FR"/>
-        </w:rPr>
-        <w:t>-translate. Les fichiers de traduction JSON permettent d'ajouter facilement de nouvelles langues.</w:t>
+        <w:t>L'application est entièrement traduite en français et en anglais grâce à ngx-translate. Les fichiers de traduction JSON permettent d'ajouter facilement de nouvelles langues.</w:t>
       </w:r>
     </w:p>
     <w:p>
@@ -1082,77 +891,7 @@
         <w:rPr>
           <w:lang w:val="fr-FR"/>
         </w:rPr>
-        <w:t xml:space="preserve">L'authentification repose sur des JSON Web </w:t>
-      </w:r>
-      <w:proofErr w:type="spellStart"/>
-      <w:r>
-        <w:rPr>
-          <w:lang w:val="fr-FR"/>
-        </w:rPr>
-        <w:t>Tokens</w:t>
-      </w:r>
-      <w:proofErr w:type="spellEnd"/>
-      <w:r>
-        <w:rPr>
-          <w:lang w:val="fr-FR"/>
-        </w:rPr>
-        <w:t xml:space="preserve"> (JWT). À la connexion, le serveur génère un </w:t>
-      </w:r>
-      <w:proofErr w:type="spellStart"/>
-      <w:r>
-        <w:rPr>
-          <w:lang w:val="fr-FR"/>
-        </w:rPr>
-        <w:t>token</w:t>
-      </w:r>
-      <w:proofErr w:type="spellEnd"/>
-      <w:r>
-        <w:rPr>
-          <w:lang w:val="fr-FR"/>
-        </w:rPr>
-        <w:t xml:space="preserve"> signé contenant l'identifiant utilisateur et ses rôles. Ce </w:t>
-      </w:r>
-      <w:proofErr w:type="spellStart"/>
-      <w:r>
-        <w:rPr>
-          <w:lang w:val="fr-FR"/>
-        </w:rPr>
-        <w:t>token</w:t>
-      </w:r>
-      <w:proofErr w:type="spellEnd"/>
-      <w:r>
-        <w:rPr>
-          <w:lang w:val="fr-FR"/>
-        </w:rPr>
-        <w:t xml:space="preserve"> est envoyé dans le header </w:t>
-      </w:r>
-      <w:proofErr w:type="spellStart"/>
-      <w:r>
-        <w:rPr>
-          <w:lang w:val="fr-FR"/>
-        </w:rPr>
-        <w:t>Authorization</w:t>
-      </w:r>
-      <w:proofErr w:type="spellEnd"/>
-      <w:r>
-        <w:rPr>
-          <w:lang w:val="fr-FR"/>
-        </w:rPr>
-        <w:t xml:space="preserve"> de chaque requête HTTP. Les </w:t>
-      </w:r>
-      <w:proofErr w:type="spellStart"/>
-      <w:r>
-        <w:rPr>
-          <w:lang w:val="fr-FR"/>
-        </w:rPr>
-        <w:t>tokens</w:t>
-      </w:r>
-      <w:proofErr w:type="spellEnd"/>
-      <w:r>
-        <w:rPr>
-          <w:lang w:val="fr-FR"/>
-        </w:rPr>
-        <w:t xml:space="preserve"> ont une durée de validité limitée.</w:t>
+        <w:t>L'authentification repose sur des JSON Web Tokens (JWT). À la connexion, le serveur génère un token signé contenant l'identifiant utilisateur et ses rôles. Ce token est envoyé dans le header Authorization de chaque requête HTTP. Les tokens ont une durée de validité limitée.</w:t>
       </w:r>
     </w:p>
     <w:p>
@@ -1179,21 +918,7 @@
         <w:rPr>
           <w:lang w:val="fr-FR"/>
         </w:rPr>
-        <w:t xml:space="preserve">Les mots de passe sont hachés avec </w:t>
-      </w:r>
-      <w:proofErr w:type="spellStart"/>
-      <w:r>
-        <w:rPr>
-          <w:lang w:val="fr-FR"/>
-        </w:rPr>
-        <w:t>BCrypt</w:t>
-      </w:r>
-      <w:proofErr w:type="spellEnd"/>
-      <w:r>
-        <w:rPr>
-          <w:lang w:val="fr-FR"/>
-        </w:rPr>
-        <w:t xml:space="preserve"> avant stockage en base de données. Le mot de passe en clair n'est jamais stocké ni transmis dans les réponses API.</w:t>
+        <w:t>Les mots de passe sont hachés avec BCrypt avant stockage en base de données. Le mot de passe en clair n'est jamais stocké ni transmis dans les réponses API.</w:t>
       </w:r>
     </w:p>
     <w:p>
@@ -1247,93 +972,7 @@
         <w:rPr>
           <w:lang w:val="fr-FR"/>
         </w:rPr>
-        <w:t xml:space="preserve">L'accès aux </w:t>
-      </w:r>
-      <w:proofErr w:type="spellStart"/>
-      <w:r>
-        <w:rPr>
-          <w:lang w:val="fr-FR"/>
-        </w:rPr>
-        <w:t>endpoints</w:t>
-      </w:r>
-      <w:proofErr w:type="spellEnd"/>
-      <w:r>
-        <w:rPr>
-          <w:lang w:val="fr-FR"/>
-        </w:rPr>
-        <w:t xml:space="preserve"> est contrôlé par des attributs [</w:t>
-      </w:r>
-      <w:proofErr w:type="spellStart"/>
-      <w:proofErr w:type="gramStart"/>
-      <w:r>
-        <w:rPr>
-          <w:lang w:val="fr-FR"/>
-        </w:rPr>
-        <w:t>Authorize</w:t>
-      </w:r>
-      <w:proofErr w:type="spellEnd"/>
-      <w:r>
-        <w:rPr>
-          <w:lang w:val="fr-FR"/>
-        </w:rPr>
-        <w:t>(</w:t>
-      </w:r>
-      <w:proofErr w:type="spellStart"/>
-      <w:proofErr w:type="gramEnd"/>
-      <w:r>
-        <w:rPr>
-          <w:lang w:val="fr-FR"/>
-        </w:rPr>
-        <w:t>Roles</w:t>
-      </w:r>
-      <w:proofErr w:type="spellEnd"/>
-      <w:r>
-        <w:rPr>
-          <w:lang w:val="fr-FR"/>
-        </w:rPr>
-        <w:t xml:space="preserve"> = "...")] sur les contrôleurs. Les rôles (User, Driver, </w:t>
-      </w:r>
-      <w:proofErr w:type="spellStart"/>
-      <w:r>
-        <w:rPr>
-          <w:lang w:val="fr-FR"/>
-        </w:rPr>
-        <w:t>Employee</w:t>
-      </w:r>
-      <w:proofErr w:type="spellEnd"/>
-      <w:r>
-        <w:rPr>
-          <w:lang w:val="fr-FR"/>
-        </w:rPr>
-        <w:t xml:space="preserve">, Admin) déterminent les actions autorisées. Les </w:t>
-      </w:r>
-      <w:proofErr w:type="spellStart"/>
-      <w:r>
-        <w:rPr>
-          <w:lang w:val="fr-FR"/>
-        </w:rPr>
-        <w:t>guards</w:t>
-      </w:r>
-      <w:proofErr w:type="spellEnd"/>
-      <w:r>
-        <w:rPr>
-          <w:lang w:val="fr-FR"/>
-        </w:rPr>
-        <w:t xml:space="preserve"> </w:t>
-      </w:r>
-      <w:proofErr w:type="spellStart"/>
-      <w:r>
-        <w:rPr>
-          <w:lang w:val="fr-FR"/>
-        </w:rPr>
-        <w:t>Angular</w:t>
-      </w:r>
-      <w:proofErr w:type="spellEnd"/>
-      <w:r>
-        <w:rPr>
-          <w:lang w:val="fr-FR"/>
-        </w:rPr>
-        <w:t xml:space="preserve"> protègent les routes côté frontend.</w:t>
+        <w:t>L'accès aux endpoints est contrôlé par des attributs [Authorize(Roles = "...")] sur les contrôleurs. Les rôles (User, Driver, Employee, Admin) déterminent les actions autorisées. Les guards Angular protègent les routes côté frontend.</w:t>
       </w:r>
     </w:p>
     <w:p>
@@ -1356,47 +995,11 @@
           <w:lang w:val="fr-FR"/>
         </w:rPr>
       </w:pPr>
-      <w:proofErr w:type="spellStart"/>
-      <w:r>
-        <w:rPr>
-          <w:lang w:val="fr-FR"/>
-        </w:rPr>
-        <w:t>FluentValidation</w:t>
-      </w:r>
-      <w:proofErr w:type="spellEnd"/>
-      <w:r>
-        <w:rPr>
-          <w:lang w:val="fr-FR"/>
-        </w:rPr>
-        <w:t xml:space="preserve"> est utilisé côté backend pour valider toutes les données entrantes (</w:t>
-      </w:r>
-      <w:proofErr w:type="spellStart"/>
-      <w:r>
-        <w:rPr>
-          <w:lang w:val="fr-FR"/>
-        </w:rPr>
-        <w:t>DTOs</w:t>
-      </w:r>
-      <w:proofErr w:type="spellEnd"/>
-      <w:r>
-        <w:rPr>
-          <w:lang w:val="fr-FR"/>
-        </w:rPr>
-        <w:t xml:space="preserve">). Côté frontend, les formulaires </w:t>
-      </w:r>
-      <w:proofErr w:type="spellStart"/>
-      <w:r>
-        <w:rPr>
-          <w:lang w:val="fr-FR"/>
-        </w:rPr>
-        <w:t>Angular</w:t>
-      </w:r>
-      <w:proofErr w:type="spellEnd"/>
-      <w:r>
-        <w:rPr>
-          <w:lang w:val="fr-FR"/>
-        </w:rPr>
-        <w:t xml:space="preserve"> utilisent les Validators réactifs. Cela protège contre les injections et les données malformées.</w:t>
+      <w:r>
+        <w:rPr>
+          <w:lang w:val="fr-FR"/>
+        </w:rPr>
+        <w:t>FluentValidation est utilisé côté backend pour valider toutes les données entrantes (DTOs). Côté frontend, les formulaires Angular utilisent les Validators réactifs. Cela protège contre les injections et les données malformées.</w:t>
       </w:r>
     </w:p>
     <w:p>
@@ -1423,21 +1026,7 @@
         <w:rPr>
           <w:lang w:val="fr-FR"/>
         </w:rPr>
-        <w:t xml:space="preserve">La politique CORS est </w:t>
-      </w:r>
-      <w:proofErr w:type="gramStart"/>
-      <w:r>
-        <w:rPr>
-          <w:lang w:val="fr-FR"/>
-        </w:rPr>
-        <w:t>configurée</w:t>
-      </w:r>
-      <w:proofErr w:type="gramEnd"/>
-      <w:r>
-        <w:rPr>
-          <w:lang w:val="fr-FR"/>
-        </w:rPr>
-        <w:t xml:space="preserve"> pour n'accepter que les requêtes provenant du domaine frontend autorisé.</w:t>
+        <w:t>La politique CORS est configurée pour n'accepter que les requêtes provenant du domaine frontend autorisé.</w:t>
       </w:r>
     </w:p>
     <w:p>
@@ -1464,63 +1053,7 @@
         <w:rPr>
           <w:lang w:val="fr-FR"/>
         </w:rPr>
-        <w:t xml:space="preserve">Les </w:t>
-      </w:r>
-      <w:proofErr w:type="spellStart"/>
-      <w:r>
-        <w:rPr>
-          <w:lang w:val="fr-FR"/>
-        </w:rPr>
-        <w:t>tokens</w:t>
-      </w:r>
-      <w:proofErr w:type="spellEnd"/>
-      <w:r>
-        <w:rPr>
-          <w:lang w:val="fr-FR"/>
-        </w:rPr>
-        <w:t xml:space="preserve"> JWT sont stockés en </w:t>
-      </w:r>
-      <w:proofErr w:type="spellStart"/>
-      <w:r>
-        <w:rPr>
-          <w:lang w:val="fr-FR"/>
-        </w:rPr>
-        <w:t>localStorage</w:t>
-      </w:r>
-      <w:proofErr w:type="spellEnd"/>
-      <w:r>
-        <w:rPr>
-          <w:lang w:val="fr-FR"/>
-        </w:rPr>
-        <w:t xml:space="preserve"> (pas de cookies de session, donc pas de vulnérabilité CSRF). </w:t>
-      </w:r>
-      <w:proofErr w:type="spellStart"/>
-      <w:r>
-        <w:rPr>
-          <w:lang w:val="fr-FR"/>
-        </w:rPr>
-        <w:t>Angular</w:t>
-      </w:r>
-      <w:proofErr w:type="spellEnd"/>
-      <w:r>
-        <w:rPr>
-          <w:lang w:val="fr-FR"/>
-        </w:rPr>
-        <w:t xml:space="preserve"> échappe automatiquement les contenus dans les </w:t>
-      </w:r>
-      <w:proofErr w:type="spellStart"/>
-      <w:r>
-        <w:rPr>
-          <w:lang w:val="fr-FR"/>
-        </w:rPr>
-        <w:t>templates</w:t>
-      </w:r>
-      <w:proofErr w:type="spellEnd"/>
-      <w:r>
-        <w:rPr>
-          <w:lang w:val="fr-FR"/>
-        </w:rPr>
-        <w:t xml:space="preserve"> pour prévenir les attaques XSS.</w:t>
+        <w:t>Les tokens JWT sont stockés en localStorage (pas de cookies de session, donc pas de vulnérabilité CSRF). Angular échappe automatiquement les contenus dans les templates pour prévenir les attaques XSS.</w:t>
       </w:r>
     </w:p>
     <w:p>
@@ -1629,42 +1162,14 @@
         <w:rPr>
           <w:lang w:val="fr-FR"/>
         </w:rPr>
-        <w:t>La page d'accueil d'</w:t>
-      </w:r>
-      <w:proofErr w:type="spellStart"/>
-      <w:r>
-        <w:rPr>
-          <w:lang w:val="fr-FR"/>
-        </w:rPr>
-        <w:t>EcoRide</w:t>
-      </w:r>
-      <w:proofErr w:type="spellEnd"/>
-      <w:r>
-        <w:rPr>
-          <w:lang w:val="fr-FR"/>
-        </w:rPr>
-        <w:t xml:space="preserve"> présente l'entreprise avec un thème écologique (palette verte). Elle comporte :</w:t>
+        <w:t>La page d'accueil d'EcoRide présente l'entreprise avec un thème écologique (palette verte). Elle comporte :</w:t>
       </w:r>
       <w:r>
         <w:rPr>
           <w:lang w:val="fr-FR"/>
         </w:rPr>
         <w:br/>
-        <w:t xml:space="preserve">• Un </w:t>
-      </w:r>
-      <w:proofErr w:type="spellStart"/>
-      <w:r>
-        <w:rPr>
-          <w:lang w:val="fr-FR"/>
-        </w:rPr>
-        <w:t>hero</w:t>
-      </w:r>
-      <w:proofErr w:type="spellEnd"/>
-      <w:r>
-        <w:rPr>
-          <w:lang w:val="fr-FR"/>
-        </w:rPr>
-        <w:t xml:space="preserve"> avec le slogan de l'entreprise et des images évoquant l'écologie</w:t>
+        <w:t>• Un hero avec le slogan de l'entreprise et des images évoquant l'écologie</w:t>
       </w:r>
       <w:r>
         <w:rPr>
@@ -1685,21 +1190,7 @@
           <w:lang w:val="fr-FR"/>
         </w:rPr>
         <w:br/>
-        <w:t xml:space="preserve">• Un </w:t>
-      </w:r>
-      <w:proofErr w:type="spellStart"/>
-      <w:r>
-        <w:rPr>
-          <w:lang w:val="fr-FR"/>
-        </w:rPr>
-        <w:t>footer</w:t>
-      </w:r>
-      <w:proofErr w:type="spellEnd"/>
-      <w:r>
-        <w:rPr>
-          <w:lang w:val="fr-FR"/>
-        </w:rPr>
-        <w:t xml:space="preserve"> avec le mail de contact et un lien vers les mentions légales</w:t>
+        <w:t>• Un footer avec le mail de contact et un lien vers les mentions légales</w:t>
       </w:r>
       <w:r>
         <w:rPr>
@@ -1712,16 +1203,8 @@
           <w:lang w:val="fr-FR"/>
         </w:rPr>
         <w:br/>
-        <w:t xml:space="preserve">Composant : </w:t>
-      </w:r>
-      <w:proofErr w:type="spellStart"/>
-      <w:r>
-        <w:rPr>
-          <w:lang w:val="fr-FR"/>
-        </w:rPr>
-        <w:t>HomeComponent</w:t>
-      </w:r>
-      <w:proofErr w:type="spellEnd"/>
+        <w:t>Composant : HomeComponent</w:t>
+      </w:r>
       <w:r>
         <w:rPr>
           <w:lang w:val="fr-FR"/>
@@ -1761,21 +1244,7 @@
           <w:lang w:val="fr-FR"/>
         </w:rPr>
         <w:br/>
-        <w:t xml:space="preserve">• Logo </w:t>
-      </w:r>
-      <w:proofErr w:type="spellStart"/>
-      <w:r>
-        <w:rPr>
-          <w:lang w:val="fr-FR"/>
-        </w:rPr>
-        <w:t>EcoRide</w:t>
-      </w:r>
-      <w:proofErr w:type="spellEnd"/>
-      <w:r>
-        <w:rPr>
-          <w:lang w:val="fr-FR"/>
-        </w:rPr>
-        <w:t xml:space="preserve"> (retour à l'accueil)</w:t>
+        <w:t>• Logo EcoRide (retour à l'accueil)</w:t>
       </w:r>
       <w:r>
         <w:rPr>
@@ -1822,16 +1291,8 @@
           <w:lang w:val="fr-FR"/>
         </w:rPr>
         <w:br/>
-        <w:t xml:space="preserve">Composant : </w:t>
-      </w:r>
-      <w:proofErr w:type="spellStart"/>
-      <w:r>
-        <w:rPr>
-          <w:lang w:val="fr-FR"/>
-        </w:rPr>
-        <w:t>NavbarComponent</w:t>
-      </w:r>
-      <w:proofErr w:type="spellEnd"/>
+        <w:t>Composant : NavbarComponent</w:t>
+      </w:r>
     </w:p>
     <w:p>
       <w:pPr>
@@ -1912,60 +1373,22 @@
           <w:lang w:val="fr-FR"/>
         </w:rPr>
         <w:br/>
-        <w:t xml:space="preserve">Composant : </w:t>
-      </w:r>
-      <w:proofErr w:type="spellStart"/>
-      <w:r>
-        <w:rPr>
-          <w:lang w:val="fr-FR"/>
-        </w:rPr>
-        <w:t>CarpoolListComponent</w:t>
-      </w:r>
-      <w:proofErr w:type="spellEnd"/>
+        <w:t>Composant : CarpoolListComponent</w:t>
+      </w:r>
       <w:r>
         <w:rPr>
           <w:lang w:val="fr-FR"/>
         </w:rPr>
         <w:br/>
-        <w:t>Route : /</w:t>
-      </w:r>
-      <w:proofErr w:type="spellStart"/>
-      <w:r>
-        <w:rPr>
-          <w:lang w:val="fr-FR"/>
-        </w:rPr>
-        <w:t>carpools</w:t>
-      </w:r>
-      <w:proofErr w:type="spellEnd"/>
+        <w:t>Route : /carpools</w:t>
+      </w:r>
       <w:r>
         <w:rPr>
           <w:lang w:val="fr-FR"/>
         </w:rPr>
         <w:br/>
-        <w:t>Endpoint : GET /api/</w:t>
-      </w:r>
-      <w:proofErr w:type="spellStart"/>
-      <w:r>
-        <w:rPr>
-          <w:lang w:val="fr-FR"/>
-        </w:rPr>
-        <w:t>carpool</w:t>
-      </w:r>
-      <w:proofErr w:type="spellEnd"/>
-      <w:r>
-        <w:rPr>
-          <w:lang w:val="fr-FR"/>
-        </w:rPr>
-        <w:t>/</w:t>
-      </w:r>
-      <w:proofErr w:type="spellStart"/>
-      <w:r>
-        <w:rPr>
-          <w:lang w:val="fr-FR"/>
-        </w:rPr>
-        <w:t>search</w:t>
-      </w:r>
-      <w:proofErr w:type="spellEnd"/>
+        <w:t>Endpoint : GET /api/carpool/search</w:t>
+      </w:r>
     </w:p>
     <w:p>
       <w:pPr>
@@ -2038,21 +1461,7 @@
           <w:lang w:val="fr-FR"/>
         </w:rPr>
         <w:br/>
-        <w:t xml:space="preserve">Les filtres sont appliqués côté serveur via des paramètres de requête sur </w:t>
-      </w:r>
-      <w:proofErr w:type="spellStart"/>
-      <w:r>
-        <w:rPr>
-          <w:lang w:val="fr-FR"/>
-        </w:rPr>
-        <w:t>l'endpoint</w:t>
-      </w:r>
-      <w:proofErr w:type="spellEnd"/>
-      <w:r>
-        <w:rPr>
-          <w:lang w:val="fr-FR"/>
-        </w:rPr>
-        <w:t xml:space="preserve"> de recherche.</w:t>
+        <w:t>Les filtres sont appliqués côté serveur via des paramètres de requête sur l'endpoint de recherche.</w:t>
       </w:r>
     </w:p>
     <w:p>
@@ -2127,65 +1536,21 @@
           <w:lang w:val="fr-FR"/>
         </w:rPr>
         <w:br/>
-        <w:t xml:space="preserve">Composant : </w:t>
-      </w:r>
-      <w:proofErr w:type="spellStart"/>
-      <w:r>
-        <w:rPr>
-          <w:lang w:val="fr-FR"/>
-        </w:rPr>
-        <w:t>CarpoolDetailComponent</w:t>
-      </w:r>
-      <w:proofErr w:type="spellEnd"/>
+        <w:t>Composant : CarpoolDetailComponent</w:t>
+      </w:r>
       <w:r>
         <w:rPr>
           <w:lang w:val="fr-FR"/>
         </w:rPr>
         <w:br/>
-        <w:t>Route : /</w:t>
-      </w:r>
-      <w:proofErr w:type="spellStart"/>
-      <w:r>
-        <w:rPr>
-          <w:lang w:val="fr-FR"/>
-        </w:rPr>
-        <w:t>carpools</w:t>
-      </w:r>
-      <w:proofErr w:type="spellEnd"/>
-      <w:proofErr w:type="gramStart"/>
-      <w:r>
-        <w:rPr>
-          <w:lang w:val="fr-FR"/>
-        </w:rPr>
-        <w:t>/:</w:t>
-      </w:r>
-      <w:proofErr w:type="gramEnd"/>
-      <w:r>
-        <w:rPr>
-          <w:lang w:val="fr-FR"/>
-        </w:rPr>
-        <w:t>id</w:t>
+        <w:t>Route : /carpools/:id</w:t>
       </w:r>
       <w:r>
         <w:rPr>
           <w:lang w:val="fr-FR"/>
         </w:rPr>
         <w:br/>
-        <w:t>Endpoint : GET /api/</w:t>
-      </w:r>
-      <w:proofErr w:type="spellStart"/>
-      <w:r>
-        <w:rPr>
-          <w:lang w:val="fr-FR"/>
-        </w:rPr>
-        <w:t>carpool</w:t>
-      </w:r>
-      <w:proofErr w:type="spellEnd"/>
-      <w:r>
-        <w:rPr>
-          <w:lang w:val="fr-FR"/>
-        </w:rPr>
-        <w:t>/{id}</w:t>
+        <w:t>Endpoint : GET /api/carpool/{id}</w:t>
       </w:r>
     </w:p>
     <w:p>
@@ -2287,30 +1652,8 @@
           <w:lang w:val="fr-FR"/>
         </w:rPr>
         <w:br/>
-        <w:t>Endpoint : POST /api/</w:t>
-      </w:r>
-      <w:proofErr w:type="spellStart"/>
-      <w:r>
-        <w:rPr>
-          <w:lang w:val="fr-FR"/>
-        </w:rPr>
-        <w:t>carpool</w:t>
-      </w:r>
-      <w:proofErr w:type="spellEnd"/>
-      <w:r>
-        <w:rPr>
-          <w:lang w:val="fr-FR"/>
-        </w:rPr>
-        <w:t>/{id}/</w:t>
-      </w:r>
-      <w:proofErr w:type="spellStart"/>
-      <w:r>
-        <w:rPr>
-          <w:lang w:val="fr-FR"/>
-        </w:rPr>
-        <w:t>participate</w:t>
-      </w:r>
-      <w:proofErr w:type="spellEnd"/>
+        <w:t>Endpoint : POST /api/carpool/{id}/participate</w:t>
+      </w:r>
     </w:p>
     <w:p>
       <w:pPr>
@@ -2350,16 +1693,8 @@
           <w:lang w:val="fr-FR"/>
         </w:rPr>
         <w:br/>
-        <w:t xml:space="preserve">• Une adresse </w:t>
-      </w:r>
-      <w:proofErr w:type="gramStart"/>
-      <w:r>
-        <w:rPr>
-          <w:lang w:val="fr-FR"/>
-        </w:rPr>
-        <w:t>email</w:t>
-      </w:r>
-      <w:proofErr w:type="gramEnd"/>
+        <w:t>• Une adresse email</w:t>
+      </w:r>
       <w:r>
         <w:rPr>
           <w:lang w:val="fr-FR"/>
@@ -2391,16 +1726,8 @@
           <w:lang w:val="fr-FR"/>
         </w:rPr>
         <w:br/>
-        <w:t xml:space="preserve">Composant : </w:t>
-      </w:r>
-      <w:proofErr w:type="spellStart"/>
-      <w:r>
-        <w:rPr>
-          <w:lang w:val="fr-FR"/>
-        </w:rPr>
-        <w:t>RegisterComponent</w:t>
-      </w:r>
-      <w:proofErr w:type="spellEnd"/>
+        <w:t>Composant : RegisterComponent</w:t>
+      </w:r>
       <w:r>
         <w:rPr>
           <w:lang w:val="fr-FR"/>
@@ -2412,45 +1739,15 @@
           <w:lang w:val="fr-FR"/>
         </w:rPr>
         <w:lastRenderedPageBreak/>
-        <w:t>Route : /</w:t>
-      </w:r>
-      <w:proofErr w:type="spellStart"/>
-      <w:r>
-        <w:rPr>
-          <w:lang w:val="fr-FR"/>
-        </w:rPr>
-        <w:t>register</w:t>
-      </w:r>
-      <w:proofErr w:type="spellEnd"/>
+        <w:t>Route : /register</w:t>
+      </w:r>
       <w:r>
         <w:rPr>
           <w:lang w:val="fr-FR"/>
         </w:rPr>
         <w:br/>
-        <w:t>Endpoint : POST /api/</w:t>
-      </w:r>
-      <w:proofErr w:type="spellStart"/>
-      <w:r>
-        <w:rPr>
-          <w:lang w:val="fr-FR"/>
-        </w:rPr>
-        <w:t>auth</w:t>
-      </w:r>
-      <w:proofErr w:type="spellEnd"/>
-      <w:r>
-        <w:rPr>
-          <w:lang w:val="fr-FR"/>
-        </w:rPr>
-        <w:t>/</w:t>
-      </w:r>
-      <w:proofErr w:type="spellStart"/>
-      <w:r>
-        <w:rPr>
-          <w:lang w:val="fr-FR"/>
-        </w:rPr>
-        <w:t>register</w:t>
-      </w:r>
-      <w:proofErr w:type="spellEnd"/>
+        <w:t>Endpoint : POST /api/auth/register</w:t>
+      </w:r>
     </w:p>
     <w:p>
       <w:pPr>
@@ -2524,30 +1821,8 @@
           <w:lang w:val="fr-FR"/>
         </w:rPr>
         <w:br/>
-        <w:t xml:space="preserve">Composant : </w:t>
-      </w:r>
-      <w:proofErr w:type="spellStart"/>
-      <w:r>
-        <w:rPr>
-          <w:lang w:val="fr-FR"/>
-        </w:rPr>
-        <w:t>ProfileComponent</w:t>
-      </w:r>
-      <w:proofErr w:type="spellEnd"/>
-      <w:r>
-        <w:rPr>
-          <w:lang w:val="fr-FR"/>
-        </w:rPr>
-        <w:t xml:space="preserve">, </w:t>
-      </w:r>
-      <w:proofErr w:type="spellStart"/>
-      <w:r>
-        <w:rPr>
-          <w:lang w:val="fr-FR"/>
-        </w:rPr>
-        <w:t>VehicleFormComponent</w:t>
-      </w:r>
-      <w:proofErr w:type="spellEnd"/>
+        <w:t>Composant : ProfileComponent, VehicleFormComponent</w:t>
+      </w:r>
       <w:r>
         <w:rPr>
           <w:lang w:val="fr-FR"/>
@@ -2637,19 +1912,9 @@
         </w:rPr>
         <w:br/>
       </w:r>
-      <w:proofErr w:type="spellStart"/>
-      <w:r>
-        <w:t>Composant</w:t>
-      </w:r>
-      <w:proofErr w:type="spellEnd"/>
-      <w:r>
-        <w:t xml:space="preserve"> : </w:t>
-      </w:r>
-      <w:proofErr w:type="spellStart"/>
-      <w:r>
-        <w:t>CreateCarpoolComponent</w:t>
-      </w:r>
-      <w:proofErr w:type="spellEnd"/>
+      <w:r>
+        <w:t>Composant : CreateCarpoolComponent</w:t>
+      </w:r>
       <w:r>
         <w:br/>
         <w:t>Routes : /create-carpool, /edit-carpool/:id</w:t>
@@ -2750,36 +2015,14 @@
           <w:lang w:val="fr-FR"/>
         </w:rPr>
         <w:lastRenderedPageBreak/>
-        <w:t xml:space="preserve">Composant : </w:t>
-      </w:r>
-      <w:proofErr w:type="spellStart"/>
-      <w:r>
-        <w:rPr>
-          <w:lang w:val="fr-FR"/>
-        </w:rPr>
-        <w:t>MyTripsComponent</w:t>
-      </w:r>
-      <w:proofErr w:type="spellEnd"/>
+        <w:t>Composant : MyTripsComponent</w:t>
+      </w:r>
       <w:r>
         <w:rPr>
           <w:lang w:val="fr-FR"/>
         </w:rPr>
         <w:br/>
-        <w:t>Route : /</w:t>
-      </w:r>
-      <w:proofErr w:type="spellStart"/>
-      <w:r>
-        <w:rPr>
-          <w:lang w:val="fr-FR"/>
-        </w:rPr>
-        <w:t>my</w:t>
-      </w:r>
-      <w:proofErr w:type="spellEnd"/>
-      <w:r>
-        <w:rPr>
-          <w:lang w:val="fr-FR"/>
-        </w:rPr>
-        <w:t>-trips</w:t>
+        <w:t>Route : /my-trips</w:t>
       </w:r>
     </w:p>
     <w:p>
@@ -2861,57 +2104,8 @@
           <w:lang w:val="fr-FR"/>
         </w:rPr>
         <w:br/>
-      </w:r>
-      <w:proofErr w:type="spellStart"/>
-      <w:r>
-        <w:rPr>
-          <w:lang w:val="fr-FR"/>
-        </w:rPr>
-        <w:t>Endpoints</w:t>
-      </w:r>
-      <w:proofErr w:type="spellEnd"/>
-      <w:r>
-        <w:rPr>
-          <w:lang w:val="fr-FR"/>
-        </w:rPr>
-        <w:t xml:space="preserve"> : PUT /api/</w:t>
-      </w:r>
-      <w:proofErr w:type="spellStart"/>
-      <w:r>
-        <w:rPr>
-          <w:lang w:val="fr-FR"/>
-        </w:rPr>
-        <w:t>carpool</w:t>
-      </w:r>
-      <w:proofErr w:type="spellEnd"/>
-      <w:r>
-        <w:rPr>
-          <w:lang w:val="fr-FR"/>
-        </w:rPr>
-        <w:t>/{id}/start, PUT /api/</w:t>
-      </w:r>
-      <w:proofErr w:type="spellStart"/>
-      <w:r>
-        <w:rPr>
-          <w:lang w:val="fr-FR"/>
-        </w:rPr>
-        <w:t>carpool</w:t>
-      </w:r>
-      <w:proofErr w:type="spellEnd"/>
-      <w:r>
-        <w:rPr>
-          <w:lang w:val="fr-FR"/>
-        </w:rPr>
-        <w:t>/{id}/</w:t>
-      </w:r>
-      <w:proofErr w:type="spellStart"/>
-      <w:r>
-        <w:rPr>
-          <w:lang w:val="fr-FR"/>
-        </w:rPr>
-        <w:t>complete</w:t>
-      </w:r>
-      <w:proofErr w:type="spellEnd"/>
+        <w:t>Endpoints : PUT /api/carpool/{id}/start, PUT /api/carpool/{id}/complete</w:t>
+      </w:r>
     </w:p>
     <w:p>
       <w:pPr>
@@ -2958,21 +2152,7 @@
           <w:lang w:val="fr-FR"/>
         </w:rPr>
         <w:br/>
-        <w:t xml:space="preserve">• Vue des covoiturages signalés comme problématiques avec : numéro du covoiturage, pseudo et </w:t>
-      </w:r>
-      <w:proofErr w:type="gramStart"/>
-      <w:r>
-        <w:rPr>
-          <w:lang w:val="fr-FR"/>
-        </w:rPr>
-        <w:t>email</w:t>
-      </w:r>
-      <w:proofErr w:type="gramEnd"/>
-      <w:r>
-        <w:rPr>
-          <w:lang w:val="fr-FR"/>
-        </w:rPr>
-        <w:t xml:space="preserve"> des deux parties, descriptif du trajet (dates, lieux), commentaire du passager</w:t>
+        <w:t>• Vue des covoiturages signalés comme problématiques avec : numéro du covoiturage, pseudo et email des deux parties, descriptif du trajet (dates, lieux), commentaire du passager</w:t>
       </w:r>
       <w:r>
         <w:rPr>
@@ -2985,129 +2165,22 @@
           <w:lang w:val="fr-FR"/>
         </w:rPr>
         <w:br/>
-        <w:t xml:space="preserve">Composant : </w:t>
-      </w:r>
-      <w:proofErr w:type="spellStart"/>
-      <w:r>
-        <w:rPr>
-          <w:lang w:val="fr-FR"/>
-        </w:rPr>
-        <w:t>EmployeeDashboardComponent</w:t>
-      </w:r>
-      <w:proofErr w:type="spellEnd"/>
+        <w:t>Composant : EmployeeDashboardComponent</w:t>
+      </w:r>
       <w:r>
         <w:rPr>
           <w:lang w:val="fr-FR"/>
         </w:rPr>
         <w:br/>
-        <w:t>Route : /</w:t>
-      </w:r>
-      <w:proofErr w:type="spellStart"/>
-      <w:r>
-        <w:rPr>
-          <w:lang w:val="fr-FR"/>
-        </w:rPr>
-        <w:t>employee</w:t>
-      </w:r>
-      <w:proofErr w:type="spellEnd"/>
+        <w:t>Route : /employee</w:t>
+      </w:r>
       <w:r>
         <w:rPr>
           <w:lang w:val="fr-FR"/>
         </w:rPr>
         <w:br/>
-      </w:r>
-      <w:proofErr w:type="spellStart"/>
-      <w:r>
-        <w:rPr>
-          <w:lang w:val="fr-FR"/>
-        </w:rPr>
-        <w:t>Endpoints</w:t>
-      </w:r>
-      <w:proofErr w:type="spellEnd"/>
-      <w:r>
-        <w:rPr>
-          <w:lang w:val="fr-FR"/>
-        </w:rPr>
-        <w:t xml:space="preserve"> : GET /api/</w:t>
-      </w:r>
-      <w:proofErr w:type="spellStart"/>
-      <w:r>
-        <w:rPr>
-          <w:lang w:val="fr-FR"/>
-        </w:rPr>
-        <w:t>review</w:t>
-      </w:r>
-      <w:proofErr w:type="spellEnd"/>
-      <w:r>
-        <w:rPr>
-          <w:lang w:val="fr-FR"/>
-        </w:rPr>
-        <w:t>/</w:t>
-      </w:r>
-      <w:proofErr w:type="spellStart"/>
-      <w:r>
-        <w:rPr>
-          <w:lang w:val="fr-FR"/>
-        </w:rPr>
-        <w:t>pending</w:t>
-      </w:r>
-      <w:proofErr w:type="spellEnd"/>
-      <w:r>
-        <w:rPr>
-          <w:lang w:val="fr-FR"/>
-        </w:rPr>
-        <w:t>, PUT /api/</w:t>
-      </w:r>
-      <w:proofErr w:type="spellStart"/>
-      <w:r>
-        <w:rPr>
-          <w:lang w:val="fr-FR"/>
-        </w:rPr>
-        <w:t>review</w:t>
-      </w:r>
-      <w:proofErr w:type="spellEnd"/>
-      <w:r>
-        <w:rPr>
-          <w:lang w:val="fr-FR"/>
-        </w:rPr>
-        <w:t>/{id}/</w:t>
-      </w:r>
-      <w:proofErr w:type="spellStart"/>
-      <w:r>
-        <w:rPr>
-          <w:lang w:val="fr-FR"/>
-        </w:rPr>
-        <w:t>validate</w:t>
-      </w:r>
-      <w:proofErr w:type="spellEnd"/>
-      <w:r>
-        <w:rPr>
-          <w:lang w:val="fr-FR"/>
-        </w:rPr>
-        <w:t>, PUT /api/</w:t>
-      </w:r>
-      <w:proofErr w:type="spellStart"/>
-      <w:r>
-        <w:rPr>
-          <w:lang w:val="fr-FR"/>
-        </w:rPr>
-        <w:t>review</w:t>
-      </w:r>
-      <w:proofErr w:type="spellEnd"/>
-      <w:r>
-        <w:rPr>
-          <w:lang w:val="fr-FR"/>
-        </w:rPr>
-        <w:t>/{id}/</w:t>
-      </w:r>
-      <w:proofErr w:type="spellStart"/>
-      <w:r>
-        <w:rPr>
-          <w:lang w:val="fr-FR"/>
-        </w:rPr>
-        <w:t>reject</w:t>
-      </w:r>
-      <w:proofErr w:type="spellEnd"/>
+        <w:t>Endpoints : GET /api/review/pending, PUT /api/review/{id}/validate, PUT /api/review/{id}/reject</w:t>
+      </w:r>
     </w:p>
     <w:p>
       <w:pPr>
@@ -3195,16 +2268,8 @@
           <w:lang w:val="fr-FR"/>
         </w:rPr>
         <w:br/>
-        <w:t xml:space="preserve">Composant : </w:t>
-      </w:r>
-      <w:proofErr w:type="spellStart"/>
-      <w:r>
-        <w:rPr>
-          <w:lang w:val="fr-FR"/>
-        </w:rPr>
-        <w:t>AdminDashboardComponent</w:t>
-      </w:r>
-      <w:proofErr w:type="spellEnd"/>
+        <w:t>Composant : AdminDashboardComponent</w:t>
+      </w:r>
       <w:r>
         <w:rPr>
           <w:lang w:val="fr-FR"/>
@@ -3217,62 +2282,7 @@
           <w:lang w:val="fr-FR"/>
         </w:rPr>
         <w:br/>
-      </w:r>
-      <w:proofErr w:type="spellStart"/>
-      <w:r>
-        <w:rPr>
-          <w:lang w:val="fr-FR"/>
-        </w:rPr>
-        <w:t>Endpoints</w:t>
-      </w:r>
-      <w:proofErr w:type="spellEnd"/>
-      <w:r>
-        <w:rPr>
-          <w:lang w:val="fr-FR"/>
-        </w:rPr>
-        <w:t xml:space="preserve"> : GET /api/admin/</w:t>
-      </w:r>
-      <w:proofErr w:type="spellStart"/>
-      <w:r>
-        <w:rPr>
-          <w:lang w:val="fr-FR"/>
-        </w:rPr>
-        <w:t>statistics</w:t>
-      </w:r>
-      <w:proofErr w:type="spellEnd"/>
-      <w:r>
-        <w:rPr>
-          <w:lang w:val="fr-FR"/>
-        </w:rPr>
-        <w:t>, POST /api/admin/</w:t>
-      </w:r>
-      <w:proofErr w:type="spellStart"/>
-      <w:r>
-        <w:rPr>
-          <w:lang w:val="fr-FR"/>
-        </w:rPr>
-        <w:t>create-employee</w:t>
-      </w:r>
-      <w:proofErr w:type="spellEnd"/>
-      <w:r>
-        <w:rPr>
-          <w:lang w:val="fr-FR"/>
-        </w:rPr>
-        <w:t>, PUT /api/admin/</w:t>
-      </w:r>
-      <w:proofErr w:type="spellStart"/>
-      <w:r>
-        <w:rPr>
-          <w:lang w:val="fr-FR"/>
-        </w:rPr>
-        <w:t>users</w:t>
-      </w:r>
-      <w:proofErr w:type="spellEnd"/>
-      <w:r>
-        <w:rPr>
-          <w:lang w:val="fr-FR"/>
-        </w:rPr>
-        <w:t>/{id}/suspend</w:t>
+        <w:t>Endpoints : GET /api/admin/statistics, POST /api/admin/create-employee, PUT /api/admin/users/{id}/suspend</w:t>
       </w:r>
     </w:p>
     <w:p>
@@ -3313,21 +2323,7 @@
         <w:rPr>
           <w:lang w:val="fr-FR"/>
         </w:rPr>
-        <w:t xml:space="preserve">Le projet </w:t>
-      </w:r>
-      <w:proofErr w:type="spellStart"/>
-      <w:r>
-        <w:rPr>
-          <w:lang w:val="fr-FR"/>
-        </w:rPr>
-        <w:t>EcoRide</w:t>
-      </w:r>
-      <w:proofErr w:type="spellEnd"/>
-      <w:r>
-        <w:rPr>
-          <w:lang w:val="fr-FR"/>
-        </w:rPr>
-        <w:t xml:space="preserve"> a été développé en suivant une méthodologie Agile avec un Kanban pour le suivi des tâches. L'application couvre l'ensemble des User Stories demandées et respecte les bonnes pratiques de développement web :</w:t>
+        <w:t>Le projet EcoRide a été développé en suivant une méthodologie Agile avec un Kanban pour le suivi des tâches. L'application couvre l'ensemble des User Stories demandées et respecte les bonnes pratiques de développement web :</w:t>
       </w:r>
       <w:r>
         <w:rPr>
@@ -3347,21 +2343,7 @@
           <w:lang w:val="fr-FR"/>
         </w:rPr>
         <w:br/>
-        <w:t xml:space="preserve">• Sécurité renforcée (JWT, hachage </w:t>
-      </w:r>
-      <w:proofErr w:type="spellStart"/>
-      <w:r>
-        <w:rPr>
-          <w:lang w:val="fr-FR"/>
-        </w:rPr>
-        <w:t>BCrypt</w:t>
-      </w:r>
-      <w:proofErr w:type="spellEnd"/>
-      <w:r>
-        <w:rPr>
-          <w:lang w:val="fr-FR"/>
-        </w:rPr>
-        <w:t>, validation des entrées, CORS)</w:t>
+        <w:t>• Sécurité renforcée (JWT, hachage BCrypt, validation des entrées, CORS)</w:t>
       </w:r>
       <w:r>
         <w:rPr>
@@ -3382,21 +2364,7 @@
           <w:lang w:val="fr-FR"/>
         </w:rPr>
         <w:br/>
-        <w:t xml:space="preserve">• Code versionné avec Git (branches main, dev, </w:t>
-      </w:r>
-      <w:proofErr w:type="spellStart"/>
-      <w:r>
-        <w:rPr>
-          <w:lang w:val="fr-FR"/>
-        </w:rPr>
-        <w:t>feature</w:t>
-      </w:r>
-      <w:proofErr w:type="spellEnd"/>
-      <w:r>
-        <w:rPr>
-          <w:lang w:val="fr-FR"/>
-        </w:rPr>
-        <w:t>)</w:t>
+        <w:t>• Code versionné avec Git (branches main, dev, feature)</w:t>
       </w:r>
       <w:r>
         <w:rPr>
@@ -4238,7 +3206,6 @@
   <w:style w:type="character" w:default="1" w:styleId="Policepardfaut">
     <w:name w:val="Default Paragraph Font"/>
     <w:uiPriority w:val="1"/>
-    <w:semiHidden/>
     <w:unhideWhenUsed/>
   </w:style>
   <w:style w:type="table" w:default="1" w:styleId="TableauNormal">

</xml_diff>

<commit_message>
Add deliverables tree section to copie à rendre
Section 2 lists all documentation files and their locations
in the repository (docs/, Database/, source code, tests).
Renumbered subsequent sections (3-6).

Co-Authored-By: Claude Opus 4.6 <noreply@anthropic.com>
</commit_message>
<xml_diff>
--- a/TP_DWWM_copiearendre.docx
+++ b/TP_DWWM_copiearendre.docx
@@ -150,15 +150,10 @@
     </w:p>
     <w:p>
       <w:pPr>
-        <w:rPr>
-          <w:lang w:val="fr-FR"/>
-        </w:rPr>
-      </w:pPr>
-      <w:r>
-        <w:rPr>
-          <w:lang w:val="fr-FR"/>
-        </w:rPr>
-        <w:t>2. Choix techniques</w:t>
+        <w:pStyle w:val="Normal"/>
+      </w:pPr>
+      <w:r>
+        <w:t xml:space="preserve">2. Arborescence des livrables</w:t>
       </w:r>
     </w:p>
     <w:p>
@@ -171,7 +166,7 @@
         <w:rPr>
           <w:lang w:val="fr-FR"/>
         </w:rPr>
-        <w:t>3. Dispositions de sécurité</w:t>
+        <w:t>3. Choix techniques</w:t>
       </w:r>
     </w:p>
     <w:p>
@@ -184,7 +179,7 @@
         <w:rPr>
           <w:lang w:val="fr-FR"/>
         </w:rPr>
-        <w:t>4. Réponses aux User Stories</w:t>
+        <w:t>4. Dispositions de sécurité</w:t>
       </w:r>
     </w:p>
     <w:p>
@@ -197,7 +192,7 @@
         <w:rPr>
           <w:lang w:val="fr-FR"/>
         </w:rPr>
-        <w:t xml:space="preserve">   4.1 US 1 – Page d'accueil</w:t>
+        <w:t>5. Réponses aux User Stories</w:t>
       </w:r>
     </w:p>
     <w:p>
@@ -210,7 +205,7 @@
         <w:rPr>
           <w:lang w:val="fr-FR"/>
         </w:rPr>
-        <w:t xml:space="preserve">   4.2 US 2 – Menu de l'application</w:t>
+        <w:t xml:space="preserve">   5.1 US 1 – Page d'accueil</w:t>
       </w:r>
     </w:p>
     <w:p>
@@ -223,7 +218,7 @@
         <w:rPr>
           <w:lang w:val="fr-FR"/>
         </w:rPr>
-        <w:t xml:space="preserve">   4.3 US 3 – Vue des covoiturages</w:t>
+        <w:t xml:space="preserve">   5.2 US 2 – Menu de l'application</w:t>
       </w:r>
     </w:p>
     <w:p>
@@ -236,7 +231,7 @@
         <w:rPr>
           <w:lang w:val="fr-FR"/>
         </w:rPr>
-        <w:t xml:space="preserve">   4.4 US 4 – Filtres des covoiturages</w:t>
+        <w:t xml:space="preserve">   5.3 US 3 – Vue des covoiturages</w:t>
       </w:r>
     </w:p>
     <w:p>
@@ -249,7 +244,7 @@
         <w:rPr>
           <w:lang w:val="fr-FR"/>
         </w:rPr>
-        <w:t xml:space="preserve">   4.5 US 5 – Vue détaillée d'un covoiturage</w:t>
+        <w:t xml:space="preserve">   5.4 US 4 – Filtres des covoiturages</w:t>
       </w:r>
     </w:p>
     <w:p>
@@ -262,7 +257,7 @@
         <w:rPr>
           <w:lang w:val="fr-FR"/>
         </w:rPr>
-        <w:t xml:space="preserve">   4.6 US 6 – Participer à un covoiturage</w:t>
+        <w:t xml:space="preserve">   5.5 US 5 – Vue détaillée d'un covoiturage</w:t>
       </w:r>
     </w:p>
     <w:p>
@@ -275,7 +270,7 @@
         <w:rPr>
           <w:lang w:val="fr-FR"/>
         </w:rPr>
-        <w:t xml:space="preserve">   4.7 US 7 – Création de compte</w:t>
+        <w:t xml:space="preserve">   5.6 US 6 – Participer à un covoiturage</w:t>
       </w:r>
     </w:p>
     <w:p>
@@ -288,7 +283,7 @@
         <w:rPr>
           <w:lang w:val="fr-FR"/>
         </w:rPr>
-        <w:t xml:space="preserve">   4.8 US 8 – Espace Utilisateur</w:t>
+        <w:t xml:space="preserve">   5.7 US 7 – Création de compte</w:t>
       </w:r>
     </w:p>
     <w:p>
@@ -301,7 +296,7 @@
         <w:rPr>
           <w:lang w:val="fr-FR"/>
         </w:rPr>
-        <w:t xml:space="preserve">   4.9 US 9 – Saisir un voyage</w:t>
+        <w:t xml:space="preserve">   5.8 US 8 – Espace Utilisateur</w:t>
       </w:r>
     </w:p>
     <w:p>
@@ -314,7 +309,7 @@
         <w:rPr>
           <w:lang w:val="fr-FR"/>
         </w:rPr>
-        <w:t xml:space="preserve">   4.10 US 10 – Historique des covoiturages</w:t>
+        <w:t xml:space="preserve">   5.9 US 9 – Saisir un voyage</w:t>
       </w:r>
     </w:p>
     <w:p>
@@ -327,7 +322,7 @@
         <w:rPr>
           <w:lang w:val="fr-FR"/>
         </w:rPr>
-        <w:t xml:space="preserve">   4.11 US 11 – Démarrer et arrêter un covoiturage</w:t>
+        <w:t xml:space="preserve">   5.10 US 10 – Historique des covoiturages</w:t>
       </w:r>
     </w:p>
     <w:p>
@@ -340,7 +335,7 @@
         <w:rPr>
           <w:lang w:val="fr-FR"/>
         </w:rPr>
-        <w:t xml:space="preserve">   4.12 US 12 – Espace employé</w:t>
+        <w:t xml:space="preserve">   5.11 US 11 – Démarrer et arrêter un covoiturage</w:t>
       </w:r>
     </w:p>
     <w:p>
@@ -353,7 +348,7 @@
         <w:rPr>
           <w:lang w:val="fr-FR"/>
         </w:rPr>
-        <w:t xml:space="preserve">   4.13 US 13 – Espace administrateur</w:t>
+        <w:t xml:space="preserve">   5.12 US 12 – Espace employé</w:t>
       </w:r>
     </w:p>
     <w:p>
@@ -366,7 +361,7 @@
         <w:rPr>
           <w:lang w:val="fr-FR"/>
         </w:rPr>
-        <w:t>5. Conclusion</w:t>
+        <w:t xml:space="preserve">   5.13 US 13 – Espace administrateur</w:t>
       </w:r>
     </w:p>
     <w:p>
@@ -379,11 +374,24 @@
         <w:rPr>
           <w:lang w:val="fr-FR"/>
         </w:rPr>
-        <w:br w:type="page"/>
+        <w:t>6. Conclusion</w:t>
       </w:r>
     </w:p>
     <w:p>
       <w:pPr>
+        <w:rPr>
+          <w:lang w:val="fr-FR"/>
+        </w:rPr>
+      </w:pPr>
+      <w:r>
+        <w:rPr>
+          <w:lang w:val="fr-FR"/>
+        </w:rPr>
+        <w:br w:type="page"/>
+      </w:r>
+    </w:p>
+    <w:p>
+      <w:pPr>
         <w:pStyle w:val="Titre1"/>
         <w:rPr>
           <w:lang w:val="fr-FR"/>
@@ -486,11 +494,285 @@
     </w:p>
     <w:p>
       <w:pPr>
+        <w:pStyle w:val="Heading1"/>
+      </w:pPr>
+      <w:r>
+        <w:t xml:space="preserve">2. Arborescence des livrables</w:t>
+      </w:r>
+    </w:p>
+    <w:p>
+      <w:r>
+        <w:t xml:space="preserve">Les documents et fichiers du projet sont organisés dans le dépôt GitHub comme suit :</w:t>
+      </w:r>
+    </w:p>
+    <w:p>
+      <w:r>
+        <w:t xml:space="preserve"/>
+      </w:r>
+    </w:p>
+    <w:p>
+      <w:pPr>
+        <w:spacing w:after="40" w:line="260" w:lineRule="auto"/>
+      </w:pPr>
+      <w:r>
+        <w:rPr>
+          <w:rFonts w:ascii="Consolas" w:hAnsi="Consolas"/>
+          <w:sz w:val="20"/>
+        </w:rPr>
+        <w:t xml:space="preserve">docs/ — Documentation du projet</w:t>
+      </w:r>
+    </w:p>
+    <w:p>
+      <w:pPr>
+        <w:spacing w:after="40" w:line="260" w:lineRule="auto"/>
+      </w:pPr>
+      <w:r>
+        <w:rPr>
+          <w:rFonts w:ascii="Consolas" w:hAnsi="Consolas"/>
+          <w:sz w:val="20"/>
+        </w:rPr>
+        <w:t xml:space="preserve">  ├─ Manuel_EcoRide_v2.docx — Manuel utilisateur (avec comptes de test)</w:t>
+      </w:r>
+    </w:p>
+    <w:p>
+      <w:pPr>
+        <w:spacing w:after="40" w:line="260" w:lineRule="auto"/>
+      </w:pPr>
+      <w:r>
+        <w:rPr>
+          <w:rFonts w:ascii="Consolas" w:hAnsi="Consolas"/>
+          <w:sz w:val="20"/>
+        </w:rPr>
+        <w:t xml:space="preserve">  ├─ Charte_Graphique_EcoRide.pdf — Charte graphique</w:t>
+      </w:r>
+    </w:p>
+    <w:p>
+      <w:pPr>
+        <w:spacing w:after="40" w:line="260" w:lineRule="auto"/>
+      </w:pPr>
+      <w:r>
+        <w:rPr>
+          <w:rFonts w:ascii="Consolas" w:hAnsi="Consolas"/>
+          <w:sz w:val="20"/>
+        </w:rPr>
+        <w:t xml:space="preserve">  ├─ Guide_Maquettes_Wireframes.pdf — Maquettes et wireframes</w:t>
+      </w:r>
+    </w:p>
+    <w:p>
+      <w:pPr>
+        <w:spacing w:after="40" w:line="260" w:lineRule="auto"/>
+      </w:pPr>
+      <w:r>
+        <w:rPr>
+          <w:rFonts w:ascii="Consolas" w:hAnsi="Consolas"/>
+          <w:sz w:val="20"/>
+        </w:rPr>
+        <w:t xml:space="preserve">  ├─ Documentation_Technique.md — Documentation technique</w:t>
+      </w:r>
+    </w:p>
+    <w:p>
+      <w:pPr>
+        <w:spacing w:after="40" w:line="260" w:lineRule="auto"/>
+      </w:pPr>
+      <w:r>
+        <w:rPr>
+          <w:rFonts w:ascii="Consolas" w:hAnsi="Consolas"/>
+          <w:sz w:val="20"/>
+        </w:rPr>
+        <w:t xml:space="preserve">  ├─ Gestion_Projet.md — Gestion de projet (méthodologie, planning)</w:t>
+      </w:r>
+    </w:p>
+    <w:p>
+      <w:pPr>
+        <w:spacing w:after="40" w:line="260" w:lineRule="auto"/>
+      </w:pPr>
+      <w:r>
+        <w:rPr>
+          <w:rFonts w:ascii="Consolas" w:hAnsi="Consolas"/>
+          <w:sz w:val="20"/>
+        </w:rPr>
+        <w:t xml:space="preserve">  ├─ MCD_EcoRide.drawio — Modèle Conceptuel de Données</w:t>
+      </w:r>
+    </w:p>
+    <w:p>
+      <w:pPr>
+        <w:spacing w:after="40" w:line="260" w:lineRule="auto"/>
+      </w:pPr>
+      <w:r>
+        <w:rPr>
+          <w:rFonts w:ascii="Consolas" w:hAnsi="Consolas"/>
+          <w:sz w:val="20"/>
+        </w:rPr>
+        <w:t xml:space="preserve">  ├─ Diagramme_Cas_Utilisation.drawio — Diagramme de cas d'utilisation</w:t>
+      </w:r>
+    </w:p>
+    <w:p>
+      <w:pPr>
+        <w:spacing w:after="40" w:line="260" w:lineRule="auto"/>
+      </w:pPr>
+      <w:r>
+        <w:rPr>
+          <w:rFonts w:ascii="Consolas" w:hAnsi="Consolas"/>
+          <w:sz w:val="20"/>
+        </w:rPr>
+        <w:t xml:space="preserve">  └─ Diagramme_Sequence_Participation.drawio — Diagramme de séquence</w:t>
+      </w:r>
+    </w:p>
+    <w:p>
+      <w:pPr>
+        <w:spacing w:after="40" w:line="260" w:lineRule="auto"/>
+      </w:pPr>
+      <w:r>
+        <w:rPr>
+          <w:rFonts w:ascii="Consolas" w:hAnsi="Consolas"/>
+          <w:sz w:val="20"/>
+        </w:rPr>
+        <w:t xml:space="preserve"/>
+      </w:r>
+    </w:p>
+    <w:p>
+      <w:pPr>
+        <w:spacing w:after="40" w:line="260" w:lineRule="auto"/>
+      </w:pPr>
+      <w:r>
+        <w:rPr>
+          <w:rFonts w:ascii="Consolas" w:hAnsi="Consolas"/>
+          <w:sz w:val="20"/>
+        </w:rPr>
+        <w:t xml:space="preserve">Database/ — Scripts SQL</w:t>
+      </w:r>
+    </w:p>
+    <w:p>
+      <w:pPr>
+        <w:spacing w:after="40" w:line="260" w:lineRule="auto"/>
+      </w:pPr>
+      <w:r>
+        <w:rPr>
+          <w:rFonts w:ascii="Consolas" w:hAnsi="Consolas"/>
+          <w:sz w:val="20"/>
+        </w:rPr>
+        <w:t xml:space="preserve">  ├─ init_database.sql — Script complet d'initialisation</w:t>
+      </w:r>
+    </w:p>
+    <w:p>
+      <w:pPr>
+        <w:spacing w:after="40" w:line="260" w:lineRule="auto"/>
+      </w:pPr>
+      <w:r>
+        <w:rPr>
+          <w:rFonts w:ascii="Consolas" w:hAnsi="Consolas"/>
+          <w:sz w:val="20"/>
+        </w:rPr>
+        <w:t xml:space="preserve">  ├─ 01_create_database.sql — Création de la base</w:t>
+      </w:r>
+    </w:p>
+    <w:p>
+      <w:pPr>
+        <w:spacing w:after="40" w:line="260" w:lineRule="auto"/>
+      </w:pPr>
+      <w:r>
+        <w:rPr>
+          <w:rFonts w:ascii="Consolas" w:hAnsi="Consolas"/>
+          <w:sz w:val="20"/>
+        </w:rPr>
+        <w:t xml:space="preserve">  ├─ 02_create_tables.sql — Création des tables</w:t>
+      </w:r>
+    </w:p>
+    <w:p>
+      <w:pPr>
+        <w:spacing w:after="40" w:line="260" w:lineRule="auto"/>
+      </w:pPr>
+      <w:r>
+        <w:rPr>
+          <w:rFonts w:ascii="Consolas" w:hAnsi="Consolas"/>
+          <w:sz w:val="20"/>
+        </w:rPr>
+        <w:t xml:space="preserve">  ├─ 03_insert_data.sql — Données de test (jeu de données)</w:t>
+      </w:r>
+    </w:p>
+    <w:p>
+      <w:pPr>
+        <w:spacing w:after="40" w:line="260" w:lineRule="auto"/>
+      </w:pPr>
+      <w:r>
+        <w:rPr>
+          <w:rFonts w:ascii="Consolas" w:hAnsi="Consolas"/>
+          <w:sz w:val="20"/>
+        </w:rPr>
+        <w:t xml:space="preserve">  └─ 04 à 06 — Scripts de migration</w:t>
+      </w:r>
+    </w:p>
+    <w:p>
+      <w:pPr>
+        <w:spacing w:after="40" w:line="260" w:lineRule="auto"/>
+      </w:pPr>
+      <w:r>
+        <w:rPr>
+          <w:rFonts w:ascii="Consolas" w:hAnsi="Consolas"/>
+          <w:sz w:val="20"/>
+        </w:rPr>
+        <w:t xml:space="preserve"/>
+      </w:r>
+    </w:p>
+    <w:p>
+      <w:pPr>
+        <w:spacing w:after="40" w:line="260" w:lineRule="auto"/>
+      </w:pPr>
+      <w:r>
+        <w:rPr>
+          <w:rFonts w:ascii="Consolas" w:hAnsi="Consolas"/>
+          <w:sz w:val="20"/>
+        </w:rPr>
+        <w:t xml:space="preserve">EcoRide.Backend/ — Code source backend (C# .NET 8)</w:t>
+      </w:r>
+    </w:p>
+    <w:p>
+      <w:pPr>
+        <w:spacing w:after="40" w:line="260" w:lineRule="auto"/>
+      </w:pPr>
+      <w:r>
+        <w:rPr>
+          <w:rFonts w:ascii="Consolas" w:hAnsi="Consolas"/>
+          <w:sz w:val="20"/>
+        </w:rPr>
+        <w:t xml:space="preserve">EcoRide.Frontend/ — Code source frontend (Angular 20)</w:t>
+      </w:r>
+    </w:p>
+    <w:p>
+      <w:pPr>
+        <w:spacing w:after="40" w:line="260" w:lineRule="auto"/>
+      </w:pPr>
+      <w:r>
+        <w:rPr>
+          <w:rFonts w:ascii="Consolas" w:hAnsi="Consolas"/>
+          <w:sz w:val="20"/>
+        </w:rPr>
+        <w:t xml:space="preserve">EcoRide.Backend.Tests/ — Tests unitaires backend (52 tests)</w:t>
+      </w:r>
+    </w:p>
+    <w:p>
+      <w:pPr>
+        <w:spacing w:after="40" w:line="260" w:lineRule="auto"/>
+      </w:pPr>
+      <w:r>
+        <w:rPr>
+          <w:rFonts w:ascii="Consolas" w:hAnsi="Consolas"/>
+          <w:sz w:val="20"/>
+        </w:rPr>
+        <w:t xml:space="preserve">EcoRide.Frontend/ (tests) — Tests unitaires frontend (80 tests)</w:t>
+      </w:r>
+    </w:p>
+    <w:p>
+      <w:r>
+        <w:t xml:space="preserve"/>
+      </w:r>
+    </w:p>
+    <w:p>
+      <w:pPr>
         <w:pStyle w:val="Titre1"/>
       </w:pPr>
       <w:r>
-        <w:lastRenderedPageBreak/>
-        <w:t>2. Choix techniques</w:t>
+        <w:t>3. Choix techniques</w:t>
       </w:r>
     </w:p>
     <w:p>
@@ -863,8 +1145,7 @@
         <w:rPr>
           <w:lang w:val="fr-FR"/>
         </w:rPr>
-        <w:lastRenderedPageBreak/>
-        <w:t>3. Dispositions de sécurité</w:t>
+        <w:t>4. Dispositions de sécurité</w:t>
       </w:r>
     </w:p>
     <w:p>
@@ -1134,8 +1415,7 @@
         <w:rPr>
           <w:lang w:val="fr-FR"/>
         </w:rPr>
-        <w:lastRenderedPageBreak/>
-        <w:t>4. Réponses aux User Stories</w:t>
+        <w:t>5. Réponses aux User Stories</w:t>
       </w:r>
     </w:p>
     <w:p>
@@ -2309,8 +2589,7 @@
         <w:rPr>
           <w:lang w:val="fr-FR"/>
         </w:rPr>
-        <w:lastRenderedPageBreak/>
-        <w:t>5. Conclusion</w:t>
+        <w:t>6. Conclusion</w:t>
       </w:r>
     </w:p>
     <w:p>

</xml_diff>

<commit_message>
Fix Arborescence heading style and update table of contents
Co-Authored-By: Claude Opus 4.6 <noreply@anthropic.com>
</commit_message>
<xml_diff>
--- a/TP_DWWM_copiearendre.docx
+++ b/TP_DWWM_copiearendre.docx
@@ -133,26 +133,15 @@
         <w:br w:type="page"/>
       </w:r>
     </w:p>
-    <w:p>
-      <w:pPr>
-        <w:pStyle w:val="Titre1"/>
-        <w:rPr>
-          <w:lang w:val="fr-FR"/>
-        </w:rPr>
-      </w:pPr>
-      <w:bookmarkStart w:id="0" w:name="_Toc222346638"/>
-      <w:r>
-        <w:rPr>
-          <w:lang w:val="fr-FR"/>
-        </w:rPr>
-        <w:lastRenderedPageBreak/>
-        <w:t>Table des matières</w:t>
-      </w:r>
-      <w:bookmarkEnd w:id="0"/>
-    </w:p>
     <w:sdt>
       <w:sdtPr>
         <w:rPr>
+          <w:rFonts w:ascii="Calibri" w:eastAsiaTheme="minorEastAsia" w:hAnsi="Calibri" w:cstheme="minorBidi"/>
+          <w:b w:val="0"/>
+          <w:bCs w:val="0"/>
+          <w:color w:val="auto"/>
+          <w:sz w:val="22"/>
+          <w:szCs w:val="22"/>
           <w:lang w:val="fr-FR"/>
         </w:rPr>
         <w:id w:val="1281217273"/>
@@ -163,10 +152,6 @@
       </w:sdtPr>
       <w:sdtEndPr>
         <w:rPr>
-          <w:rFonts w:ascii="Calibri" w:eastAsiaTheme="minorEastAsia" w:hAnsi="Calibri" w:cstheme="minorBidi"/>
-          <w:color w:val="auto"/>
-          <w:sz w:val="22"/>
-          <w:szCs w:val="22"/>
           <w:lang w:val="en-US"/>
         </w:rPr>
       </w:sdtEndPr>
@@ -189,7 +174,13 @@
               <w:tab w:val="right" w:leader="dot" w:pos="8630"/>
             </w:tabs>
             <w:rPr>
+              <w:rFonts w:asciiTheme="minorHAnsi" w:hAnsiTheme="minorHAnsi"/>
               <w:noProof/>
+              <w:kern w:val="2"/>
+              <w:sz w:val="24"/>
+              <w:szCs w:val="24"/>
+              <w:lang w:val="fr-FR" w:eastAsia="fr-FR"/>
+              <w14:ligatures w14:val="standardContextual"/>
             </w:rPr>
           </w:pPr>
           <w:r>
@@ -201,14 +192,14 @@
           <w:r>
             <w:fldChar w:fldCharType="separate"/>
           </w:r>
-          <w:hyperlink w:anchor="_Toc222346638" w:history="1">
+          <w:hyperlink w:anchor="_Toc222346857" w:history="1">
             <w:r>
               <w:rPr>
                 <w:rStyle w:val="Lienhypertexte"/>
                 <w:noProof/>
                 <w:lang w:val="fr-FR"/>
               </w:rPr>
-              <w:t>Table des matières</w:t>
+              <w:t>1. Liens des livrables</w:t>
             </w:r>
             <w:r>
               <w:rPr>
@@ -229,7 +220,7 @@
                 <w:noProof/>
                 <w:webHidden/>
               </w:rPr>
-              <w:instrText xml:space="preserve"> PAGEREF _Toc222346638 \h </w:instrText>
+              <w:instrText xml:space="preserve"> PAGEREF _Toc222346857 \h </w:instrText>
             </w:r>
             <w:r>
               <w:rPr>
@@ -249,7 +240,232 @@
                 <w:noProof/>
                 <w:webHidden/>
               </w:rPr>
-              <w:t>2</w:t>
+              <w:t>4</w:t>
+            </w:r>
+            <w:r>
+              <w:rPr>
+                <w:noProof/>
+                <w:webHidden/>
+              </w:rPr>
+              <w:fldChar w:fldCharType="end"/>
+            </w:r>
+          </w:hyperlink>
+        </w:p>
+        <w:p>
+          <w:pPr>
+            <w:pStyle w:val="TM2"/>
+            <w:tabs>
+              <w:tab w:val="right" w:leader="dot" w:pos="8630"/>
+            </w:tabs>
+            <w:rPr>
+              <w:rFonts w:asciiTheme="minorHAnsi" w:hAnsiTheme="minorHAnsi"/>
+              <w:noProof/>
+              <w:kern w:val="2"/>
+              <w:sz w:val="24"/>
+              <w:szCs w:val="24"/>
+              <w:lang w:val="fr-FR" w:eastAsia="fr-FR"/>
+              <w14:ligatures w14:val="standardContextual"/>
+            </w:rPr>
+          </w:pPr>
+          <w:hyperlink w:anchor="_Toc222346858" w:history="1">
+            <w:r>
+              <w:rPr>
+                <w:rStyle w:val="Lienhypertexte"/>
+                <w:noProof/>
+                <w:lang w:val="fr-FR"/>
+              </w:rPr>
+              <w:t>Dépôt GitHub (public)</w:t>
+            </w:r>
+            <w:r>
+              <w:rPr>
+                <w:noProof/>
+                <w:webHidden/>
+              </w:rPr>
+              <w:tab/>
+            </w:r>
+            <w:r>
+              <w:rPr>
+                <w:noProof/>
+                <w:webHidden/>
+              </w:rPr>
+              <w:fldChar w:fldCharType="begin"/>
+            </w:r>
+            <w:r>
+              <w:rPr>
+                <w:noProof/>
+                <w:webHidden/>
+              </w:rPr>
+              <w:instrText xml:space="preserve"> PAGEREF _Toc222346858 \h </w:instrText>
+            </w:r>
+            <w:r>
+              <w:rPr>
+                <w:noProof/>
+                <w:webHidden/>
+              </w:rPr>
+            </w:r>
+            <w:r>
+              <w:rPr>
+                <w:noProof/>
+                <w:webHidden/>
+              </w:rPr>
+              <w:fldChar w:fldCharType="separate"/>
+            </w:r>
+            <w:r>
+              <w:rPr>
+                <w:noProof/>
+                <w:webHidden/>
+              </w:rPr>
+              <w:t>4</w:t>
+            </w:r>
+            <w:r>
+              <w:rPr>
+                <w:noProof/>
+                <w:webHidden/>
+              </w:rPr>
+              <w:fldChar w:fldCharType="end"/>
+            </w:r>
+          </w:hyperlink>
+        </w:p>
+        <w:p>
+          <w:pPr>
+            <w:pStyle w:val="TM2"/>
+            <w:tabs>
+              <w:tab w:val="right" w:leader="dot" w:pos="8630"/>
+            </w:tabs>
+            <w:rPr>
+              <w:rFonts w:asciiTheme="minorHAnsi" w:hAnsiTheme="minorHAnsi"/>
+              <w:noProof/>
+              <w:kern w:val="2"/>
+              <w:sz w:val="24"/>
+              <w:szCs w:val="24"/>
+              <w:lang w:val="fr-FR" w:eastAsia="fr-FR"/>
+              <w14:ligatures w14:val="standardContextual"/>
+            </w:rPr>
+          </w:pPr>
+          <w:hyperlink w:anchor="_Toc222346859" w:history="1">
+            <w:r>
+              <w:rPr>
+                <w:rStyle w:val="Lienhypertexte"/>
+                <w:noProof/>
+                <w:lang w:val="fr-FR"/>
+              </w:rPr>
+              <w:t>Application déployée</w:t>
+            </w:r>
+            <w:r>
+              <w:rPr>
+                <w:noProof/>
+                <w:webHidden/>
+              </w:rPr>
+              <w:tab/>
+            </w:r>
+            <w:r>
+              <w:rPr>
+                <w:noProof/>
+                <w:webHidden/>
+              </w:rPr>
+              <w:fldChar w:fldCharType="begin"/>
+            </w:r>
+            <w:r>
+              <w:rPr>
+                <w:noProof/>
+                <w:webHidden/>
+              </w:rPr>
+              <w:instrText xml:space="preserve"> PAGEREF _Toc222346859 \h </w:instrText>
+            </w:r>
+            <w:r>
+              <w:rPr>
+                <w:noProof/>
+                <w:webHidden/>
+              </w:rPr>
+            </w:r>
+            <w:r>
+              <w:rPr>
+                <w:noProof/>
+                <w:webHidden/>
+              </w:rPr>
+              <w:fldChar w:fldCharType="separate"/>
+            </w:r>
+            <w:r>
+              <w:rPr>
+                <w:noProof/>
+                <w:webHidden/>
+              </w:rPr>
+              <w:t>4</w:t>
+            </w:r>
+            <w:r>
+              <w:rPr>
+                <w:noProof/>
+                <w:webHidden/>
+              </w:rPr>
+              <w:fldChar w:fldCharType="end"/>
+            </w:r>
+          </w:hyperlink>
+        </w:p>
+        <w:p>
+          <w:pPr>
+            <w:pStyle w:val="TM2"/>
+            <w:tabs>
+              <w:tab w:val="right" w:leader="dot" w:pos="8630"/>
+            </w:tabs>
+            <w:rPr>
+              <w:rFonts w:asciiTheme="minorHAnsi" w:hAnsiTheme="minorHAnsi"/>
+              <w:noProof/>
+              <w:kern w:val="2"/>
+              <w:sz w:val="24"/>
+              <w:szCs w:val="24"/>
+              <w:lang w:val="fr-FR" w:eastAsia="fr-FR"/>
+              <w14:ligatures w14:val="standardContextual"/>
+            </w:rPr>
+          </w:pPr>
+          <w:hyperlink w:anchor="_Toc222346860" w:history="1">
+            <w:r>
+              <w:rPr>
+                <w:rStyle w:val="Lienhypertexte"/>
+                <w:noProof/>
+                <w:lang w:val="fr-FR"/>
+              </w:rPr>
+              <w:t>Gestion de projet (Kanban)</w:t>
+            </w:r>
+            <w:r>
+              <w:rPr>
+                <w:noProof/>
+                <w:webHidden/>
+              </w:rPr>
+              <w:tab/>
+            </w:r>
+            <w:r>
+              <w:rPr>
+                <w:noProof/>
+                <w:webHidden/>
+              </w:rPr>
+              <w:fldChar w:fldCharType="begin"/>
+            </w:r>
+            <w:r>
+              <w:rPr>
+                <w:noProof/>
+                <w:webHidden/>
+              </w:rPr>
+              <w:instrText xml:space="preserve"> PAGEREF _Toc222346860 \h </w:instrText>
+            </w:r>
+            <w:r>
+              <w:rPr>
+                <w:noProof/>
+                <w:webHidden/>
+              </w:rPr>
+            </w:r>
+            <w:r>
+              <w:rPr>
+                <w:noProof/>
+                <w:webHidden/>
+              </w:rPr>
+              <w:fldChar w:fldCharType="separate"/>
+            </w:r>
+            <w:r>
+              <w:rPr>
+                <w:noProof/>
+                <w:webHidden/>
+              </w:rPr>
+              <w:t>4</w:t>
             </w:r>
             <w:r>
               <w:rPr>
@@ -267,17 +483,23 @@
               <w:tab w:val="right" w:leader="dot" w:pos="8630"/>
             </w:tabs>
             <w:rPr>
+              <w:rFonts w:asciiTheme="minorHAnsi" w:hAnsiTheme="minorHAnsi"/>
               <w:noProof/>
+              <w:kern w:val="2"/>
+              <w:sz w:val="24"/>
+              <w:szCs w:val="24"/>
+              <w:lang w:val="fr-FR" w:eastAsia="fr-FR"/>
+              <w14:ligatures w14:val="standardContextual"/>
             </w:rPr>
           </w:pPr>
-          <w:hyperlink w:anchor="_Toc222346639" w:history="1">
+          <w:hyperlink w:anchor="_Toc222346861" w:history="1">
             <w:r>
               <w:rPr>
                 <w:rStyle w:val="Lienhypertexte"/>
                 <w:noProof/>
                 <w:lang w:val="fr-FR"/>
               </w:rPr>
-              <w:t>1. Liens des livrables</w:t>
+              <w:t>2. Arborescence des livrables</w:t>
             </w:r>
             <w:r>
               <w:rPr>
@@ -298,7 +520,7 @@
                 <w:noProof/>
                 <w:webHidden/>
               </w:rPr>
-              <w:instrText xml:space="preserve"> PAGEREF _Toc222346639 \h </w:instrText>
+              <w:instrText xml:space="preserve"> PAGEREF _Toc222346861 \h </w:instrText>
             </w:r>
             <w:r>
               <w:rPr>
@@ -318,7 +540,81 @@
                 <w:noProof/>
                 <w:webHidden/>
               </w:rPr>
-              <w:t>3</w:t>
+              <w:t>5</w:t>
+            </w:r>
+            <w:r>
+              <w:rPr>
+                <w:noProof/>
+                <w:webHidden/>
+              </w:rPr>
+              <w:fldChar w:fldCharType="end"/>
+            </w:r>
+          </w:hyperlink>
+        </w:p>
+        <w:p>
+          <w:pPr>
+            <w:pStyle w:val="TM1"/>
+            <w:tabs>
+              <w:tab w:val="right" w:leader="dot" w:pos="8630"/>
+            </w:tabs>
+            <w:rPr>
+              <w:rFonts w:asciiTheme="minorHAnsi" w:hAnsiTheme="minorHAnsi"/>
+              <w:noProof/>
+              <w:kern w:val="2"/>
+              <w:sz w:val="24"/>
+              <w:szCs w:val="24"/>
+              <w:lang w:val="fr-FR" w:eastAsia="fr-FR"/>
+              <w14:ligatures w14:val="standardContextual"/>
+            </w:rPr>
+          </w:pPr>
+          <w:hyperlink w:anchor="_Toc222346862" w:history="1">
+            <w:r>
+              <w:rPr>
+                <w:rStyle w:val="Lienhypertexte"/>
+                <w:noProof/>
+              </w:rPr>
+              <w:t>3. Choix techniques</w:t>
+            </w:r>
+            <w:r>
+              <w:rPr>
+                <w:noProof/>
+                <w:webHidden/>
+              </w:rPr>
+              <w:tab/>
+            </w:r>
+            <w:r>
+              <w:rPr>
+                <w:noProof/>
+                <w:webHidden/>
+              </w:rPr>
+              <w:fldChar w:fldCharType="begin"/>
+            </w:r>
+            <w:r>
+              <w:rPr>
+                <w:noProof/>
+                <w:webHidden/>
+              </w:rPr>
+              <w:instrText xml:space="preserve"> PAGEREF _Toc222346862 \h </w:instrText>
+            </w:r>
+            <w:r>
+              <w:rPr>
+                <w:noProof/>
+                <w:webHidden/>
+              </w:rPr>
+            </w:r>
+            <w:r>
+              <w:rPr>
+                <w:noProof/>
+                <w:webHidden/>
+              </w:rPr>
+              <w:fldChar w:fldCharType="separate"/>
+            </w:r>
+            <w:r>
+              <w:rPr>
+                <w:noProof/>
+                <w:webHidden/>
+              </w:rPr>
+              <w:t>5</w:t>
             </w:r>
             <w:r>
               <w:rPr>
@@ -336,17 +632,22 @@
               <w:tab w:val="right" w:leader="dot" w:pos="8630"/>
             </w:tabs>
             <w:rPr>
+              <w:rFonts w:asciiTheme="minorHAnsi" w:hAnsiTheme="minorHAnsi"/>
               <w:noProof/>
+              <w:kern w:val="2"/>
+              <w:sz w:val="24"/>
+              <w:szCs w:val="24"/>
+              <w:lang w:val="fr-FR" w:eastAsia="fr-FR"/>
+              <w14:ligatures w14:val="standardContextual"/>
             </w:rPr>
           </w:pPr>
-          <w:hyperlink w:anchor="_Toc222346640" w:history="1">
+          <w:hyperlink w:anchor="_Toc222346863" w:history="1">
             <w:r>
               <w:rPr>
                 <w:rStyle w:val="Lienhypertexte"/>
                 <w:noProof/>
-                <w:lang w:val="fr-FR"/>
-              </w:rPr>
-              <w:t>Dépôt GitHub (public)</w:t>
+              </w:rPr>
+              <w:t>Stack technique retenue</w:t>
             </w:r>
             <w:r>
               <w:rPr>
@@ -367,7 +668,7 @@
                 <w:noProof/>
                 <w:webHidden/>
               </w:rPr>
-              <w:instrText xml:space="preserve"> PAGEREF _Toc222346640 \h </w:instrText>
+              <w:instrText xml:space="preserve"> PAGEREF _Toc222346863 \h </w:instrText>
             </w:r>
             <w:r>
               <w:rPr>
@@ -387,7 +688,7 @@
                 <w:noProof/>
                 <w:webHidden/>
               </w:rPr>
-              <w:t>3</w:t>
+              <w:t>5</w:t>
             </w:r>
             <w:r>
               <w:rPr>
@@ -405,17 +706,23 @@
               <w:tab w:val="right" w:leader="dot" w:pos="8630"/>
             </w:tabs>
             <w:rPr>
+              <w:rFonts w:asciiTheme="minorHAnsi" w:hAnsiTheme="minorHAnsi"/>
               <w:noProof/>
+              <w:kern w:val="2"/>
+              <w:sz w:val="24"/>
+              <w:szCs w:val="24"/>
+              <w:lang w:val="fr-FR" w:eastAsia="fr-FR"/>
+              <w14:ligatures w14:val="standardContextual"/>
             </w:rPr>
           </w:pPr>
-          <w:hyperlink w:anchor="_Toc222346641" w:history="1">
+          <w:hyperlink w:anchor="_Toc222346864" w:history="1">
             <w:r>
               <w:rPr>
                 <w:rStyle w:val="Lienhypertexte"/>
                 <w:noProof/>
                 <w:lang w:val="fr-FR"/>
               </w:rPr>
-              <w:t>Application déployée</w:t>
+              <w:t>Justification des choix</w:t>
             </w:r>
             <w:r>
               <w:rPr>
@@ -436,7 +743,7 @@
                 <w:noProof/>
                 <w:webHidden/>
               </w:rPr>
-              <w:instrText xml:space="preserve"> PAGEREF _Toc222346641 \h </w:instrText>
+              <w:instrText xml:space="preserve"> PAGEREF _Toc222346864 \h </w:instrText>
             </w:r>
             <w:r>
               <w:rPr>
@@ -456,7 +763,457 @@
                 <w:noProof/>
                 <w:webHidden/>
               </w:rPr>
-              <w:t>3</w:t>
+              <w:t>6</w:t>
+            </w:r>
+            <w:r>
+              <w:rPr>
+                <w:noProof/>
+                <w:webHidden/>
+              </w:rPr>
+              <w:fldChar w:fldCharType="end"/>
+            </w:r>
+          </w:hyperlink>
+        </w:p>
+        <w:p>
+          <w:pPr>
+            <w:pStyle w:val="TM3"/>
+            <w:tabs>
+              <w:tab w:val="right" w:leader="dot" w:pos="8630"/>
+            </w:tabs>
+            <w:rPr>
+              <w:rFonts w:asciiTheme="minorHAnsi" w:hAnsiTheme="minorHAnsi"/>
+              <w:noProof/>
+              <w:kern w:val="2"/>
+              <w:sz w:val="24"/>
+              <w:szCs w:val="24"/>
+              <w:lang w:val="fr-FR" w:eastAsia="fr-FR"/>
+              <w14:ligatures w14:val="standardContextual"/>
+            </w:rPr>
+          </w:pPr>
+          <w:hyperlink w:anchor="_Toc222346865" w:history="1">
+            <w:r>
+              <w:rPr>
+                <w:rStyle w:val="Lienhypertexte"/>
+                <w:noProof/>
+                <w:lang w:val="fr-FR"/>
+              </w:rPr>
+              <w:t>Angular 20</w:t>
+            </w:r>
+            <w:r>
+              <w:rPr>
+                <w:noProof/>
+                <w:webHidden/>
+              </w:rPr>
+              <w:tab/>
+            </w:r>
+            <w:r>
+              <w:rPr>
+                <w:noProof/>
+                <w:webHidden/>
+              </w:rPr>
+              <w:fldChar w:fldCharType="begin"/>
+            </w:r>
+            <w:r>
+              <w:rPr>
+                <w:noProof/>
+                <w:webHidden/>
+              </w:rPr>
+              <w:instrText xml:space="preserve"> PAGEREF _Toc222346865 \h </w:instrText>
+            </w:r>
+            <w:r>
+              <w:rPr>
+                <w:noProof/>
+                <w:webHidden/>
+              </w:rPr>
+            </w:r>
+            <w:r>
+              <w:rPr>
+                <w:noProof/>
+                <w:webHidden/>
+              </w:rPr>
+              <w:fldChar w:fldCharType="separate"/>
+            </w:r>
+            <w:r>
+              <w:rPr>
+                <w:noProof/>
+                <w:webHidden/>
+              </w:rPr>
+              <w:t>6</w:t>
+            </w:r>
+            <w:r>
+              <w:rPr>
+                <w:noProof/>
+                <w:webHidden/>
+              </w:rPr>
+              <w:fldChar w:fldCharType="end"/>
+            </w:r>
+          </w:hyperlink>
+        </w:p>
+        <w:p>
+          <w:pPr>
+            <w:pStyle w:val="TM3"/>
+            <w:tabs>
+              <w:tab w:val="right" w:leader="dot" w:pos="8630"/>
+            </w:tabs>
+            <w:rPr>
+              <w:rFonts w:asciiTheme="minorHAnsi" w:hAnsiTheme="minorHAnsi"/>
+              <w:noProof/>
+              <w:kern w:val="2"/>
+              <w:sz w:val="24"/>
+              <w:szCs w:val="24"/>
+              <w:lang w:val="fr-FR" w:eastAsia="fr-FR"/>
+              <w14:ligatures w14:val="standardContextual"/>
+            </w:rPr>
+          </w:pPr>
+          <w:hyperlink w:anchor="_Toc222346866" w:history="1">
+            <w:r>
+              <w:rPr>
+                <w:rStyle w:val="Lienhypertexte"/>
+                <w:noProof/>
+                <w:lang w:val="fr-FR"/>
+              </w:rPr>
+              <w:t>C# .NET 8 / ASP.NET Core</w:t>
+            </w:r>
+            <w:r>
+              <w:rPr>
+                <w:noProof/>
+                <w:webHidden/>
+              </w:rPr>
+              <w:tab/>
+            </w:r>
+            <w:r>
+              <w:rPr>
+                <w:noProof/>
+                <w:webHidden/>
+              </w:rPr>
+              <w:fldChar w:fldCharType="begin"/>
+            </w:r>
+            <w:r>
+              <w:rPr>
+                <w:noProof/>
+                <w:webHidden/>
+              </w:rPr>
+              <w:instrText xml:space="preserve"> PAGEREF _Toc222346866 \h </w:instrText>
+            </w:r>
+            <w:r>
+              <w:rPr>
+                <w:noProof/>
+                <w:webHidden/>
+              </w:rPr>
+            </w:r>
+            <w:r>
+              <w:rPr>
+                <w:noProof/>
+                <w:webHidden/>
+              </w:rPr>
+              <w:fldChar w:fldCharType="separate"/>
+            </w:r>
+            <w:r>
+              <w:rPr>
+                <w:noProof/>
+                <w:webHidden/>
+              </w:rPr>
+              <w:t>6</w:t>
+            </w:r>
+            <w:r>
+              <w:rPr>
+                <w:noProof/>
+                <w:webHidden/>
+              </w:rPr>
+              <w:fldChar w:fldCharType="end"/>
+            </w:r>
+          </w:hyperlink>
+        </w:p>
+        <w:p>
+          <w:pPr>
+            <w:pStyle w:val="TM3"/>
+            <w:tabs>
+              <w:tab w:val="right" w:leader="dot" w:pos="8630"/>
+            </w:tabs>
+            <w:rPr>
+              <w:rFonts w:asciiTheme="minorHAnsi" w:hAnsiTheme="minorHAnsi"/>
+              <w:noProof/>
+              <w:kern w:val="2"/>
+              <w:sz w:val="24"/>
+              <w:szCs w:val="24"/>
+              <w:lang w:val="fr-FR" w:eastAsia="fr-FR"/>
+              <w14:ligatures w14:val="standardContextual"/>
+            </w:rPr>
+          </w:pPr>
+          <w:hyperlink w:anchor="_Toc222346867" w:history="1">
+            <w:r>
+              <w:rPr>
+                <w:rStyle w:val="Lienhypertexte"/>
+                <w:noProof/>
+                <w:lang w:val="fr-FR"/>
+              </w:rPr>
+              <w:t>PostgreSQL</w:t>
+            </w:r>
+            <w:r>
+              <w:rPr>
+                <w:noProof/>
+                <w:webHidden/>
+              </w:rPr>
+              <w:tab/>
+            </w:r>
+            <w:r>
+              <w:rPr>
+                <w:noProof/>
+                <w:webHidden/>
+              </w:rPr>
+              <w:fldChar w:fldCharType="begin"/>
+            </w:r>
+            <w:r>
+              <w:rPr>
+                <w:noProof/>
+                <w:webHidden/>
+              </w:rPr>
+              <w:instrText xml:space="preserve"> PAGEREF _Toc222346867 \h </w:instrText>
+            </w:r>
+            <w:r>
+              <w:rPr>
+                <w:noProof/>
+                <w:webHidden/>
+              </w:rPr>
+            </w:r>
+            <w:r>
+              <w:rPr>
+                <w:noProof/>
+                <w:webHidden/>
+              </w:rPr>
+              <w:fldChar w:fldCharType="separate"/>
+            </w:r>
+            <w:r>
+              <w:rPr>
+                <w:noProof/>
+                <w:webHidden/>
+              </w:rPr>
+              <w:t>6</w:t>
+            </w:r>
+            <w:r>
+              <w:rPr>
+                <w:noProof/>
+                <w:webHidden/>
+              </w:rPr>
+              <w:fldChar w:fldCharType="end"/>
+            </w:r>
+          </w:hyperlink>
+        </w:p>
+        <w:p>
+          <w:pPr>
+            <w:pStyle w:val="TM3"/>
+            <w:tabs>
+              <w:tab w:val="right" w:leader="dot" w:pos="8630"/>
+            </w:tabs>
+            <w:rPr>
+              <w:rFonts w:asciiTheme="minorHAnsi" w:hAnsiTheme="minorHAnsi"/>
+              <w:noProof/>
+              <w:kern w:val="2"/>
+              <w:sz w:val="24"/>
+              <w:szCs w:val="24"/>
+              <w:lang w:val="fr-FR" w:eastAsia="fr-FR"/>
+              <w14:ligatures w14:val="standardContextual"/>
+            </w:rPr>
+          </w:pPr>
+          <w:hyperlink w:anchor="_Toc222346868" w:history="1">
+            <w:r>
+              <w:rPr>
+                <w:rStyle w:val="Lienhypertexte"/>
+                <w:noProof/>
+                <w:lang w:val="fr-FR"/>
+              </w:rPr>
+              <w:t>MongoDB</w:t>
+            </w:r>
+            <w:r>
+              <w:rPr>
+                <w:noProof/>
+                <w:webHidden/>
+              </w:rPr>
+              <w:tab/>
+            </w:r>
+            <w:r>
+              <w:rPr>
+                <w:noProof/>
+                <w:webHidden/>
+              </w:rPr>
+              <w:fldChar w:fldCharType="begin"/>
+            </w:r>
+            <w:r>
+              <w:rPr>
+                <w:noProof/>
+                <w:webHidden/>
+              </w:rPr>
+              <w:instrText xml:space="preserve"> PAGEREF _Toc222346868 \h </w:instrText>
+            </w:r>
+            <w:r>
+              <w:rPr>
+                <w:noProof/>
+                <w:webHidden/>
+              </w:rPr>
+            </w:r>
+            <w:r>
+              <w:rPr>
+                <w:noProof/>
+                <w:webHidden/>
+              </w:rPr>
+              <w:fldChar w:fldCharType="separate"/>
+            </w:r>
+            <w:r>
+              <w:rPr>
+                <w:noProof/>
+                <w:webHidden/>
+              </w:rPr>
+              <w:t>6</w:t>
+            </w:r>
+            <w:r>
+              <w:rPr>
+                <w:noProof/>
+                <w:webHidden/>
+              </w:rPr>
+              <w:fldChar w:fldCharType="end"/>
+            </w:r>
+          </w:hyperlink>
+        </w:p>
+        <w:p>
+          <w:pPr>
+            <w:pStyle w:val="TM3"/>
+            <w:tabs>
+              <w:tab w:val="right" w:leader="dot" w:pos="8630"/>
+            </w:tabs>
+            <w:rPr>
+              <w:rFonts w:asciiTheme="minorHAnsi" w:hAnsiTheme="minorHAnsi"/>
+              <w:noProof/>
+              <w:kern w:val="2"/>
+              <w:sz w:val="24"/>
+              <w:szCs w:val="24"/>
+              <w:lang w:val="fr-FR" w:eastAsia="fr-FR"/>
+              <w14:ligatures w14:val="standardContextual"/>
+            </w:rPr>
+          </w:pPr>
+          <w:hyperlink w:anchor="_Toc222346869" w:history="1">
+            <w:r>
+              <w:rPr>
+                <w:rStyle w:val="Lienhypertexte"/>
+                <w:noProof/>
+                <w:lang w:val="fr-FR"/>
+              </w:rPr>
+              <w:t>Internationalisation (ngx-translate)</w:t>
+            </w:r>
+            <w:r>
+              <w:rPr>
+                <w:noProof/>
+                <w:webHidden/>
+              </w:rPr>
+              <w:tab/>
+            </w:r>
+            <w:r>
+              <w:rPr>
+                <w:noProof/>
+                <w:webHidden/>
+              </w:rPr>
+              <w:fldChar w:fldCharType="begin"/>
+            </w:r>
+            <w:r>
+              <w:rPr>
+                <w:noProof/>
+                <w:webHidden/>
+              </w:rPr>
+              <w:instrText xml:space="preserve"> PAGEREF _Toc222346869 \h </w:instrText>
+            </w:r>
+            <w:r>
+              <w:rPr>
+                <w:noProof/>
+                <w:webHidden/>
+              </w:rPr>
+            </w:r>
+            <w:r>
+              <w:rPr>
+                <w:noProof/>
+                <w:webHidden/>
+              </w:rPr>
+              <w:fldChar w:fldCharType="separate"/>
+            </w:r>
+            <w:r>
+              <w:rPr>
+                <w:noProof/>
+                <w:webHidden/>
+              </w:rPr>
+              <w:t>6</w:t>
+            </w:r>
+            <w:r>
+              <w:rPr>
+                <w:noProof/>
+                <w:webHidden/>
+              </w:rPr>
+              <w:fldChar w:fldCharType="end"/>
+            </w:r>
+          </w:hyperlink>
+        </w:p>
+        <w:p>
+          <w:pPr>
+            <w:pStyle w:val="TM1"/>
+            <w:tabs>
+              <w:tab w:val="right" w:leader="dot" w:pos="8630"/>
+            </w:tabs>
+            <w:rPr>
+              <w:rFonts w:asciiTheme="minorHAnsi" w:hAnsiTheme="minorHAnsi"/>
+              <w:noProof/>
+              <w:kern w:val="2"/>
+              <w:sz w:val="24"/>
+              <w:szCs w:val="24"/>
+              <w:lang w:val="fr-FR" w:eastAsia="fr-FR"/>
+              <w14:ligatures w14:val="standardContextual"/>
+            </w:rPr>
+          </w:pPr>
+          <w:hyperlink w:anchor="_Toc222346870" w:history="1">
+            <w:r>
+              <w:rPr>
+                <w:rStyle w:val="Lienhypertexte"/>
+                <w:noProof/>
+                <w:lang w:val="fr-FR"/>
+              </w:rPr>
+              <w:t>4. Dispositions de sécurité</w:t>
+            </w:r>
+            <w:r>
+              <w:rPr>
+                <w:noProof/>
+                <w:webHidden/>
+              </w:rPr>
+              <w:tab/>
+            </w:r>
+            <w:r>
+              <w:rPr>
+                <w:noProof/>
+                <w:webHidden/>
+              </w:rPr>
+              <w:fldChar w:fldCharType="begin"/>
+            </w:r>
+            <w:r>
+              <w:rPr>
+                <w:noProof/>
+                <w:webHidden/>
+              </w:rPr>
+              <w:instrText xml:space="preserve"> PAGEREF _Toc222346870 \h </w:instrText>
+            </w:r>
+            <w:r>
+              <w:rPr>
+                <w:noProof/>
+                <w:webHidden/>
+              </w:rPr>
+            </w:r>
+            <w:r>
+              <w:rPr>
+                <w:noProof/>
+                <w:webHidden/>
+              </w:rPr>
+              <w:fldChar w:fldCharType="separate"/>
+            </w:r>
+            <w:r>
+              <w:rPr>
+                <w:noProof/>
+                <w:webHidden/>
+              </w:rPr>
+              <w:t>7</w:t>
             </w:r>
             <w:r>
               <w:rPr>
@@ -474,17 +1231,23 @@
               <w:tab w:val="right" w:leader="dot" w:pos="8630"/>
             </w:tabs>
             <w:rPr>
+              <w:rFonts w:asciiTheme="minorHAnsi" w:hAnsiTheme="minorHAnsi"/>
               <w:noProof/>
+              <w:kern w:val="2"/>
+              <w:sz w:val="24"/>
+              <w:szCs w:val="24"/>
+              <w:lang w:val="fr-FR" w:eastAsia="fr-FR"/>
+              <w14:ligatures w14:val="standardContextual"/>
             </w:rPr>
           </w:pPr>
-          <w:hyperlink w:anchor="_Toc222346642" w:history="1">
+          <w:hyperlink w:anchor="_Toc222346871" w:history="1">
             <w:r>
               <w:rPr>
                 <w:rStyle w:val="Lienhypertexte"/>
                 <w:noProof/>
                 <w:lang w:val="fr-FR"/>
               </w:rPr>
-              <w:t>Gestion de projet (Kanban)</w:t>
+              <w:t>Authentification JWT</w:t>
             </w:r>
             <w:r>
               <w:rPr>
@@ -505,7 +1268,7 @@
                 <w:noProof/>
                 <w:webHidden/>
               </w:rPr>
-              <w:instrText xml:space="preserve"> PAGEREF _Toc222346642 \h </w:instrText>
+              <w:instrText xml:space="preserve"> PAGEREF _Toc222346871 \h </w:instrText>
             </w:r>
             <w:r>
               <w:rPr>
@@ -525,7 +1288,607 @@
                 <w:noProof/>
                 <w:webHidden/>
               </w:rPr>
-              <w:t>3</w:t>
+              <w:t>7</w:t>
+            </w:r>
+            <w:r>
+              <w:rPr>
+                <w:noProof/>
+                <w:webHidden/>
+              </w:rPr>
+              <w:fldChar w:fldCharType="end"/>
+            </w:r>
+          </w:hyperlink>
+        </w:p>
+        <w:p>
+          <w:pPr>
+            <w:pStyle w:val="TM2"/>
+            <w:tabs>
+              <w:tab w:val="right" w:leader="dot" w:pos="8630"/>
+            </w:tabs>
+            <w:rPr>
+              <w:rFonts w:asciiTheme="minorHAnsi" w:hAnsiTheme="minorHAnsi"/>
+              <w:noProof/>
+              <w:kern w:val="2"/>
+              <w:sz w:val="24"/>
+              <w:szCs w:val="24"/>
+              <w:lang w:val="fr-FR" w:eastAsia="fr-FR"/>
+              <w14:ligatures w14:val="standardContextual"/>
+            </w:rPr>
+          </w:pPr>
+          <w:hyperlink w:anchor="_Toc222346872" w:history="1">
+            <w:r>
+              <w:rPr>
+                <w:rStyle w:val="Lienhypertexte"/>
+                <w:noProof/>
+                <w:lang w:val="fr-FR"/>
+              </w:rPr>
+              <w:t>Hachage des mots de passe</w:t>
+            </w:r>
+            <w:r>
+              <w:rPr>
+                <w:noProof/>
+                <w:webHidden/>
+              </w:rPr>
+              <w:tab/>
+            </w:r>
+            <w:r>
+              <w:rPr>
+                <w:noProof/>
+                <w:webHidden/>
+              </w:rPr>
+              <w:fldChar w:fldCharType="begin"/>
+            </w:r>
+            <w:r>
+              <w:rPr>
+                <w:noProof/>
+                <w:webHidden/>
+              </w:rPr>
+              <w:instrText xml:space="preserve"> PAGEREF _Toc222346872 \h </w:instrText>
+            </w:r>
+            <w:r>
+              <w:rPr>
+                <w:noProof/>
+                <w:webHidden/>
+              </w:rPr>
+            </w:r>
+            <w:r>
+              <w:rPr>
+                <w:noProof/>
+                <w:webHidden/>
+              </w:rPr>
+              <w:fldChar w:fldCharType="separate"/>
+            </w:r>
+            <w:r>
+              <w:rPr>
+                <w:noProof/>
+                <w:webHidden/>
+              </w:rPr>
+              <w:t>7</w:t>
+            </w:r>
+            <w:r>
+              <w:rPr>
+                <w:noProof/>
+                <w:webHidden/>
+              </w:rPr>
+              <w:fldChar w:fldCharType="end"/>
+            </w:r>
+          </w:hyperlink>
+        </w:p>
+        <w:p>
+          <w:pPr>
+            <w:pStyle w:val="TM2"/>
+            <w:tabs>
+              <w:tab w:val="right" w:leader="dot" w:pos="8630"/>
+            </w:tabs>
+            <w:rPr>
+              <w:rFonts w:asciiTheme="minorHAnsi" w:hAnsiTheme="minorHAnsi"/>
+              <w:noProof/>
+              <w:kern w:val="2"/>
+              <w:sz w:val="24"/>
+              <w:szCs w:val="24"/>
+              <w:lang w:val="fr-FR" w:eastAsia="fr-FR"/>
+              <w14:ligatures w14:val="standardContextual"/>
+            </w:rPr>
+          </w:pPr>
+          <w:hyperlink w:anchor="_Toc222346873" w:history="1">
+            <w:r>
+              <w:rPr>
+                <w:rStyle w:val="Lienhypertexte"/>
+                <w:noProof/>
+                <w:lang w:val="fr-FR"/>
+              </w:rPr>
+              <w:t>Validation des mots de passe</w:t>
+            </w:r>
+            <w:r>
+              <w:rPr>
+                <w:noProof/>
+                <w:webHidden/>
+              </w:rPr>
+              <w:tab/>
+            </w:r>
+            <w:r>
+              <w:rPr>
+                <w:noProof/>
+                <w:webHidden/>
+              </w:rPr>
+              <w:fldChar w:fldCharType="begin"/>
+            </w:r>
+            <w:r>
+              <w:rPr>
+                <w:noProof/>
+                <w:webHidden/>
+              </w:rPr>
+              <w:instrText xml:space="preserve"> PAGEREF _Toc222346873 \h </w:instrText>
+            </w:r>
+            <w:r>
+              <w:rPr>
+                <w:noProof/>
+                <w:webHidden/>
+              </w:rPr>
+            </w:r>
+            <w:r>
+              <w:rPr>
+                <w:noProof/>
+                <w:webHidden/>
+              </w:rPr>
+              <w:fldChar w:fldCharType="separate"/>
+            </w:r>
+            <w:r>
+              <w:rPr>
+                <w:noProof/>
+                <w:webHidden/>
+              </w:rPr>
+              <w:t>7</w:t>
+            </w:r>
+            <w:r>
+              <w:rPr>
+                <w:noProof/>
+                <w:webHidden/>
+              </w:rPr>
+              <w:fldChar w:fldCharType="end"/>
+            </w:r>
+          </w:hyperlink>
+        </w:p>
+        <w:p>
+          <w:pPr>
+            <w:pStyle w:val="TM2"/>
+            <w:tabs>
+              <w:tab w:val="right" w:leader="dot" w:pos="8630"/>
+            </w:tabs>
+            <w:rPr>
+              <w:rFonts w:asciiTheme="minorHAnsi" w:hAnsiTheme="minorHAnsi"/>
+              <w:noProof/>
+              <w:kern w:val="2"/>
+              <w:sz w:val="24"/>
+              <w:szCs w:val="24"/>
+              <w:lang w:val="fr-FR" w:eastAsia="fr-FR"/>
+              <w14:ligatures w14:val="standardContextual"/>
+            </w:rPr>
+          </w:pPr>
+          <w:hyperlink w:anchor="_Toc222346874" w:history="1">
+            <w:r>
+              <w:rPr>
+                <w:rStyle w:val="Lienhypertexte"/>
+                <w:noProof/>
+                <w:lang w:val="fr-FR"/>
+              </w:rPr>
+              <w:t>Autorisation par rôles</w:t>
+            </w:r>
+            <w:r>
+              <w:rPr>
+                <w:noProof/>
+                <w:webHidden/>
+              </w:rPr>
+              <w:tab/>
+            </w:r>
+            <w:r>
+              <w:rPr>
+                <w:noProof/>
+                <w:webHidden/>
+              </w:rPr>
+              <w:fldChar w:fldCharType="begin"/>
+            </w:r>
+            <w:r>
+              <w:rPr>
+                <w:noProof/>
+                <w:webHidden/>
+              </w:rPr>
+              <w:instrText xml:space="preserve"> PAGEREF _Toc222346874 \h </w:instrText>
+            </w:r>
+            <w:r>
+              <w:rPr>
+                <w:noProof/>
+                <w:webHidden/>
+              </w:rPr>
+            </w:r>
+            <w:r>
+              <w:rPr>
+                <w:noProof/>
+                <w:webHidden/>
+              </w:rPr>
+              <w:fldChar w:fldCharType="separate"/>
+            </w:r>
+            <w:r>
+              <w:rPr>
+                <w:noProof/>
+                <w:webHidden/>
+              </w:rPr>
+              <w:t>7</w:t>
+            </w:r>
+            <w:r>
+              <w:rPr>
+                <w:noProof/>
+                <w:webHidden/>
+              </w:rPr>
+              <w:fldChar w:fldCharType="end"/>
+            </w:r>
+          </w:hyperlink>
+        </w:p>
+        <w:p>
+          <w:pPr>
+            <w:pStyle w:val="TM2"/>
+            <w:tabs>
+              <w:tab w:val="right" w:leader="dot" w:pos="8630"/>
+            </w:tabs>
+            <w:rPr>
+              <w:rFonts w:asciiTheme="minorHAnsi" w:hAnsiTheme="minorHAnsi"/>
+              <w:noProof/>
+              <w:kern w:val="2"/>
+              <w:sz w:val="24"/>
+              <w:szCs w:val="24"/>
+              <w:lang w:val="fr-FR" w:eastAsia="fr-FR"/>
+              <w14:ligatures w14:val="standardContextual"/>
+            </w:rPr>
+          </w:pPr>
+          <w:hyperlink w:anchor="_Toc222346875" w:history="1">
+            <w:r>
+              <w:rPr>
+                <w:rStyle w:val="Lienhypertexte"/>
+                <w:noProof/>
+                <w:lang w:val="fr-FR"/>
+              </w:rPr>
+              <w:t>Validation des entrées</w:t>
+            </w:r>
+            <w:r>
+              <w:rPr>
+                <w:noProof/>
+                <w:webHidden/>
+              </w:rPr>
+              <w:tab/>
+            </w:r>
+            <w:r>
+              <w:rPr>
+                <w:noProof/>
+                <w:webHidden/>
+              </w:rPr>
+              <w:fldChar w:fldCharType="begin"/>
+            </w:r>
+            <w:r>
+              <w:rPr>
+                <w:noProof/>
+                <w:webHidden/>
+              </w:rPr>
+              <w:instrText xml:space="preserve"> PAGEREF _Toc222346875 \h </w:instrText>
+            </w:r>
+            <w:r>
+              <w:rPr>
+                <w:noProof/>
+                <w:webHidden/>
+              </w:rPr>
+            </w:r>
+            <w:r>
+              <w:rPr>
+                <w:noProof/>
+                <w:webHidden/>
+              </w:rPr>
+              <w:fldChar w:fldCharType="separate"/>
+            </w:r>
+            <w:r>
+              <w:rPr>
+                <w:noProof/>
+                <w:webHidden/>
+              </w:rPr>
+              <w:t>7</w:t>
+            </w:r>
+            <w:r>
+              <w:rPr>
+                <w:noProof/>
+                <w:webHidden/>
+              </w:rPr>
+              <w:fldChar w:fldCharType="end"/>
+            </w:r>
+          </w:hyperlink>
+        </w:p>
+        <w:p>
+          <w:pPr>
+            <w:pStyle w:val="TM2"/>
+            <w:tabs>
+              <w:tab w:val="right" w:leader="dot" w:pos="8630"/>
+            </w:tabs>
+            <w:rPr>
+              <w:rFonts w:asciiTheme="minorHAnsi" w:hAnsiTheme="minorHAnsi"/>
+              <w:noProof/>
+              <w:kern w:val="2"/>
+              <w:sz w:val="24"/>
+              <w:szCs w:val="24"/>
+              <w:lang w:val="fr-FR" w:eastAsia="fr-FR"/>
+              <w14:ligatures w14:val="standardContextual"/>
+            </w:rPr>
+          </w:pPr>
+          <w:hyperlink w:anchor="_Toc222346876" w:history="1">
+            <w:r>
+              <w:rPr>
+                <w:rStyle w:val="Lienhypertexte"/>
+                <w:noProof/>
+                <w:lang w:val="fr-FR"/>
+              </w:rPr>
+              <w:t>Protection CORS</w:t>
+            </w:r>
+            <w:r>
+              <w:rPr>
+                <w:noProof/>
+                <w:webHidden/>
+              </w:rPr>
+              <w:tab/>
+            </w:r>
+            <w:r>
+              <w:rPr>
+                <w:noProof/>
+                <w:webHidden/>
+              </w:rPr>
+              <w:fldChar w:fldCharType="begin"/>
+            </w:r>
+            <w:r>
+              <w:rPr>
+                <w:noProof/>
+                <w:webHidden/>
+              </w:rPr>
+              <w:instrText xml:space="preserve"> PAGEREF _Toc222346876 \h </w:instrText>
+            </w:r>
+            <w:r>
+              <w:rPr>
+                <w:noProof/>
+                <w:webHidden/>
+              </w:rPr>
+            </w:r>
+            <w:r>
+              <w:rPr>
+                <w:noProof/>
+                <w:webHidden/>
+              </w:rPr>
+              <w:fldChar w:fldCharType="separate"/>
+            </w:r>
+            <w:r>
+              <w:rPr>
+                <w:noProof/>
+                <w:webHidden/>
+              </w:rPr>
+              <w:t>7</w:t>
+            </w:r>
+            <w:r>
+              <w:rPr>
+                <w:noProof/>
+                <w:webHidden/>
+              </w:rPr>
+              <w:fldChar w:fldCharType="end"/>
+            </w:r>
+          </w:hyperlink>
+        </w:p>
+        <w:p>
+          <w:pPr>
+            <w:pStyle w:val="TM2"/>
+            <w:tabs>
+              <w:tab w:val="right" w:leader="dot" w:pos="8630"/>
+            </w:tabs>
+            <w:rPr>
+              <w:rFonts w:asciiTheme="minorHAnsi" w:hAnsiTheme="minorHAnsi"/>
+              <w:noProof/>
+              <w:kern w:val="2"/>
+              <w:sz w:val="24"/>
+              <w:szCs w:val="24"/>
+              <w:lang w:val="fr-FR" w:eastAsia="fr-FR"/>
+              <w14:ligatures w14:val="standardContextual"/>
+            </w:rPr>
+          </w:pPr>
+          <w:hyperlink w:anchor="_Toc222346877" w:history="1">
+            <w:r>
+              <w:rPr>
+                <w:rStyle w:val="Lienhypertexte"/>
+                <w:noProof/>
+                <w:lang w:val="fr-FR"/>
+              </w:rPr>
+              <w:t>Protection CSRF / XSS</w:t>
+            </w:r>
+            <w:r>
+              <w:rPr>
+                <w:noProof/>
+                <w:webHidden/>
+              </w:rPr>
+              <w:tab/>
+            </w:r>
+            <w:r>
+              <w:rPr>
+                <w:noProof/>
+                <w:webHidden/>
+              </w:rPr>
+              <w:fldChar w:fldCharType="begin"/>
+            </w:r>
+            <w:r>
+              <w:rPr>
+                <w:noProof/>
+                <w:webHidden/>
+              </w:rPr>
+              <w:instrText xml:space="preserve"> PAGEREF _Toc222346877 \h </w:instrText>
+            </w:r>
+            <w:r>
+              <w:rPr>
+                <w:noProof/>
+                <w:webHidden/>
+              </w:rPr>
+            </w:r>
+            <w:r>
+              <w:rPr>
+                <w:noProof/>
+                <w:webHidden/>
+              </w:rPr>
+              <w:fldChar w:fldCharType="separate"/>
+            </w:r>
+            <w:r>
+              <w:rPr>
+                <w:noProof/>
+                <w:webHidden/>
+              </w:rPr>
+              <w:t>7</w:t>
+            </w:r>
+            <w:r>
+              <w:rPr>
+                <w:noProof/>
+                <w:webHidden/>
+              </w:rPr>
+              <w:fldChar w:fldCharType="end"/>
+            </w:r>
+          </w:hyperlink>
+        </w:p>
+        <w:p>
+          <w:pPr>
+            <w:pStyle w:val="TM2"/>
+            <w:tabs>
+              <w:tab w:val="right" w:leader="dot" w:pos="8630"/>
+            </w:tabs>
+            <w:rPr>
+              <w:rFonts w:asciiTheme="minorHAnsi" w:hAnsiTheme="minorHAnsi"/>
+              <w:noProof/>
+              <w:kern w:val="2"/>
+              <w:sz w:val="24"/>
+              <w:szCs w:val="24"/>
+              <w:lang w:val="fr-FR" w:eastAsia="fr-FR"/>
+              <w14:ligatures w14:val="standardContextual"/>
+            </w:rPr>
+          </w:pPr>
+          <w:hyperlink w:anchor="_Toc222346878" w:history="1">
+            <w:r>
+              <w:rPr>
+                <w:rStyle w:val="Lienhypertexte"/>
+                <w:noProof/>
+                <w:lang w:val="fr-FR"/>
+              </w:rPr>
+              <w:t>RGPD – Bandeau cookies</w:t>
+            </w:r>
+            <w:r>
+              <w:rPr>
+                <w:noProof/>
+                <w:webHidden/>
+              </w:rPr>
+              <w:tab/>
+            </w:r>
+            <w:r>
+              <w:rPr>
+                <w:noProof/>
+                <w:webHidden/>
+              </w:rPr>
+              <w:fldChar w:fldCharType="begin"/>
+            </w:r>
+            <w:r>
+              <w:rPr>
+                <w:noProof/>
+                <w:webHidden/>
+              </w:rPr>
+              <w:instrText xml:space="preserve"> PAGEREF _Toc222346878 \h </w:instrText>
+            </w:r>
+            <w:r>
+              <w:rPr>
+                <w:noProof/>
+                <w:webHidden/>
+              </w:rPr>
+            </w:r>
+            <w:r>
+              <w:rPr>
+                <w:noProof/>
+                <w:webHidden/>
+              </w:rPr>
+              <w:fldChar w:fldCharType="separate"/>
+            </w:r>
+            <w:r>
+              <w:rPr>
+                <w:noProof/>
+                <w:webHidden/>
+              </w:rPr>
+              <w:t>7</w:t>
+            </w:r>
+            <w:r>
+              <w:rPr>
+                <w:noProof/>
+                <w:webHidden/>
+              </w:rPr>
+              <w:fldChar w:fldCharType="end"/>
+            </w:r>
+          </w:hyperlink>
+        </w:p>
+        <w:p>
+          <w:pPr>
+            <w:pStyle w:val="TM2"/>
+            <w:tabs>
+              <w:tab w:val="right" w:leader="dot" w:pos="8630"/>
+            </w:tabs>
+            <w:rPr>
+              <w:rFonts w:asciiTheme="minorHAnsi" w:hAnsiTheme="minorHAnsi"/>
+              <w:noProof/>
+              <w:kern w:val="2"/>
+              <w:sz w:val="24"/>
+              <w:szCs w:val="24"/>
+              <w:lang w:val="fr-FR" w:eastAsia="fr-FR"/>
+              <w14:ligatures w14:val="standardContextual"/>
+            </w:rPr>
+          </w:pPr>
+          <w:hyperlink w:anchor="_Toc222346879" w:history="1">
+            <w:r>
+              <w:rPr>
+                <w:rStyle w:val="Lienhypertexte"/>
+                <w:noProof/>
+                <w:lang w:val="fr-FR"/>
+              </w:rPr>
+              <w:t>Principe du moindre privilège</w:t>
+            </w:r>
+            <w:r>
+              <w:rPr>
+                <w:noProof/>
+                <w:webHidden/>
+              </w:rPr>
+              <w:tab/>
+            </w:r>
+            <w:r>
+              <w:rPr>
+                <w:noProof/>
+                <w:webHidden/>
+              </w:rPr>
+              <w:fldChar w:fldCharType="begin"/>
+            </w:r>
+            <w:r>
+              <w:rPr>
+                <w:noProof/>
+                <w:webHidden/>
+              </w:rPr>
+              <w:instrText xml:space="preserve"> PAGEREF _Toc222346879 \h </w:instrText>
+            </w:r>
+            <w:r>
+              <w:rPr>
+                <w:noProof/>
+                <w:webHidden/>
+              </w:rPr>
+            </w:r>
+            <w:r>
+              <w:rPr>
+                <w:noProof/>
+                <w:webHidden/>
+              </w:rPr>
+              <w:fldChar w:fldCharType="separate"/>
+            </w:r>
+            <w:r>
+              <w:rPr>
+                <w:noProof/>
+                <w:webHidden/>
+              </w:rPr>
+              <w:t>7</w:t>
             </w:r>
             <w:r>
               <w:rPr>
@@ -543,16 +1906,23 @@
               <w:tab w:val="right" w:leader="dot" w:pos="8630"/>
             </w:tabs>
             <w:rPr>
+              <w:rFonts w:asciiTheme="minorHAnsi" w:hAnsiTheme="minorHAnsi"/>
               <w:noProof/>
+              <w:kern w:val="2"/>
+              <w:sz w:val="24"/>
+              <w:szCs w:val="24"/>
+              <w:lang w:val="fr-FR" w:eastAsia="fr-FR"/>
+              <w14:ligatures w14:val="standardContextual"/>
             </w:rPr>
           </w:pPr>
-          <w:hyperlink w:anchor="_Toc222346643" w:history="1">
+          <w:hyperlink w:anchor="_Toc222346880" w:history="1">
             <w:r>
               <w:rPr>
                 <w:rStyle w:val="Lienhypertexte"/>
                 <w:noProof/>
-              </w:rPr>
-              <w:t>3. Choix techniques</w:t>
+                <w:lang w:val="fr-FR"/>
+              </w:rPr>
+              <w:t>5. Réponses aux User Stories</w:t>
             </w:r>
             <w:r>
               <w:rPr>
@@ -573,7 +1943,7 @@
                 <w:noProof/>
                 <w:webHidden/>
               </w:rPr>
-              <w:instrText xml:space="preserve"> PAGEREF _Toc222346643 \h </w:instrText>
+              <w:instrText xml:space="preserve"> PAGEREF _Toc222346880 \h </w:instrText>
             </w:r>
             <w:r>
               <w:rPr>
@@ -593,7 +1963,7 @@
                 <w:noProof/>
                 <w:webHidden/>
               </w:rPr>
-              <w:t>4</w:t>
+              <w:t>8</w:t>
             </w:r>
             <w:r>
               <w:rPr>
@@ -611,16 +1981,23 @@
               <w:tab w:val="right" w:leader="dot" w:pos="8630"/>
             </w:tabs>
             <w:rPr>
+              <w:rFonts w:asciiTheme="minorHAnsi" w:hAnsiTheme="minorHAnsi"/>
               <w:noProof/>
+              <w:kern w:val="2"/>
+              <w:sz w:val="24"/>
+              <w:szCs w:val="24"/>
+              <w:lang w:val="fr-FR" w:eastAsia="fr-FR"/>
+              <w14:ligatures w14:val="standardContextual"/>
             </w:rPr>
           </w:pPr>
-          <w:hyperlink w:anchor="_Toc222346644" w:history="1">
+          <w:hyperlink w:anchor="_Toc222346881" w:history="1">
             <w:r>
               <w:rPr>
                 <w:rStyle w:val="Lienhypertexte"/>
                 <w:noProof/>
-              </w:rPr>
-              <w:t>Stack technique retenue</w:t>
+                <w:lang w:val="fr-FR"/>
+              </w:rPr>
+              <w:t>US 1 – Page d'accueil</w:t>
             </w:r>
             <w:r>
               <w:rPr>
@@ -641,7 +2018,7 @@
                 <w:noProof/>
                 <w:webHidden/>
               </w:rPr>
-              <w:instrText xml:space="preserve"> PAGEREF _Toc222346644 \h </w:instrText>
+              <w:instrText xml:space="preserve"> PAGEREF _Toc222346881 \h </w:instrText>
             </w:r>
             <w:r>
               <w:rPr>
@@ -661,7 +2038,7 @@
                 <w:noProof/>
                 <w:webHidden/>
               </w:rPr>
-              <w:t>4</w:t>
+              <w:t>8</w:t>
             </w:r>
             <w:r>
               <w:rPr>
@@ -679,17 +2056,23 @@
               <w:tab w:val="right" w:leader="dot" w:pos="8630"/>
             </w:tabs>
             <w:rPr>
+              <w:rFonts w:asciiTheme="minorHAnsi" w:hAnsiTheme="minorHAnsi"/>
               <w:noProof/>
+              <w:kern w:val="2"/>
+              <w:sz w:val="24"/>
+              <w:szCs w:val="24"/>
+              <w:lang w:val="fr-FR" w:eastAsia="fr-FR"/>
+              <w14:ligatures w14:val="standardContextual"/>
             </w:rPr>
           </w:pPr>
-          <w:hyperlink w:anchor="_Toc222346645" w:history="1">
+          <w:hyperlink w:anchor="_Toc222346882" w:history="1">
             <w:r>
               <w:rPr>
                 <w:rStyle w:val="Lienhypertexte"/>
                 <w:noProof/>
                 <w:lang w:val="fr-FR"/>
               </w:rPr>
-              <w:t>Justification des choix</w:t>
+              <w:t>US 2 – Menu de l'application</w:t>
             </w:r>
             <w:r>
               <w:rPr>
@@ -710,7 +2093,7 @@
                 <w:noProof/>
                 <w:webHidden/>
               </w:rPr>
-              <w:instrText xml:space="preserve"> PAGEREF _Toc222346645 \h </w:instrText>
+              <w:instrText xml:space="preserve"> PAGEREF _Toc222346882 \h </w:instrText>
             </w:r>
             <w:r>
               <w:rPr>
@@ -730,7 +2113,7 @@
                 <w:noProof/>
                 <w:webHidden/>
               </w:rPr>
-              <w:t>5</w:t>
+              <w:t>8</w:t>
             </w:r>
             <w:r>
               <w:rPr>
@@ -743,22 +2126,28 @@
         </w:p>
         <w:p>
           <w:pPr>
-            <w:pStyle w:val="TM3"/>
+            <w:pStyle w:val="TM2"/>
             <w:tabs>
               <w:tab w:val="right" w:leader="dot" w:pos="8630"/>
             </w:tabs>
             <w:rPr>
+              <w:rFonts w:asciiTheme="minorHAnsi" w:hAnsiTheme="minorHAnsi"/>
               <w:noProof/>
+              <w:kern w:val="2"/>
+              <w:sz w:val="24"/>
+              <w:szCs w:val="24"/>
+              <w:lang w:val="fr-FR" w:eastAsia="fr-FR"/>
+              <w14:ligatures w14:val="standardContextual"/>
             </w:rPr>
           </w:pPr>
-          <w:hyperlink w:anchor="_Toc222346646" w:history="1">
+          <w:hyperlink w:anchor="_Toc222346883" w:history="1">
             <w:r>
               <w:rPr>
                 <w:rStyle w:val="Lienhypertexte"/>
                 <w:noProof/>
                 <w:lang w:val="fr-FR"/>
               </w:rPr>
-              <w:t>Angular 20</w:t>
+              <w:t>US 3 – Vue des covoiturages</w:t>
             </w:r>
             <w:r>
               <w:rPr>
@@ -779,7 +2168,7 @@
                 <w:noProof/>
                 <w:webHidden/>
               </w:rPr>
-              <w:instrText xml:space="preserve"> PAGEREF _Toc222346646 \h </w:instrText>
+              <w:instrText xml:space="preserve"> PAGEREF _Toc222346883 \h </w:instrText>
             </w:r>
             <w:r>
               <w:rPr>
@@ -799,7 +2188,7 @@
                 <w:noProof/>
                 <w:webHidden/>
               </w:rPr>
-              <w:t>5</w:t>
+              <w:t>8</w:t>
             </w:r>
             <w:r>
               <w:rPr>
@@ -812,22 +2201,28 @@
         </w:p>
         <w:p>
           <w:pPr>
-            <w:pStyle w:val="TM3"/>
+            <w:pStyle w:val="TM2"/>
             <w:tabs>
               <w:tab w:val="right" w:leader="dot" w:pos="8630"/>
             </w:tabs>
             <w:rPr>
+              <w:rFonts w:asciiTheme="minorHAnsi" w:hAnsiTheme="minorHAnsi"/>
               <w:noProof/>
+              <w:kern w:val="2"/>
+              <w:sz w:val="24"/>
+              <w:szCs w:val="24"/>
+              <w:lang w:val="fr-FR" w:eastAsia="fr-FR"/>
+              <w14:ligatures w14:val="standardContextual"/>
             </w:rPr>
           </w:pPr>
-          <w:hyperlink w:anchor="_Toc222346647" w:history="1">
+          <w:hyperlink w:anchor="_Toc222346884" w:history="1">
             <w:r>
               <w:rPr>
                 <w:rStyle w:val="Lienhypertexte"/>
                 <w:noProof/>
                 <w:lang w:val="fr-FR"/>
               </w:rPr>
-              <w:t>C# .NET 8 / ASP.NET Core</w:t>
+              <w:t>US 4 – Filtres des covoiturages</w:t>
             </w:r>
             <w:r>
               <w:rPr>
@@ -848,7 +2243,7 @@
                 <w:noProof/>
                 <w:webHidden/>
               </w:rPr>
-              <w:instrText xml:space="preserve"> PAGEREF _Toc222346647 \h </w:instrText>
+              <w:instrText xml:space="preserve"> PAGEREF _Toc222346884 \h </w:instrText>
             </w:r>
             <w:r>
               <w:rPr>
@@ -868,7 +2263,7 @@
                 <w:noProof/>
                 <w:webHidden/>
               </w:rPr>
-              <w:t>5</w:t>
+              <w:t>8</w:t>
             </w:r>
             <w:r>
               <w:rPr>
@@ -881,22 +2276,28 @@
         </w:p>
         <w:p>
           <w:pPr>
-            <w:pStyle w:val="TM3"/>
+            <w:pStyle w:val="TM2"/>
             <w:tabs>
               <w:tab w:val="right" w:leader="dot" w:pos="8630"/>
             </w:tabs>
             <w:rPr>
+              <w:rFonts w:asciiTheme="minorHAnsi" w:hAnsiTheme="minorHAnsi"/>
               <w:noProof/>
+              <w:kern w:val="2"/>
+              <w:sz w:val="24"/>
+              <w:szCs w:val="24"/>
+              <w:lang w:val="fr-FR" w:eastAsia="fr-FR"/>
+              <w14:ligatures w14:val="standardContextual"/>
             </w:rPr>
           </w:pPr>
-          <w:hyperlink w:anchor="_Toc222346648" w:history="1">
+          <w:hyperlink w:anchor="_Toc222346885" w:history="1">
             <w:r>
               <w:rPr>
                 <w:rStyle w:val="Lienhypertexte"/>
                 <w:noProof/>
                 <w:lang w:val="fr-FR"/>
               </w:rPr>
-              <w:t>PostgreSQL</w:t>
+              <w:t>US 5 – Vue détaillée d'un covoiturage</w:t>
             </w:r>
             <w:r>
               <w:rPr>
@@ -917,7 +2318,7 @@
                 <w:noProof/>
                 <w:webHidden/>
               </w:rPr>
-              <w:instrText xml:space="preserve"> PAGEREF _Toc222346648 \h </w:instrText>
+              <w:instrText xml:space="preserve"> PAGEREF _Toc222346885 \h </w:instrText>
             </w:r>
             <w:r>
               <w:rPr>
@@ -937,7 +2338,7 @@
                 <w:noProof/>
                 <w:webHidden/>
               </w:rPr>
-              <w:t>5</w:t>
+              <w:t>9</w:t>
             </w:r>
             <w:r>
               <w:rPr>
@@ -950,22 +2351,28 @@
         </w:p>
         <w:p>
           <w:pPr>
-            <w:pStyle w:val="TM3"/>
+            <w:pStyle w:val="TM2"/>
             <w:tabs>
               <w:tab w:val="right" w:leader="dot" w:pos="8630"/>
             </w:tabs>
             <w:rPr>
+              <w:rFonts w:asciiTheme="minorHAnsi" w:hAnsiTheme="minorHAnsi"/>
               <w:noProof/>
+              <w:kern w:val="2"/>
+              <w:sz w:val="24"/>
+              <w:szCs w:val="24"/>
+              <w:lang w:val="fr-FR" w:eastAsia="fr-FR"/>
+              <w14:ligatures w14:val="standardContextual"/>
             </w:rPr>
           </w:pPr>
-          <w:hyperlink w:anchor="_Toc222346649" w:history="1">
+          <w:hyperlink w:anchor="_Toc222346886" w:history="1">
             <w:r>
               <w:rPr>
                 <w:rStyle w:val="Lienhypertexte"/>
                 <w:noProof/>
                 <w:lang w:val="fr-FR"/>
               </w:rPr>
-              <w:t>MongoDB</w:t>
+              <w:t>US 6 – Participer à un covoiturage</w:t>
             </w:r>
             <w:r>
               <w:rPr>
@@ -986,7 +2393,7 @@
                 <w:noProof/>
                 <w:webHidden/>
               </w:rPr>
-              <w:instrText xml:space="preserve"> PAGEREF _Toc222346649 \h </w:instrText>
+              <w:instrText xml:space="preserve"> PAGEREF _Toc222346886 \h </w:instrText>
             </w:r>
             <w:r>
               <w:rPr>
@@ -1006,7 +2413,7 @@
                 <w:noProof/>
                 <w:webHidden/>
               </w:rPr>
-              <w:t>5</w:t>
+              <w:t>9</w:t>
             </w:r>
             <w:r>
               <w:rPr>
@@ -1019,22 +2426,28 @@
         </w:p>
         <w:p>
           <w:pPr>
-            <w:pStyle w:val="TM3"/>
+            <w:pStyle w:val="TM2"/>
             <w:tabs>
               <w:tab w:val="right" w:leader="dot" w:pos="8630"/>
             </w:tabs>
             <w:rPr>
+              <w:rFonts w:asciiTheme="minorHAnsi" w:hAnsiTheme="minorHAnsi"/>
               <w:noProof/>
+              <w:kern w:val="2"/>
+              <w:sz w:val="24"/>
+              <w:szCs w:val="24"/>
+              <w:lang w:val="fr-FR" w:eastAsia="fr-FR"/>
+              <w14:ligatures w14:val="standardContextual"/>
             </w:rPr>
           </w:pPr>
-          <w:hyperlink w:anchor="_Toc222346650" w:history="1">
+          <w:hyperlink w:anchor="_Toc222346887" w:history="1">
             <w:r>
               <w:rPr>
                 <w:rStyle w:val="Lienhypertexte"/>
                 <w:noProof/>
                 <w:lang w:val="fr-FR"/>
               </w:rPr>
-              <w:t>Internationalisation (ngx-translate)</w:t>
+              <w:t>US 7 – Création de compte</w:t>
             </w:r>
             <w:r>
               <w:rPr>
@@ -1055,7 +2468,7 @@
                 <w:noProof/>
                 <w:webHidden/>
               </w:rPr>
-              <w:instrText xml:space="preserve"> PAGEREF _Toc222346650 \h </w:instrText>
+              <w:instrText xml:space="preserve"> PAGEREF _Toc222346887 \h </w:instrText>
             </w:r>
             <w:r>
               <w:rPr>
@@ -1075,7 +2488,457 @@
                 <w:noProof/>
                 <w:webHidden/>
               </w:rPr>
-              <w:t>5</w:t>
+              <w:t>9</w:t>
+            </w:r>
+            <w:r>
+              <w:rPr>
+                <w:noProof/>
+                <w:webHidden/>
+              </w:rPr>
+              <w:fldChar w:fldCharType="end"/>
+            </w:r>
+          </w:hyperlink>
+        </w:p>
+        <w:p>
+          <w:pPr>
+            <w:pStyle w:val="TM2"/>
+            <w:tabs>
+              <w:tab w:val="right" w:leader="dot" w:pos="8630"/>
+            </w:tabs>
+            <w:rPr>
+              <w:rFonts w:asciiTheme="minorHAnsi" w:hAnsiTheme="minorHAnsi"/>
+              <w:noProof/>
+              <w:kern w:val="2"/>
+              <w:sz w:val="24"/>
+              <w:szCs w:val="24"/>
+              <w:lang w:val="fr-FR" w:eastAsia="fr-FR"/>
+              <w14:ligatures w14:val="standardContextual"/>
+            </w:rPr>
+          </w:pPr>
+          <w:hyperlink w:anchor="_Toc222346888" w:history="1">
+            <w:r>
+              <w:rPr>
+                <w:rStyle w:val="Lienhypertexte"/>
+                <w:noProof/>
+                <w:lang w:val="fr-FR"/>
+              </w:rPr>
+              <w:t>US 8 – Espace Utilisateur</w:t>
+            </w:r>
+            <w:r>
+              <w:rPr>
+                <w:noProof/>
+                <w:webHidden/>
+              </w:rPr>
+              <w:tab/>
+            </w:r>
+            <w:r>
+              <w:rPr>
+                <w:noProof/>
+                <w:webHidden/>
+              </w:rPr>
+              <w:fldChar w:fldCharType="begin"/>
+            </w:r>
+            <w:r>
+              <w:rPr>
+                <w:noProof/>
+                <w:webHidden/>
+              </w:rPr>
+              <w:instrText xml:space="preserve"> PAGEREF _Toc222346888 \h </w:instrText>
+            </w:r>
+            <w:r>
+              <w:rPr>
+                <w:noProof/>
+                <w:webHidden/>
+              </w:rPr>
+            </w:r>
+            <w:r>
+              <w:rPr>
+                <w:noProof/>
+                <w:webHidden/>
+              </w:rPr>
+              <w:fldChar w:fldCharType="separate"/>
+            </w:r>
+            <w:r>
+              <w:rPr>
+                <w:noProof/>
+                <w:webHidden/>
+              </w:rPr>
+              <w:t>10</w:t>
+            </w:r>
+            <w:r>
+              <w:rPr>
+                <w:noProof/>
+                <w:webHidden/>
+              </w:rPr>
+              <w:fldChar w:fldCharType="end"/>
+            </w:r>
+          </w:hyperlink>
+        </w:p>
+        <w:p>
+          <w:pPr>
+            <w:pStyle w:val="TM2"/>
+            <w:tabs>
+              <w:tab w:val="right" w:leader="dot" w:pos="8630"/>
+            </w:tabs>
+            <w:rPr>
+              <w:rFonts w:asciiTheme="minorHAnsi" w:hAnsiTheme="minorHAnsi"/>
+              <w:noProof/>
+              <w:kern w:val="2"/>
+              <w:sz w:val="24"/>
+              <w:szCs w:val="24"/>
+              <w:lang w:val="fr-FR" w:eastAsia="fr-FR"/>
+              <w14:ligatures w14:val="standardContextual"/>
+            </w:rPr>
+          </w:pPr>
+          <w:hyperlink w:anchor="_Toc222346889" w:history="1">
+            <w:r>
+              <w:rPr>
+                <w:rStyle w:val="Lienhypertexte"/>
+                <w:noProof/>
+                <w:lang w:val="fr-FR"/>
+              </w:rPr>
+              <w:t>US 9 – Saisir un voyage</w:t>
+            </w:r>
+            <w:r>
+              <w:rPr>
+                <w:noProof/>
+                <w:webHidden/>
+              </w:rPr>
+              <w:tab/>
+            </w:r>
+            <w:r>
+              <w:rPr>
+                <w:noProof/>
+                <w:webHidden/>
+              </w:rPr>
+              <w:fldChar w:fldCharType="begin"/>
+            </w:r>
+            <w:r>
+              <w:rPr>
+                <w:noProof/>
+                <w:webHidden/>
+              </w:rPr>
+              <w:instrText xml:space="preserve"> PAGEREF _Toc222346889 \h </w:instrText>
+            </w:r>
+            <w:r>
+              <w:rPr>
+                <w:noProof/>
+                <w:webHidden/>
+              </w:rPr>
+            </w:r>
+            <w:r>
+              <w:rPr>
+                <w:noProof/>
+                <w:webHidden/>
+              </w:rPr>
+              <w:fldChar w:fldCharType="separate"/>
+            </w:r>
+            <w:r>
+              <w:rPr>
+                <w:noProof/>
+                <w:webHidden/>
+              </w:rPr>
+              <w:t>10</w:t>
+            </w:r>
+            <w:r>
+              <w:rPr>
+                <w:noProof/>
+                <w:webHidden/>
+              </w:rPr>
+              <w:fldChar w:fldCharType="end"/>
+            </w:r>
+          </w:hyperlink>
+        </w:p>
+        <w:p>
+          <w:pPr>
+            <w:pStyle w:val="TM2"/>
+            <w:tabs>
+              <w:tab w:val="right" w:leader="dot" w:pos="8630"/>
+            </w:tabs>
+            <w:rPr>
+              <w:rFonts w:asciiTheme="minorHAnsi" w:hAnsiTheme="minorHAnsi"/>
+              <w:noProof/>
+              <w:kern w:val="2"/>
+              <w:sz w:val="24"/>
+              <w:szCs w:val="24"/>
+              <w:lang w:val="fr-FR" w:eastAsia="fr-FR"/>
+              <w14:ligatures w14:val="standardContextual"/>
+            </w:rPr>
+          </w:pPr>
+          <w:hyperlink w:anchor="_Toc222346890" w:history="1">
+            <w:r>
+              <w:rPr>
+                <w:rStyle w:val="Lienhypertexte"/>
+                <w:noProof/>
+                <w:lang w:val="fr-FR"/>
+              </w:rPr>
+              <w:t>US 10 – Historique des covoiturages</w:t>
+            </w:r>
+            <w:r>
+              <w:rPr>
+                <w:noProof/>
+                <w:webHidden/>
+              </w:rPr>
+              <w:tab/>
+            </w:r>
+            <w:r>
+              <w:rPr>
+                <w:noProof/>
+                <w:webHidden/>
+              </w:rPr>
+              <w:fldChar w:fldCharType="begin"/>
+            </w:r>
+            <w:r>
+              <w:rPr>
+                <w:noProof/>
+                <w:webHidden/>
+              </w:rPr>
+              <w:instrText xml:space="preserve"> PAGEREF _Toc222346890 \h </w:instrText>
+            </w:r>
+            <w:r>
+              <w:rPr>
+                <w:noProof/>
+                <w:webHidden/>
+              </w:rPr>
+            </w:r>
+            <w:r>
+              <w:rPr>
+                <w:noProof/>
+                <w:webHidden/>
+              </w:rPr>
+              <w:fldChar w:fldCharType="separate"/>
+            </w:r>
+            <w:r>
+              <w:rPr>
+                <w:noProof/>
+                <w:webHidden/>
+              </w:rPr>
+              <w:t>10</w:t>
+            </w:r>
+            <w:r>
+              <w:rPr>
+                <w:noProof/>
+                <w:webHidden/>
+              </w:rPr>
+              <w:fldChar w:fldCharType="end"/>
+            </w:r>
+          </w:hyperlink>
+        </w:p>
+        <w:p>
+          <w:pPr>
+            <w:pStyle w:val="TM2"/>
+            <w:tabs>
+              <w:tab w:val="right" w:leader="dot" w:pos="8630"/>
+            </w:tabs>
+            <w:rPr>
+              <w:rFonts w:asciiTheme="minorHAnsi" w:hAnsiTheme="minorHAnsi"/>
+              <w:noProof/>
+              <w:kern w:val="2"/>
+              <w:sz w:val="24"/>
+              <w:szCs w:val="24"/>
+              <w:lang w:val="fr-FR" w:eastAsia="fr-FR"/>
+              <w14:ligatures w14:val="standardContextual"/>
+            </w:rPr>
+          </w:pPr>
+          <w:hyperlink w:anchor="_Toc222346891" w:history="1">
+            <w:r>
+              <w:rPr>
+                <w:rStyle w:val="Lienhypertexte"/>
+                <w:noProof/>
+                <w:lang w:val="fr-FR"/>
+              </w:rPr>
+              <w:t>US 11 – Démarrer et arrêter un covoiturage</w:t>
+            </w:r>
+            <w:r>
+              <w:rPr>
+                <w:noProof/>
+                <w:webHidden/>
+              </w:rPr>
+              <w:tab/>
+            </w:r>
+            <w:r>
+              <w:rPr>
+                <w:noProof/>
+                <w:webHidden/>
+              </w:rPr>
+              <w:fldChar w:fldCharType="begin"/>
+            </w:r>
+            <w:r>
+              <w:rPr>
+                <w:noProof/>
+                <w:webHidden/>
+              </w:rPr>
+              <w:instrText xml:space="preserve"> PAGEREF _Toc222346891 \h </w:instrText>
+            </w:r>
+            <w:r>
+              <w:rPr>
+                <w:noProof/>
+                <w:webHidden/>
+              </w:rPr>
+            </w:r>
+            <w:r>
+              <w:rPr>
+                <w:noProof/>
+                <w:webHidden/>
+              </w:rPr>
+              <w:fldChar w:fldCharType="separate"/>
+            </w:r>
+            <w:r>
+              <w:rPr>
+                <w:noProof/>
+                <w:webHidden/>
+              </w:rPr>
+              <w:t>11</w:t>
+            </w:r>
+            <w:r>
+              <w:rPr>
+                <w:noProof/>
+                <w:webHidden/>
+              </w:rPr>
+              <w:fldChar w:fldCharType="end"/>
+            </w:r>
+          </w:hyperlink>
+        </w:p>
+        <w:p>
+          <w:pPr>
+            <w:pStyle w:val="TM2"/>
+            <w:tabs>
+              <w:tab w:val="right" w:leader="dot" w:pos="8630"/>
+            </w:tabs>
+            <w:rPr>
+              <w:rFonts w:asciiTheme="minorHAnsi" w:hAnsiTheme="minorHAnsi"/>
+              <w:noProof/>
+              <w:kern w:val="2"/>
+              <w:sz w:val="24"/>
+              <w:szCs w:val="24"/>
+              <w:lang w:val="fr-FR" w:eastAsia="fr-FR"/>
+              <w14:ligatures w14:val="standardContextual"/>
+            </w:rPr>
+          </w:pPr>
+          <w:hyperlink w:anchor="_Toc222346892" w:history="1">
+            <w:r>
+              <w:rPr>
+                <w:rStyle w:val="Lienhypertexte"/>
+                <w:noProof/>
+                <w:lang w:val="fr-FR"/>
+              </w:rPr>
+              <w:t>US 12 – Espace employé</w:t>
+            </w:r>
+            <w:r>
+              <w:rPr>
+                <w:noProof/>
+                <w:webHidden/>
+              </w:rPr>
+              <w:tab/>
+            </w:r>
+            <w:r>
+              <w:rPr>
+                <w:noProof/>
+                <w:webHidden/>
+              </w:rPr>
+              <w:fldChar w:fldCharType="begin"/>
+            </w:r>
+            <w:r>
+              <w:rPr>
+                <w:noProof/>
+                <w:webHidden/>
+              </w:rPr>
+              <w:instrText xml:space="preserve"> PAGEREF _Toc222346892 \h </w:instrText>
+            </w:r>
+            <w:r>
+              <w:rPr>
+                <w:noProof/>
+                <w:webHidden/>
+              </w:rPr>
+            </w:r>
+            <w:r>
+              <w:rPr>
+                <w:noProof/>
+                <w:webHidden/>
+              </w:rPr>
+              <w:fldChar w:fldCharType="separate"/>
+            </w:r>
+            <w:r>
+              <w:rPr>
+                <w:noProof/>
+                <w:webHidden/>
+              </w:rPr>
+              <w:t>11</w:t>
+            </w:r>
+            <w:r>
+              <w:rPr>
+                <w:noProof/>
+                <w:webHidden/>
+              </w:rPr>
+              <w:fldChar w:fldCharType="end"/>
+            </w:r>
+          </w:hyperlink>
+        </w:p>
+        <w:p>
+          <w:pPr>
+            <w:pStyle w:val="TM2"/>
+            <w:tabs>
+              <w:tab w:val="right" w:leader="dot" w:pos="8630"/>
+            </w:tabs>
+            <w:rPr>
+              <w:rFonts w:asciiTheme="minorHAnsi" w:hAnsiTheme="minorHAnsi"/>
+              <w:noProof/>
+              <w:kern w:val="2"/>
+              <w:sz w:val="24"/>
+              <w:szCs w:val="24"/>
+              <w:lang w:val="fr-FR" w:eastAsia="fr-FR"/>
+              <w14:ligatures w14:val="standardContextual"/>
+            </w:rPr>
+          </w:pPr>
+          <w:hyperlink w:anchor="_Toc222346893" w:history="1">
+            <w:r>
+              <w:rPr>
+                <w:rStyle w:val="Lienhypertexte"/>
+                <w:noProof/>
+                <w:lang w:val="fr-FR"/>
+              </w:rPr>
+              <w:t>US 13 – Espace administrateur</w:t>
+            </w:r>
+            <w:r>
+              <w:rPr>
+                <w:noProof/>
+                <w:webHidden/>
+              </w:rPr>
+              <w:tab/>
+            </w:r>
+            <w:r>
+              <w:rPr>
+                <w:noProof/>
+                <w:webHidden/>
+              </w:rPr>
+              <w:fldChar w:fldCharType="begin"/>
+            </w:r>
+            <w:r>
+              <w:rPr>
+                <w:noProof/>
+                <w:webHidden/>
+              </w:rPr>
+              <w:instrText xml:space="preserve"> PAGEREF _Toc222346893 \h </w:instrText>
+            </w:r>
+            <w:r>
+              <w:rPr>
+                <w:noProof/>
+                <w:webHidden/>
+              </w:rPr>
+            </w:r>
+            <w:r>
+              <w:rPr>
+                <w:noProof/>
+                <w:webHidden/>
+              </w:rPr>
+              <w:fldChar w:fldCharType="separate"/>
+            </w:r>
+            <w:r>
+              <w:rPr>
+                <w:noProof/>
+                <w:webHidden/>
+              </w:rPr>
+              <w:t>11</w:t>
             </w:r>
             <w:r>
               <w:rPr>
@@ -1093,17 +2956,23 @@
               <w:tab w:val="right" w:leader="dot" w:pos="8630"/>
             </w:tabs>
             <w:rPr>
+              <w:rFonts w:asciiTheme="minorHAnsi" w:hAnsiTheme="minorHAnsi"/>
               <w:noProof/>
+              <w:kern w:val="2"/>
+              <w:sz w:val="24"/>
+              <w:szCs w:val="24"/>
+              <w:lang w:val="fr-FR" w:eastAsia="fr-FR"/>
+              <w14:ligatures w14:val="standardContextual"/>
             </w:rPr>
           </w:pPr>
-          <w:hyperlink w:anchor="_Toc222346651" w:history="1">
+          <w:hyperlink w:anchor="_Toc222346894" w:history="1">
             <w:r>
               <w:rPr>
                 <w:rStyle w:val="Lienhypertexte"/>
                 <w:noProof/>
                 <w:lang w:val="fr-FR"/>
               </w:rPr>
-              <w:t>4. Dispositions de sécurité</w:t>
+              <w:t>6. Conclusion</w:t>
             </w:r>
             <w:r>
               <w:rPr>
@@ -1124,7 +2993,7 @@
                 <w:noProof/>
                 <w:webHidden/>
               </w:rPr>
-              <w:instrText xml:space="preserve"> PAGEREF _Toc222346651 \h </w:instrText>
+              <w:instrText xml:space="preserve"> PAGEREF _Toc222346894 \h </w:instrText>
             </w:r>
             <w:r>
               <w:rPr>
@@ -1144,1663 +3013,7 @@
                 <w:noProof/>
                 <w:webHidden/>
               </w:rPr>
-              <w:t>6</w:t>
-            </w:r>
-            <w:r>
-              <w:rPr>
-                <w:noProof/>
-                <w:webHidden/>
-              </w:rPr>
-              <w:fldChar w:fldCharType="end"/>
-            </w:r>
-          </w:hyperlink>
-        </w:p>
-        <w:p>
-          <w:pPr>
-            <w:pStyle w:val="TM2"/>
-            <w:tabs>
-              <w:tab w:val="right" w:leader="dot" w:pos="8630"/>
-            </w:tabs>
-            <w:rPr>
-              <w:noProof/>
-            </w:rPr>
-          </w:pPr>
-          <w:hyperlink w:anchor="_Toc222346652" w:history="1">
-            <w:r>
-              <w:rPr>
-                <w:rStyle w:val="Lienhypertexte"/>
-                <w:noProof/>
-                <w:lang w:val="fr-FR"/>
-              </w:rPr>
-              <w:t>Authentification JWT</w:t>
-            </w:r>
-            <w:r>
-              <w:rPr>
-                <w:noProof/>
-                <w:webHidden/>
-              </w:rPr>
-              <w:tab/>
-            </w:r>
-            <w:r>
-              <w:rPr>
-                <w:noProof/>
-                <w:webHidden/>
-              </w:rPr>
-              <w:fldChar w:fldCharType="begin"/>
-            </w:r>
-            <w:r>
-              <w:rPr>
-                <w:noProof/>
-                <w:webHidden/>
-              </w:rPr>
-              <w:instrText xml:space="preserve"> PAGEREF _Toc222346652 \h </w:instrText>
-            </w:r>
-            <w:r>
-              <w:rPr>
-                <w:noProof/>
-                <w:webHidden/>
-              </w:rPr>
-            </w:r>
-            <w:r>
-              <w:rPr>
-                <w:noProof/>
-                <w:webHidden/>
-              </w:rPr>
-              <w:fldChar w:fldCharType="separate"/>
-            </w:r>
-            <w:r>
-              <w:rPr>
-                <w:noProof/>
-                <w:webHidden/>
-              </w:rPr>
-              <w:t>6</w:t>
-            </w:r>
-            <w:r>
-              <w:rPr>
-                <w:noProof/>
-                <w:webHidden/>
-              </w:rPr>
-              <w:fldChar w:fldCharType="end"/>
-            </w:r>
-          </w:hyperlink>
-        </w:p>
-        <w:p>
-          <w:pPr>
-            <w:pStyle w:val="TM2"/>
-            <w:tabs>
-              <w:tab w:val="right" w:leader="dot" w:pos="8630"/>
-            </w:tabs>
-            <w:rPr>
-              <w:noProof/>
-            </w:rPr>
-          </w:pPr>
-          <w:hyperlink w:anchor="_Toc222346653" w:history="1">
-            <w:r>
-              <w:rPr>
-                <w:rStyle w:val="Lienhypertexte"/>
-                <w:noProof/>
-                <w:lang w:val="fr-FR"/>
-              </w:rPr>
-              <w:t>Hachage des mots de passe</w:t>
-            </w:r>
-            <w:r>
-              <w:rPr>
-                <w:noProof/>
-                <w:webHidden/>
-              </w:rPr>
-              <w:tab/>
-            </w:r>
-            <w:r>
-              <w:rPr>
-                <w:noProof/>
-                <w:webHidden/>
-              </w:rPr>
-              <w:fldChar w:fldCharType="begin"/>
-            </w:r>
-            <w:r>
-              <w:rPr>
-                <w:noProof/>
-                <w:webHidden/>
-              </w:rPr>
-              <w:instrText xml:space="preserve"> PAGEREF _Toc222346653 \h </w:instrText>
-            </w:r>
-            <w:r>
-              <w:rPr>
-                <w:noProof/>
-                <w:webHidden/>
-              </w:rPr>
-            </w:r>
-            <w:r>
-              <w:rPr>
-                <w:noProof/>
-                <w:webHidden/>
-              </w:rPr>
-              <w:fldChar w:fldCharType="separate"/>
-            </w:r>
-            <w:r>
-              <w:rPr>
-                <w:noProof/>
-                <w:webHidden/>
-              </w:rPr>
-              <w:t>6</w:t>
-            </w:r>
-            <w:r>
-              <w:rPr>
-                <w:noProof/>
-                <w:webHidden/>
-              </w:rPr>
-              <w:fldChar w:fldCharType="end"/>
-            </w:r>
-          </w:hyperlink>
-        </w:p>
-        <w:p>
-          <w:pPr>
-            <w:pStyle w:val="TM2"/>
-            <w:tabs>
-              <w:tab w:val="right" w:leader="dot" w:pos="8630"/>
-            </w:tabs>
-            <w:rPr>
-              <w:noProof/>
-            </w:rPr>
-          </w:pPr>
-          <w:hyperlink w:anchor="_Toc222346654" w:history="1">
-            <w:r>
-              <w:rPr>
-                <w:rStyle w:val="Lienhypertexte"/>
-                <w:noProof/>
-                <w:lang w:val="fr-FR"/>
-              </w:rPr>
-              <w:t>Validation des mots de passe</w:t>
-            </w:r>
-            <w:r>
-              <w:rPr>
-                <w:noProof/>
-                <w:webHidden/>
-              </w:rPr>
-              <w:tab/>
-            </w:r>
-            <w:r>
-              <w:rPr>
-                <w:noProof/>
-                <w:webHidden/>
-              </w:rPr>
-              <w:fldChar w:fldCharType="begin"/>
-            </w:r>
-            <w:r>
-              <w:rPr>
-                <w:noProof/>
-                <w:webHidden/>
-              </w:rPr>
-              <w:instrText xml:space="preserve"> PAGEREF _Toc222346654 \h </w:instrText>
-            </w:r>
-            <w:r>
-              <w:rPr>
-                <w:noProof/>
-                <w:webHidden/>
-              </w:rPr>
-            </w:r>
-            <w:r>
-              <w:rPr>
-                <w:noProof/>
-                <w:webHidden/>
-              </w:rPr>
-              <w:fldChar w:fldCharType="separate"/>
-            </w:r>
-            <w:r>
-              <w:rPr>
-                <w:noProof/>
-                <w:webHidden/>
-              </w:rPr>
-              <w:t>6</w:t>
-            </w:r>
-            <w:r>
-              <w:rPr>
-                <w:noProof/>
-                <w:webHidden/>
-              </w:rPr>
-              <w:fldChar w:fldCharType="end"/>
-            </w:r>
-          </w:hyperlink>
-        </w:p>
-        <w:p>
-          <w:pPr>
-            <w:pStyle w:val="TM2"/>
-            <w:tabs>
-              <w:tab w:val="right" w:leader="dot" w:pos="8630"/>
-            </w:tabs>
-            <w:rPr>
-              <w:noProof/>
-            </w:rPr>
-          </w:pPr>
-          <w:hyperlink w:anchor="_Toc222346655" w:history="1">
-            <w:r>
-              <w:rPr>
-                <w:rStyle w:val="Lienhypertexte"/>
-                <w:noProof/>
-                <w:lang w:val="fr-FR"/>
-              </w:rPr>
-              <w:t>Autorisation par rôles</w:t>
-            </w:r>
-            <w:r>
-              <w:rPr>
-                <w:noProof/>
-                <w:webHidden/>
-              </w:rPr>
-              <w:tab/>
-            </w:r>
-            <w:r>
-              <w:rPr>
-                <w:noProof/>
-                <w:webHidden/>
-              </w:rPr>
-              <w:fldChar w:fldCharType="begin"/>
-            </w:r>
-            <w:r>
-              <w:rPr>
-                <w:noProof/>
-                <w:webHidden/>
-              </w:rPr>
-              <w:instrText xml:space="preserve"> PAGEREF _Toc222346655 \h </w:instrText>
-            </w:r>
-            <w:r>
-              <w:rPr>
-                <w:noProof/>
-                <w:webHidden/>
-              </w:rPr>
-            </w:r>
-            <w:r>
-              <w:rPr>
-                <w:noProof/>
-                <w:webHidden/>
-              </w:rPr>
-              <w:fldChar w:fldCharType="separate"/>
-            </w:r>
-            <w:r>
-              <w:rPr>
-                <w:noProof/>
-                <w:webHidden/>
-              </w:rPr>
-              <w:t>6</w:t>
-            </w:r>
-            <w:r>
-              <w:rPr>
-                <w:noProof/>
-                <w:webHidden/>
-              </w:rPr>
-              <w:fldChar w:fldCharType="end"/>
-            </w:r>
-          </w:hyperlink>
-        </w:p>
-        <w:p>
-          <w:pPr>
-            <w:pStyle w:val="TM2"/>
-            <w:tabs>
-              <w:tab w:val="right" w:leader="dot" w:pos="8630"/>
-            </w:tabs>
-            <w:rPr>
-              <w:noProof/>
-            </w:rPr>
-          </w:pPr>
-          <w:hyperlink w:anchor="_Toc222346656" w:history="1">
-            <w:r>
-              <w:rPr>
-                <w:rStyle w:val="Lienhypertexte"/>
-                <w:noProof/>
-                <w:lang w:val="fr-FR"/>
-              </w:rPr>
-              <w:t>Validation des entrées</w:t>
-            </w:r>
-            <w:r>
-              <w:rPr>
-                <w:noProof/>
-                <w:webHidden/>
-              </w:rPr>
-              <w:tab/>
-            </w:r>
-            <w:r>
-              <w:rPr>
-                <w:noProof/>
-                <w:webHidden/>
-              </w:rPr>
-              <w:fldChar w:fldCharType="begin"/>
-            </w:r>
-            <w:r>
-              <w:rPr>
-                <w:noProof/>
-                <w:webHidden/>
-              </w:rPr>
-              <w:instrText xml:space="preserve"> PAGEREF _Toc222346656 \h </w:instrText>
-            </w:r>
-            <w:r>
-              <w:rPr>
-                <w:noProof/>
-                <w:webHidden/>
-              </w:rPr>
-            </w:r>
-            <w:r>
-              <w:rPr>
-                <w:noProof/>
-                <w:webHidden/>
-              </w:rPr>
-              <w:fldChar w:fldCharType="separate"/>
-            </w:r>
-            <w:r>
-              <w:rPr>
-                <w:noProof/>
-                <w:webHidden/>
-              </w:rPr>
-              <w:t>6</w:t>
-            </w:r>
-            <w:r>
-              <w:rPr>
-                <w:noProof/>
-                <w:webHidden/>
-              </w:rPr>
-              <w:fldChar w:fldCharType="end"/>
-            </w:r>
-          </w:hyperlink>
-        </w:p>
-        <w:p>
-          <w:pPr>
-            <w:pStyle w:val="TM2"/>
-            <w:tabs>
-              <w:tab w:val="right" w:leader="dot" w:pos="8630"/>
-            </w:tabs>
-            <w:rPr>
-              <w:noProof/>
-            </w:rPr>
-          </w:pPr>
-          <w:hyperlink w:anchor="_Toc222346657" w:history="1">
-            <w:r>
-              <w:rPr>
-                <w:rStyle w:val="Lienhypertexte"/>
-                <w:noProof/>
-                <w:lang w:val="fr-FR"/>
-              </w:rPr>
-              <w:t>Protection CORS</w:t>
-            </w:r>
-            <w:r>
-              <w:rPr>
-                <w:noProof/>
-                <w:webHidden/>
-              </w:rPr>
-              <w:tab/>
-            </w:r>
-            <w:r>
-              <w:rPr>
-                <w:noProof/>
-                <w:webHidden/>
-              </w:rPr>
-              <w:fldChar w:fldCharType="begin"/>
-            </w:r>
-            <w:r>
-              <w:rPr>
-                <w:noProof/>
-                <w:webHidden/>
-              </w:rPr>
-              <w:instrText xml:space="preserve"> PAGEREF _Toc222346657 \h </w:instrText>
-            </w:r>
-            <w:r>
-              <w:rPr>
-                <w:noProof/>
-                <w:webHidden/>
-              </w:rPr>
-            </w:r>
-            <w:r>
-              <w:rPr>
-                <w:noProof/>
-                <w:webHidden/>
-              </w:rPr>
-              <w:fldChar w:fldCharType="separate"/>
-            </w:r>
-            <w:r>
-              <w:rPr>
-                <w:noProof/>
-                <w:webHidden/>
-              </w:rPr>
-              <w:t>6</w:t>
-            </w:r>
-            <w:r>
-              <w:rPr>
-                <w:noProof/>
-                <w:webHidden/>
-              </w:rPr>
-              <w:fldChar w:fldCharType="end"/>
-            </w:r>
-          </w:hyperlink>
-        </w:p>
-        <w:p>
-          <w:pPr>
-            <w:pStyle w:val="TM2"/>
-            <w:tabs>
-              <w:tab w:val="right" w:leader="dot" w:pos="8630"/>
-            </w:tabs>
-            <w:rPr>
-              <w:noProof/>
-            </w:rPr>
-          </w:pPr>
-          <w:hyperlink w:anchor="_Toc222346658" w:history="1">
-            <w:r>
-              <w:rPr>
-                <w:rStyle w:val="Lienhypertexte"/>
-                <w:noProof/>
-                <w:lang w:val="fr-FR"/>
-              </w:rPr>
-              <w:t>Protection CSRF / XSS</w:t>
-            </w:r>
-            <w:r>
-              <w:rPr>
-                <w:noProof/>
-                <w:webHidden/>
-              </w:rPr>
-              <w:tab/>
-            </w:r>
-            <w:r>
-              <w:rPr>
-                <w:noProof/>
-                <w:webHidden/>
-              </w:rPr>
-              <w:fldChar w:fldCharType="begin"/>
-            </w:r>
-            <w:r>
-              <w:rPr>
-                <w:noProof/>
-                <w:webHidden/>
-              </w:rPr>
-              <w:instrText xml:space="preserve"> PAGEREF _Toc222346658 \h </w:instrText>
-            </w:r>
-            <w:r>
-              <w:rPr>
-                <w:noProof/>
-                <w:webHidden/>
-              </w:rPr>
-            </w:r>
-            <w:r>
-              <w:rPr>
-                <w:noProof/>
-                <w:webHidden/>
-              </w:rPr>
-              <w:fldChar w:fldCharType="separate"/>
-            </w:r>
-            <w:r>
-              <w:rPr>
-                <w:noProof/>
-                <w:webHidden/>
-              </w:rPr>
-              <w:t>6</w:t>
-            </w:r>
-            <w:r>
-              <w:rPr>
-                <w:noProof/>
-                <w:webHidden/>
-              </w:rPr>
-              <w:fldChar w:fldCharType="end"/>
-            </w:r>
-          </w:hyperlink>
-        </w:p>
-        <w:p>
-          <w:pPr>
-            <w:pStyle w:val="TM2"/>
-            <w:tabs>
-              <w:tab w:val="right" w:leader="dot" w:pos="8630"/>
-            </w:tabs>
-            <w:rPr>
-              <w:noProof/>
-            </w:rPr>
-          </w:pPr>
-          <w:hyperlink w:anchor="_Toc222346659" w:history="1">
-            <w:r>
-              <w:rPr>
-                <w:rStyle w:val="Lienhypertexte"/>
-                <w:noProof/>
-                <w:lang w:val="fr-FR"/>
-              </w:rPr>
-              <w:t>RGPD – Bandeau cookies</w:t>
-            </w:r>
-            <w:r>
-              <w:rPr>
-                <w:noProof/>
-                <w:webHidden/>
-              </w:rPr>
-              <w:tab/>
-            </w:r>
-            <w:r>
-              <w:rPr>
-                <w:noProof/>
-                <w:webHidden/>
-              </w:rPr>
-              <w:fldChar w:fldCharType="begin"/>
-            </w:r>
-            <w:r>
-              <w:rPr>
-                <w:noProof/>
-                <w:webHidden/>
-              </w:rPr>
-              <w:instrText xml:space="preserve"> PAGEREF _Toc222346659 \h </w:instrText>
-            </w:r>
-            <w:r>
-              <w:rPr>
-                <w:noProof/>
-                <w:webHidden/>
-              </w:rPr>
-            </w:r>
-            <w:r>
-              <w:rPr>
-                <w:noProof/>
-                <w:webHidden/>
-              </w:rPr>
-              <w:fldChar w:fldCharType="separate"/>
-            </w:r>
-            <w:r>
-              <w:rPr>
-                <w:noProof/>
-                <w:webHidden/>
-              </w:rPr>
-              <w:t>6</w:t>
-            </w:r>
-            <w:r>
-              <w:rPr>
-                <w:noProof/>
-                <w:webHidden/>
-              </w:rPr>
-              <w:fldChar w:fldCharType="end"/>
-            </w:r>
-          </w:hyperlink>
-        </w:p>
-        <w:p>
-          <w:pPr>
-            <w:pStyle w:val="TM2"/>
-            <w:tabs>
-              <w:tab w:val="right" w:leader="dot" w:pos="8630"/>
-            </w:tabs>
-            <w:rPr>
-              <w:noProof/>
-            </w:rPr>
-          </w:pPr>
-          <w:hyperlink w:anchor="_Toc222346660" w:history="1">
-            <w:r>
-              <w:rPr>
-                <w:rStyle w:val="Lienhypertexte"/>
-                <w:noProof/>
-                <w:lang w:val="fr-FR"/>
-              </w:rPr>
-              <w:t>Principe du moindre privilège</w:t>
-            </w:r>
-            <w:r>
-              <w:rPr>
-                <w:noProof/>
-                <w:webHidden/>
-              </w:rPr>
-              <w:tab/>
-            </w:r>
-            <w:r>
-              <w:rPr>
-                <w:noProof/>
-                <w:webHidden/>
-              </w:rPr>
-              <w:fldChar w:fldCharType="begin"/>
-            </w:r>
-            <w:r>
-              <w:rPr>
-                <w:noProof/>
-                <w:webHidden/>
-              </w:rPr>
-              <w:instrText xml:space="preserve"> PAGEREF _Toc222346660 \h </w:instrText>
-            </w:r>
-            <w:r>
-              <w:rPr>
-                <w:noProof/>
-                <w:webHidden/>
-              </w:rPr>
-            </w:r>
-            <w:r>
-              <w:rPr>
-                <w:noProof/>
-                <w:webHidden/>
-              </w:rPr>
-              <w:fldChar w:fldCharType="separate"/>
-            </w:r>
-            <w:r>
-              <w:rPr>
-                <w:noProof/>
-                <w:webHidden/>
-              </w:rPr>
-              <w:t>6</w:t>
-            </w:r>
-            <w:r>
-              <w:rPr>
-                <w:noProof/>
-                <w:webHidden/>
-              </w:rPr>
-              <w:fldChar w:fldCharType="end"/>
-            </w:r>
-          </w:hyperlink>
-        </w:p>
-        <w:p>
-          <w:pPr>
-            <w:pStyle w:val="TM1"/>
-            <w:tabs>
-              <w:tab w:val="right" w:leader="dot" w:pos="8630"/>
-            </w:tabs>
-            <w:rPr>
-              <w:noProof/>
-            </w:rPr>
-          </w:pPr>
-          <w:hyperlink w:anchor="_Toc222346661" w:history="1">
-            <w:r>
-              <w:rPr>
-                <w:rStyle w:val="Lienhypertexte"/>
-                <w:noProof/>
-                <w:lang w:val="fr-FR"/>
-              </w:rPr>
-              <w:t>5. Réponses aux User Stories</w:t>
-            </w:r>
-            <w:r>
-              <w:rPr>
-                <w:noProof/>
-                <w:webHidden/>
-              </w:rPr>
-              <w:tab/>
-            </w:r>
-            <w:r>
-              <w:rPr>
-                <w:noProof/>
-                <w:webHidden/>
-              </w:rPr>
-              <w:fldChar w:fldCharType="begin"/>
-            </w:r>
-            <w:r>
-              <w:rPr>
-                <w:noProof/>
-                <w:webHidden/>
-              </w:rPr>
-              <w:instrText xml:space="preserve"> PAGEREF _Toc222346661 \h </w:instrText>
-            </w:r>
-            <w:r>
-              <w:rPr>
-                <w:noProof/>
-                <w:webHidden/>
-              </w:rPr>
-            </w:r>
-            <w:r>
-              <w:rPr>
-                <w:noProof/>
-                <w:webHidden/>
-              </w:rPr>
-              <w:fldChar w:fldCharType="separate"/>
-            </w:r>
-            <w:r>
-              <w:rPr>
-                <w:noProof/>
-                <w:webHidden/>
-              </w:rPr>
-              <w:t>7</w:t>
-            </w:r>
-            <w:r>
-              <w:rPr>
-                <w:noProof/>
-                <w:webHidden/>
-              </w:rPr>
-              <w:fldChar w:fldCharType="end"/>
-            </w:r>
-          </w:hyperlink>
-        </w:p>
-        <w:p>
-          <w:pPr>
-            <w:pStyle w:val="TM2"/>
-            <w:tabs>
-              <w:tab w:val="right" w:leader="dot" w:pos="8630"/>
-            </w:tabs>
-            <w:rPr>
-              <w:noProof/>
-            </w:rPr>
-          </w:pPr>
-          <w:hyperlink w:anchor="_Toc222346662" w:history="1">
-            <w:r>
-              <w:rPr>
-                <w:rStyle w:val="Lienhypertexte"/>
-                <w:noProof/>
-                <w:lang w:val="fr-FR"/>
-              </w:rPr>
-              <w:t>US 1 – Page d'accueil</w:t>
-            </w:r>
-            <w:r>
-              <w:rPr>
-                <w:noProof/>
-                <w:webHidden/>
-              </w:rPr>
-              <w:tab/>
-            </w:r>
-            <w:r>
-              <w:rPr>
-                <w:noProof/>
-                <w:webHidden/>
-              </w:rPr>
-              <w:fldChar w:fldCharType="begin"/>
-            </w:r>
-            <w:r>
-              <w:rPr>
-                <w:noProof/>
-                <w:webHidden/>
-              </w:rPr>
-              <w:instrText xml:space="preserve"> PAGEREF _Toc222346662 \h </w:instrText>
-            </w:r>
-            <w:r>
-              <w:rPr>
-                <w:noProof/>
-                <w:webHidden/>
-              </w:rPr>
-            </w:r>
-            <w:r>
-              <w:rPr>
-                <w:noProof/>
-                <w:webHidden/>
-              </w:rPr>
-              <w:fldChar w:fldCharType="separate"/>
-            </w:r>
-            <w:r>
-              <w:rPr>
-                <w:noProof/>
-                <w:webHidden/>
-              </w:rPr>
-              <w:t>7</w:t>
-            </w:r>
-            <w:r>
-              <w:rPr>
-                <w:noProof/>
-                <w:webHidden/>
-              </w:rPr>
-              <w:fldChar w:fldCharType="end"/>
-            </w:r>
-          </w:hyperlink>
-        </w:p>
-        <w:p>
-          <w:pPr>
-            <w:pStyle w:val="TM2"/>
-            <w:tabs>
-              <w:tab w:val="right" w:leader="dot" w:pos="8630"/>
-            </w:tabs>
-            <w:rPr>
-              <w:noProof/>
-            </w:rPr>
-          </w:pPr>
-          <w:hyperlink w:anchor="_Toc222346663" w:history="1">
-            <w:r>
-              <w:rPr>
-                <w:rStyle w:val="Lienhypertexte"/>
-                <w:noProof/>
-                <w:lang w:val="fr-FR"/>
-              </w:rPr>
-              <w:t>US 2 – Menu de l'application</w:t>
-            </w:r>
-            <w:r>
-              <w:rPr>
-                <w:noProof/>
-                <w:webHidden/>
-              </w:rPr>
-              <w:tab/>
-            </w:r>
-            <w:r>
-              <w:rPr>
-                <w:noProof/>
-                <w:webHidden/>
-              </w:rPr>
-              <w:fldChar w:fldCharType="begin"/>
-            </w:r>
-            <w:r>
-              <w:rPr>
-                <w:noProof/>
-                <w:webHidden/>
-              </w:rPr>
-              <w:instrText xml:space="preserve"> PAGEREF _Toc222346663 \h </w:instrText>
-            </w:r>
-            <w:r>
-              <w:rPr>
-                <w:noProof/>
-                <w:webHidden/>
-              </w:rPr>
-            </w:r>
-            <w:r>
-              <w:rPr>
-                <w:noProof/>
-                <w:webHidden/>
-              </w:rPr>
-              <w:fldChar w:fldCharType="separate"/>
-            </w:r>
-            <w:r>
-              <w:rPr>
-                <w:noProof/>
-                <w:webHidden/>
-              </w:rPr>
-              <w:t>7</w:t>
-            </w:r>
-            <w:r>
-              <w:rPr>
-                <w:noProof/>
-                <w:webHidden/>
-              </w:rPr>
-              <w:fldChar w:fldCharType="end"/>
-            </w:r>
-          </w:hyperlink>
-        </w:p>
-        <w:p>
-          <w:pPr>
-            <w:pStyle w:val="TM2"/>
-            <w:tabs>
-              <w:tab w:val="right" w:leader="dot" w:pos="8630"/>
-            </w:tabs>
-            <w:rPr>
-              <w:noProof/>
-            </w:rPr>
-          </w:pPr>
-          <w:hyperlink w:anchor="_Toc222346664" w:history="1">
-            <w:r>
-              <w:rPr>
-                <w:rStyle w:val="Lienhypertexte"/>
-                <w:noProof/>
-                <w:lang w:val="fr-FR"/>
-              </w:rPr>
-              <w:t>US 3 – Vue des covoiturages</w:t>
-            </w:r>
-            <w:r>
-              <w:rPr>
-                <w:noProof/>
-                <w:webHidden/>
-              </w:rPr>
-              <w:tab/>
-            </w:r>
-            <w:r>
-              <w:rPr>
-                <w:noProof/>
-                <w:webHidden/>
-              </w:rPr>
-              <w:fldChar w:fldCharType="begin"/>
-            </w:r>
-            <w:r>
-              <w:rPr>
-                <w:noProof/>
-                <w:webHidden/>
-              </w:rPr>
-              <w:instrText xml:space="preserve"> PAGEREF _Toc222346664 \h </w:instrText>
-            </w:r>
-            <w:r>
-              <w:rPr>
-                <w:noProof/>
-                <w:webHidden/>
-              </w:rPr>
-            </w:r>
-            <w:r>
-              <w:rPr>
-                <w:noProof/>
-                <w:webHidden/>
-              </w:rPr>
-              <w:fldChar w:fldCharType="separate"/>
-            </w:r>
-            <w:r>
-              <w:rPr>
-                <w:noProof/>
-                <w:webHidden/>
-              </w:rPr>
-              <w:t>7</w:t>
-            </w:r>
-            <w:r>
-              <w:rPr>
-                <w:noProof/>
-                <w:webHidden/>
-              </w:rPr>
-              <w:fldChar w:fldCharType="end"/>
-            </w:r>
-          </w:hyperlink>
-        </w:p>
-        <w:p>
-          <w:pPr>
-            <w:pStyle w:val="TM2"/>
-            <w:tabs>
-              <w:tab w:val="right" w:leader="dot" w:pos="8630"/>
-            </w:tabs>
-            <w:rPr>
-              <w:noProof/>
-            </w:rPr>
-          </w:pPr>
-          <w:hyperlink w:anchor="_Toc222346665" w:history="1">
-            <w:r>
-              <w:rPr>
-                <w:rStyle w:val="Lienhypertexte"/>
-                <w:noProof/>
-                <w:lang w:val="fr-FR"/>
-              </w:rPr>
-              <w:t>US 4 – Filtres des covoiturages</w:t>
-            </w:r>
-            <w:r>
-              <w:rPr>
-                <w:noProof/>
-                <w:webHidden/>
-              </w:rPr>
-              <w:tab/>
-            </w:r>
-            <w:r>
-              <w:rPr>
-                <w:noProof/>
-                <w:webHidden/>
-              </w:rPr>
-              <w:fldChar w:fldCharType="begin"/>
-            </w:r>
-            <w:r>
-              <w:rPr>
-                <w:noProof/>
-                <w:webHidden/>
-              </w:rPr>
-              <w:instrText xml:space="preserve"> PAGEREF _Toc222346665 \h </w:instrText>
-            </w:r>
-            <w:r>
-              <w:rPr>
-                <w:noProof/>
-                <w:webHidden/>
-              </w:rPr>
-            </w:r>
-            <w:r>
-              <w:rPr>
-                <w:noProof/>
-                <w:webHidden/>
-              </w:rPr>
-              <w:fldChar w:fldCharType="separate"/>
-            </w:r>
-            <w:r>
-              <w:rPr>
-                <w:noProof/>
-                <w:webHidden/>
-              </w:rPr>
-              <w:t>7</w:t>
-            </w:r>
-            <w:r>
-              <w:rPr>
-                <w:noProof/>
-                <w:webHidden/>
-              </w:rPr>
-              <w:fldChar w:fldCharType="end"/>
-            </w:r>
-          </w:hyperlink>
-        </w:p>
-        <w:p>
-          <w:pPr>
-            <w:pStyle w:val="TM2"/>
-            <w:tabs>
-              <w:tab w:val="right" w:leader="dot" w:pos="8630"/>
-            </w:tabs>
-            <w:rPr>
-              <w:noProof/>
-            </w:rPr>
-          </w:pPr>
-          <w:hyperlink w:anchor="_Toc222346666" w:history="1">
-            <w:r>
-              <w:rPr>
-                <w:rStyle w:val="Lienhypertexte"/>
-                <w:noProof/>
-                <w:lang w:val="fr-FR"/>
-              </w:rPr>
-              <w:t>US 5 – Vue détaillée d'un covoiturage</w:t>
-            </w:r>
-            <w:r>
-              <w:rPr>
-                <w:noProof/>
-                <w:webHidden/>
-              </w:rPr>
-              <w:tab/>
-            </w:r>
-            <w:r>
-              <w:rPr>
-                <w:noProof/>
-                <w:webHidden/>
-              </w:rPr>
-              <w:fldChar w:fldCharType="begin"/>
-            </w:r>
-            <w:r>
-              <w:rPr>
-                <w:noProof/>
-                <w:webHidden/>
-              </w:rPr>
-              <w:instrText xml:space="preserve"> PAGEREF _Toc222346666 \h </w:instrText>
-            </w:r>
-            <w:r>
-              <w:rPr>
-                <w:noProof/>
-                <w:webHidden/>
-              </w:rPr>
-            </w:r>
-            <w:r>
-              <w:rPr>
-                <w:noProof/>
-                <w:webHidden/>
-              </w:rPr>
-              <w:fldChar w:fldCharType="separate"/>
-            </w:r>
-            <w:r>
-              <w:rPr>
-                <w:noProof/>
-                <w:webHidden/>
-              </w:rPr>
-              <w:t>8</w:t>
-            </w:r>
-            <w:r>
-              <w:rPr>
-                <w:noProof/>
-                <w:webHidden/>
-              </w:rPr>
-              <w:fldChar w:fldCharType="end"/>
-            </w:r>
-          </w:hyperlink>
-        </w:p>
-        <w:p>
-          <w:pPr>
-            <w:pStyle w:val="TM2"/>
-            <w:tabs>
-              <w:tab w:val="right" w:leader="dot" w:pos="8630"/>
-            </w:tabs>
-            <w:rPr>
-              <w:noProof/>
-            </w:rPr>
-          </w:pPr>
-          <w:hyperlink w:anchor="_Toc222346667" w:history="1">
-            <w:r>
-              <w:rPr>
-                <w:rStyle w:val="Lienhypertexte"/>
-                <w:noProof/>
-                <w:lang w:val="fr-FR"/>
-              </w:rPr>
-              <w:t>US 6 – Participer à un covoiturage</w:t>
-            </w:r>
-            <w:r>
-              <w:rPr>
-                <w:noProof/>
-                <w:webHidden/>
-              </w:rPr>
-              <w:tab/>
-            </w:r>
-            <w:r>
-              <w:rPr>
-                <w:noProof/>
-                <w:webHidden/>
-              </w:rPr>
-              <w:fldChar w:fldCharType="begin"/>
-            </w:r>
-            <w:r>
-              <w:rPr>
-                <w:noProof/>
-                <w:webHidden/>
-              </w:rPr>
-              <w:instrText xml:space="preserve"> PAGEREF _Toc222346667 \h </w:instrText>
-            </w:r>
-            <w:r>
-              <w:rPr>
-                <w:noProof/>
-                <w:webHidden/>
-              </w:rPr>
-            </w:r>
-            <w:r>
-              <w:rPr>
-                <w:noProof/>
-                <w:webHidden/>
-              </w:rPr>
-              <w:fldChar w:fldCharType="separate"/>
-            </w:r>
-            <w:r>
-              <w:rPr>
-                <w:noProof/>
-                <w:webHidden/>
-              </w:rPr>
-              <w:t>8</w:t>
-            </w:r>
-            <w:r>
-              <w:rPr>
-                <w:noProof/>
-                <w:webHidden/>
-              </w:rPr>
-              <w:fldChar w:fldCharType="end"/>
-            </w:r>
-          </w:hyperlink>
-        </w:p>
-        <w:p>
-          <w:pPr>
-            <w:pStyle w:val="TM2"/>
-            <w:tabs>
-              <w:tab w:val="right" w:leader="dot" w:pos="8630"/>
-            </w:tabs>
-            <w:rPr>
-              <w:noProof/>
-            </w:rPr>
-          </w:pPr>
-          <w:hyperlink w:anchor="_Toc222346668" w:history="1">
-            <w:r>
-              <w:rPr>
-                <w:rStyle w:val="Lienhypertexte"/>
-                <w:noProof/>
-                <w:lang w:val="fr-FR"/>
-              </w:rPr>
-              <w:t>US 7 – Création de compte</w:t>
-            </w:r>
-            <w:r>
-              <w:rPr>
-                <w:noProof/>
-                <w:webHidden/>
-              </w:rPr>
-              <w:tab/>
-            </w:r>
-            <w:r>
-              <w:rPr>
-                <w:noProof/>
-                <w:webHidden/>
-              </w:rPr>
-              <w:fldChar w:fldCharType="begin"/>
-            </w:r>
-            <w:r>
-              <w:rPr>
-                <w:noProof/>
-                <w:webHidden/>
-              </w:rPr>
-              <w:instrText xml:space="preserve"> PAGEREF _Toc222346668 \h </w:instrText>
-            </w:r>
-            <w:r>
-              <w:rPr>
-                <w:noProof/>
-                <w:webHidden/>
-              </w:rPr>
-            </w:r>
-            <w:r>
-              <w:rPr>
-                <w:noProof/>
-                <w:webHidden/>
-              </w:rPr>
-              <w:fldChar w:fldCharType="separate"/>
-            </w:r>
-            <w:r>
-              <w:rPr>
-                <w:noProof/>
-                <w:webHidden/>
-              </w:rPr>
-              <w:t>8</w:t>
-            </w:r>
-            <w:r>
-              <w:rPr>
-                <w:noProof/>
-                <w:webHidden/>
-              </w:rPr>
-              <w:fldChar w:fldCharType="end"/>
-            </w:r>
-          </w:hyperlink>
-        </w:p>
-        <w:p>
-          <w:pPr>
-            <w:pStyle w:val="TM2"/>
-            <w:tabs>
-              <w:tab w:val="right" w:leader="dot" w:pos="8630"/>
-            </w:tabs>
-            <w:rPr>
-              <w:noProof/>
-            </w:rPr>
-          </w:pPr>
-          <w:hyperlink w:anchor="_Toc222346669" w:history="1">
-            <w:r>
-              <w:rPr>
-                <w:rStyle w:val="Lienhypertexte"/>
-                <w:noProof/>
-                <w:lang w:val="fr-FR"/>
-              </w:rPr>
-              <w:t>US 8 – Espace Utilisateur</w:t>
-            </w:r>
-            <w:r>
-              <w:rPr>
-                <w:noProof/>
-                <w:webHidden/>
-              </w:rPr>
-              <w:tab/>
-            </w:r>
-            <w:r>
-              <w:rPr>
-                <w:noProof/>
-                <w:webHidden/>
-              </w:rPr>
-              <w:fldChar w:fldCharType="begin"/>
-            </w:r>
-            <w:r>
-              <w:rPr>
-                <w:noProof/>
-                <w:webHidden/>
-              </w:rPr>
-              <w:instrText xml:space="preserve"> PAGEREF _Toc222346669 \h </w:instrText>
-            </w:r>
-            <w:r>
-              <w:rPr>
-                <w:noProof/>
-                <w:webHidden/>
-              </w:rPr>
-            </w:r>
-            <w:r>
-              <w:rPr>
-                <w:noProof/>
-                <w:webHidden/>
-              </w:rPr>
-              <w:fldChar w:fldCharType="separate"/>
-            </w:r>
-            <w:r>
-              <w:rPr>
-                <w:noProof/>
-                <w:webHidden/>
-              </w:rPr>
-              <w:t>9</w:t>
-            </w:r>
-            <w:r>
-              <w:rPr>
-                <w:noProof/>
-                <w:webHidden/>
-              </w:rPr>
-              <w:fldChar w:fldCharType="end"/>
-            </w:r>
-          </w:hyperlink>
-        </w:p>
-        <w:p>
-          <w:pPr>
-            <w:pStyle w:val="TM2"/>
-            <w:tabs>
-              <w:tab w:val="right" w:leader="dot" w:pos="8630"/>
-            </w:tabs>
-            <w:rPr>
-              <w:noProof/>
-            </w:rPr>
-          </w:pPr>
-          <w:hyperlink w:anchor="_Toc222346670" w:history="1">
-            <w:r>
-              <w:rPr>
-                <w:rStyle w:val="Lienhypertexte"/>
-                <w:noProof/>
-                <w:lang w:val="fr-FR"/>
-              </w:rPr>
-              <w:t>US 9 – Saisir un voyage</w:t>
-            </w:r>
-            <w:r>
-              <w:rPr>
-                <w:noProof/>
-                <w:webHidden/>
-              </w:rPr>
-              <w:tab/>
-            </w:r>
-            <w:r>
-              <w:rPr>
-                <w:noProof/>
-                <w:webHidden/>
-              </w:rPr>
-              <w:fldChar w:fldCharType="begin"/>
-            </w:r>
-            <w:r>
-              <w:rPr>
-                <w:noProof/>
-                <w:webHidden/>
-              </w:rPr>
-              <w:instrText xml:space="preserve"> PAGEREF _Toc222346670 \h </w:instrText>
-            </w:r>
-            <w:r>
-              <w:rPr>
-                <w:noProof/>
-                <w:webHidden/>
-              </w:rPr>
-            </w:r>
-            <w:r>
-              <w:rPr>
-                <w:noProof/>
-                <w:webHidden/>
-              </w:rPr>
-              <w:fldChar w:fldCharType="separate"/>
-            </w:r>
-            <w:r>
-              <w:rPr>
-                <w:noProof/>
-                <w:webHidden/>
-              </w:rPr>
-              <w:t>9</w:t>
-            </w:r>
-            <w:r>
-              <w:rPr>
-                <w:noProof/>
-                <w:webHidden/>
-              </w:rPr>
-              <w:fldChar w:fldCharType="end"/>
-            </w:r>
-          </w:hyperlink>
-        </w:p>
-        <w:p>
-          <w:pPr>
-            <w:pStyle w:val="TM2"/>
-            <w:tabs>
-              <w:tab w:val="right" w:leader="dot" w:pos="8630"/>
-            </w:tabs>
-            <w:rPr>
-              <w:noProof/>
-            </w:rPr>
-          </w:pPr>
-          <w:hyperlink w:anchor="_Toc222346671" w:history="1">
-            <w:r>
-              <w:rPr>
-                <w:rStyle w:val="Lienhypertexte"/>
-                <w:noProof/>
-                <w:lang w:val="fr-FR"/>
-              </w:rPr>
-              <w:t>US 10 – Historique des covoiturages</w:t>
-            </w:r>
-            <w:r>
-              <w:rPr>
-                <w:noProof/>
-                <w:webHidden/>
-              </w:rPr>
-              <w:tab/>
-            </w:r>
-            <w:r>
-              <w:rPr>
-                <w:noProof/>
-                <w:webHidden/>
-              </w:rPr>
-              <w:fldChar w:fldCharType="begin"/>
-            </w:r>
-            <w:r>
-              <w:rPr>
-                <w:noProof/>
-                <w:webHidden/>
-              </w:rPr>
-              <w:instrText xml:space="preserve"> PAGEREF _Toc222346671 \h </w:instrText>
-            </w:r>
-            <w:r>
-              <w:rPr>
-                <w:noProof/>
-                <w:webHidden/>
-              </w:rPr>
-            </w:r>
-            <w:r>
-              <w:rPr>
-                <w:noProof/>
-                <w:webHidden/>
-              </w:rPr>
-              <w:fldChar w:fldCharType="separate"/>
-            </w:r>
-            <w:r>
-              <w:rPr>
-                <w:noProof/>
-                <w:webHidden/>
-              </w:rPr>
-              <w:t>9</w:t>
-            </w:r>
-            <w:r>
-              <w:rPr>
-                <w:noProof/>
-                <w:webHidden/>
-              </w:rPr>
-              <w:fldChar w:fldCharType="end"/>
-            </w:r>
-          </w:hyperlink>
-        </w:p>
-        <w:p>
-          <w:pPr>
-            <w:pStyle w:val="TM2"/>
-            <w:tabs>
-              <w:tab w:val="right" w:leader="dot" w:pos="8630"/>
-            </w:tabs>
-            <w:rPr>
-              <w:noProof/>
-            </w:rPr>
-          </w:pPr>
-          <w:hyperlink w:anchor="_Toc222346672" w:history="1">
-            <w:r>
-              <w:rPr>
-                <w:rStyle w:val="Lienhypertexte"/>
-                <w:noProof/>
-                <w:lang w:val="fr-FR"/>
-              </w:rPr>
-              <w:t>US 11 – Démarrer et arrêter un covoiturage</w:t>
-            </w:r>
-            <w:r>
-              <w:rPr>
-                <w:noProof/>
-                <w:webHidden/>
-              </w:rPr>
-              <w:tab/>
-            </w:r>
-            <w:r>
-              <w:rPr>
-                <w:noProof/>
-                <w:webHidden/>
-              </w:rPr>
-              <w:fldChar w:fldCharType="begin"/>
-            </w:r>
-            <w:r>
-              <w:rPr>
-                <w:noProof/>
-                <w:webHidden/>
-              </w:rPr>
-              <w:instrText xml:space="preserve"> PAGEREF _Toc222346672 \h </w:instrText>
-            </w:r>
-            <w:r>
-              <w:rPr>
-                <w:noProof/>
-                <w:webHidden/>
-              </w:rPr>
-            </w:r>
-            <w:r>
-              <w:rPr>
-                <w:noProof/>
-                <w:webHidden/>
-              </w:rPr>
-              <w:fldChar w:fldCharType="separate"/>
-            </w:r>
-            <w:r>
-              <w:rPr>
-                <w:noProof/>
-                <w:webHidden/>
-              </w:rPr>
-              <w:t>10</w:t>
-            </w:r>
-            <w:r>
-              <w:rPr>
-                <w:noProof/>
-                <w:webHidden/>
-              </w:rPr>
-              <w:fldChar w:fldCharType="end"/>
-            </w:r>
-          </w:hyperlink>
-        </w:p>
-        <w:p>
-          <w:pPr>
-            <w:pStyle w:val="TM2"/>
-            <w:tabs>
-              <w:tab w:val="right" w:leader="dot" w:pos="8630"/>
-            </w:tabs>
-            <w:rPr>
-              <w:noProof/>
-            </w:rPr>
-          </w:pPr>
-          <w:hyperlink w:anchor="_Toc222346673" w:history="1">
-            <w:r>
-              <w:rPr>
-                <w:rStyle w:val="Lienhypertexte"/>
-                <w:noProof/>
-                <w:lang w:val="fr-FR"/>
-              </w:rPr>
-              <w:t>US 12 – Espace employé</w:t>
-            </w:r>
-            <w:r>
-              <w:rPr>
-                <w:noProof/>
-                <w:webHidden/>
-              </w:rPr>
-              <w:tab/>
-            </w:r>
-            <w:r>
-              <w:rPr>
-                <w:noProof/>
-                <w:webHidden/>
-              </w:rPr>
-              <w:fldChar w:fldCharType="begin"/>
-            </w:r>
-            <w:r>
-              <w:rPr>
-                <w:noProof/>
-                <w:webHidden/>
-              </w:rPr>
-              <w:instrText xml:space="preserve"> PAGEREF _Toc222346673 \h </w:instrText>
-            </w:r>
-            <w:r>
-              <w:rPr>
-                <w:noProof/>
-                <w:webHidden/>
-              </w:rPr>
-            </w:r>
-            <w:r>
-              <w:rPr>
-                <w:noProof/>
-                <w:webHidden/>
-              </w:rPr>
-              <w:fldChar w:fldCharType="separate"/>
-            </w:r>
-            <w:r>
-              <w:rPr>
-                <w:noProof/>
-                <w:webHidden/>
-              </w:rPr>
-              <w:t>10</w:t>
-            </w:r>
-            <w:r>
-              <w:rPr>
-                <w:noProof/>
-                <w:webHidden/>
-              </w:rPr>
-              <w:fldChar w:fldCharType="end"/>
-            </w:r>
-          </w:hyperlink>
-        </w:p>
-        <w:p>
-          <w:pPr>
-            <w:pStyle w:val="TM2"/>
-            <w:tabs>
-              <w:tab w:val="right" w:leader="dot" w:pos="8630"/>
-            </w:tabs>
-            <w:rPr>
-              <w:noProof/>
-            </w:rPr>
-          </w:pPr>
-          <w:hyperlink w:anchor="_Toc222346674" w:history="1">
-            <w:r>
-              <w:rPr>
-                <w:rStyle w:val="Lienhypertexte"/>
-                <w:noProof/>
-                <w:lang w:val="fr-FR"/>
-              </w:rPr>
-              <w:t>US 13 – Espace administrateur</w:t>
-            </w:r>
-            <w:r>
-              <w:rPr>
-                <w:noProof/>
-                <w:webHidden/>
-              </w:rPr>
-              <w:tab/>
-            </w:r>
-            <w:r>
-              <w:rPr>
-                <w:noProof/>
-                <w:webHidden/>
-              </w:rPr>
-              <w:fldChar w:fldCharType="begin"/>
-            </w:r>
-            <w:r>
-              <w:rPr>
-                <w:noProof/>
-                <w:webHidden/>
-              </w:rPr>
-              <w:instrText xml:space="preserve"> PAGEREF _Toc222346674 \h </w:instrText>
-            </w:r>
-            <w:r>
-              <w:rPr>
-                <w:noProof/>
-                <w:webHidden/>
-              </w:rPr>
-            </w:r>
-            <w:r>
-              <w:rPr>
-                <w:noProof/>
-                <w:webHidden/>
-              </w:rPr>
-              <w:fldChar w:fldCharType="separate"/>
-            </w:r>
-            <w:r>
-              <w:rPr>
-                <w:noProof/>
-                <w:webHidden/>
-              </w:rPr>
-              <w:t>10</w:t>
-            </w:r>
-            <w:r>
-              <w:rPr>
-                <w:noProof/>
-                <w:webHidden/>
-              </w:rPr>
-              <w:fldChar w:fldCharType="end"/>
-            </w:r>
-          </w:hyperlink>
-        </w:p>
-        <w:p>
-          <w:pPr>
-            <w:pStyle w:val="TM1"/>
-            <w:tabs>
-              <w:tab w:val="right" w:leader="dot" w:pos="8630"/>
-            </w:tabs>
-            <w:rPr>
-              <w:noProof/>
-            </w:rPr>
-          </w:pPr>
-          <w:hyperlink w:anchor="_Toc222346675" w:history="1">
-            <w:r>
-              <w:rPr>
-                <w:rStyle w:val="Lienhypertexte"/>
-                <w:noProof/>
-                <w:lang w:val="fr-FR"/>
-              </w:rPr>
-              <w:t>6. Conclusion</w:t>
-            </w:r>
-            <w:r>
-              <w:rPr>
-                <w:noProof/>
-                <w:webHidden/>
-              </w:rPr>
-              <w:tab/>
-            </w:r>
-            <w:r>
-              <w:rPr>
-                <w:noProof/>
-                <w:webHidden/>
-              </w:rPr>
-              <w:fldChar w:fldCharType="begin"/>
-            </w:r>
-            <w:r>
-              <w:rPr>
-                <w:noProof/>
-                <w:webHidden/>
-              </w:rPr>
-              <w:instrText xml:space="preserve"> PAGEREF _Toc222346675 \h </w:instrText>
-            </w:r>
-            <w:r>
-              <w:rPr>
-                <w:noProof/>
-                <w:webHidden/>
-              </w:rPr>
-            </w:r>
-            <w:r>
-              <w:rPr>
-                <w:noProof/>
-                <w:webHidden/>
-              </w:rPr>
-              <w:fldChar w:fldCharType="separate"/>
-            </w:r>
-            <w:r>
-              <w:rPr>
-                <w:noProof/>
-                <w:webHidden/>
-              </w:rPr>
-              <w:t>11</w:t>
+              <w:t>12</w:t>
             </w:r>
             <w:r>
               <w:rPr>
@@ -2842,29 +3055,58 @@
           <w:lang w:val="fr-FR"/>
         </w:rPr>
       </w:pPr>
-      <w:bookmarkStart w:id="1" w:name="_Toc222346639"/>
+      <w:bookmarkStart w:id="0" w:name="_Toc222346857"/>
       <w:r>
         <w:rPr>
           <w:lang w:val="fr-FR"/>
         </w:rPr>
         <w:lastRenderedPageBreak/>
         <w:t>1. Liens des livrables</w:t>
+      </w:r>
+      <w:bookmarkEnd w:id="0"/>
+    </w:p>
+    <w:p>
+      <w:pPr>
+        <w:pStyle w:val="Titre2"/>
+        <w:rPr>
+          <w:lang w:val="fr-FR"/>
+        </w:rPr>
+      </w:pPr>
+      <w:bookmarkStart w:id="1" w:name="_Toc222346858"/>
+      <w:r>
+        <w:rPr>
+          <w:lang w:val="fr-FR"/>
+        </w:rPr>
+        <w:t>Dépôt GitHub (public)</w:t>
       </w:r>
       <w:bookmarkEnd w:id="1"/>
     </w:p>
     <w:p>
       <w:pPr>
+        <w:rPr>
+          <w:lang w:val="fr-FR"/>
+        </w:rPr>
+      </w:pPr>
+      <w:r>
+        <w:rPr>
+          <w:lang w:val="fr-FR"/>
+        </w:rPr>
+        <w:t xml:space="preserve">https://github.com/halajarin/StudyProject </w:t>
+      </w:r>
+    </w:p>
+    <w:p>
+      <w:pPr>
         <w:pStyle w:val="Titre2"/>
         <w:rPr>
           <w:lang w:val="fr-FR"/>
         </w:rPr>
       </w:pPr>
-      <w:bookmarkStart w:id="2" w:name="_Toc222346640"/>
-      <w:r>
-        <w:rPr>
-          <w:lang w:val="fr-FR"/>
-        </w:rPr>
-        <w:t>Dépôt GitHub (public)</w:t>
+      <w:bookmarkStart w:id="2" w:name="_Toc222346859"/>
+      <w:r>
+        <w:rPr>
+          <w:lang w:val="fr-FR"/>
+        </w:rPr>
+        <w:t>Application déployée</w:t>
       </w:r>
       <w:bookmarkEnd w:id="2"/>
     </w:p>
@@ -2878,7 +3120,7 @@
         <w:rPr>
           <w:lang w:val="fr-FR"/>
         </w:rPr>
-        <w:t xml:space="preserve">https://github.com/halajarin/StudyProject </w:t>
+        <w:t>https://myportal3e.io/portal/ecoride/</w:t>
       </w:r>
     </w:p>
     <w:p>
@@ -2888,12 +3130,12 @@
           <w:lang w:val="fr-FR"/>
         </w:rPr>
       </w:pPr>
-      <w:bookmarkStart w:id="3" w:name="_Toc222346641"/>
-      <w:r>
-        <w:rPr>
-          <w:lang w:val="fr-FR"/>
-        </w:rPr>
-        <w:t>Application déployée</w:t>
+      <w:bookmarkStart w:id="3" w:name="_Toc222346860"/>
+      <w:r>
+        <w:rPr>
+          <w:lang w:val="fr-FR"/>
+        </w:rPr>
+        <w:t>Gestion de projet (Kanban)</w:t>
       </w:r>
       <w:bookmarkEnd w:id="3"/>
     </w:p>
@@ -2907,50 +3149,23 @@
         <w:rPr>
           <w:lang w:val="fr-FR"/>
         </w:rPr>
-        <w:t>https://myportal3e.io/portal/ecoride/</w:t>
+        <w:t>https://trello.com/b/OozyCFuO/kanban-ecoride</w:t>
+      </w:r>
+      <w:r>
+        <w:rPr>
+          <w:lang w:val="fr-FR"/>
+        </w:rPr>
+        <w:br w:type="page"/>
       </w:r>
     </w:p>
     <w:p>
       <w:pPr>
-        <w:pStyle w:val="Titre2"/>
+        <w:pStyle w:val="Titre1"/>
         <w:rPr>
           <w:lang w:val="fr-FR"/>
         </w:rPr>
       </w:pPr>
-      <w:bookmarkStart w:id="4" w:name="_Toc222346642"/>
-      <w:r>
-        <w:rPr>
-          <w:lang w:val="fr-FR"/>
-        </w:rPr>
-        <w:t>Gestion de projet (Kanban)</w:t>
-      </w:r>
-      <w:bookmarkEnd w:id="4"/>
-    </w:p>
-    <w:p>
-      <w:pPr>
-        <w:rPr>
-          <w:lang w:val="fr-FR"/>
-        </w:rPr>
-      </w:pPr>
-      <w:r>
-        <w:rPr>
-          <w:lang w:val="fr-FR"/>
-        </w:rPr>
-        <w:t>https://trello.com/b/OozyCFuO/kanban-ecoride</w:t>
-      </w:r>
-      <w:r>
-        <w:rPr>
-          <w:lang w:val="fr-FR"/>
-        </w:rPr>
-        <w:br w:type="page"/>
-      </w:r>
-    </w:p>
-    <w:p>
-      <w:pPr>
-        <w:rPr>
-          <w:lang w:val="fr-FR"/>
-        </w:rPr>
-      </w:pPr>
+      <w:bookmarkStart w:id="4" w:name="_Toc222346861"/>
       <w:r>
         <w:rPr>
           <w:lang w:val="fr-FR"/>
@@ -2958,6 +3173,7 @@
         <w:lastRenderedPageBreak/>
         <w:t>2. Arborescence des livrables</w:t>
       </w:r>
+      <w:bookmarkEnd w:id="4"/>
     </w:p>
     <w:p>
       <w:pPr>
@@ -3467,7 +3683,7 @@
       <w:pPr>
         <w:pStyle w:val="Titre1"/>
       </w:pPr>
-      <w:bookmarkStart w:id="5" w:name="_Toc222346643"/>
+      <w:bookmarkStart w:id="5" w:name="_Toc222346862"/>
       <w:r>
         <w:t>3. Choix techniques</w:t>
       </w:r>
@@ -3477,7 +3693,7 @@
       <w:pPr>
         <w:pStyle w:val="Titre2"/>
       </w:pPr>
-      <w:bookmarkStart w:id="6" w:name="_Toc222346644"/>
+      <w:bookmarkStart w:id="6" w:name="_Toc222346863"/>
       <w:r>
         <w:t xml:space="preserve">Stack technique </w:t>
       </w:r>
@@ -3702,7 +3918,7 @@
           <w:lang w:val="fr-FR"/>
         </w:rPr>
       </w:pPr>
-      <w:bookmarkStart w:id="7" w:name="_Toc222346645"/>
+      <w:bookmarkStart w:id="7" w:name="_Toc222346864"/>
       <w:r>
         <w:rPr>
           <w:lang w:val="fr-FR"/>
@@ -3719,7 +3935,7 @@
           <w:lang w:val="fr-FR"/>
         </w:rPr>
       </w:pPr>
-      <w:bookmarkStart w:id="8" w:name="_Toc222346646"/>
+      <w:bookmarkStart w:id="8" w:name="_Toc222346865"/>
       <w:proofErr w:type="spellStart"/>
       <w:r>
         <w:rPr>
@@ -3834,7 +4050,7 @@
           <w:lang w:val="fr-FR"/>
         </w:rPr>
       </w:pPr>
-      <w:bookmarkStart w:id="9" w:name="_Toc222346647"/>
+      <w:bookmarkStart w:id="9" w:name="_Toc222346866"/>
       <w:r>
         <w:rPr>
           <w:lang w:val="fr-FR"/>
@@ -3905,7 +4121,7 @@
           <w:lang w:val="fr-FR"/>
         </w:rPr>
       </w:pPr>
-      <w:bookmarkStart w:id="10" w:name="_Toc222346648"/>
+      <w:bookmarkStart w:id="10" w:name="_Toc222346867"/>
       <w:r>
         <w:rPr>
           <w:lang w:val="fr-FR"/>
@@ -3934,7 +4150,7 @@
           <w:lang w:val="fr-FR"/>
         </w:rPr>
       </w:pPr>
-      <w:bookmarkStart w:id="11" w:name="_Toc222346649"/>
+      <w:bookmarkStart w:id="11" w:name="_Toc222346868"/>
       <w:r>
         <w:rPr>
           <w:lang w:val="fr-FR"/>
@@ -3977,7 +4193,7 @@
           <w:lang w:val="fr-FR"/>
         </w:rPr>
       </w:pPr>
-      <w:bookmarkStart w:id="12" w:name="_Toc222346650"/>
+      <w:bookmarkStart w:id="12" w:name="_Toc222346869"/>
       <w:r>
         <w:rPr>
           <w:lang w:val="fr-FR"/>
@@ -4047,7 +4263,7 @@
           <w:lang w:val="fr-FR"/>
         </w:rPr>
       </w:pPr>
-      <w:bookmarkStart w:id="13" w:name="_Toc222346651"/>
+      <w:bookmarkStart w:id="13" w:name="_Toc222346870"/>
       <w:r>
         <w:rPr>
           <w:lang w:val="fr-FR"/>
@@ -4064,7 +4280,7 @@
           <w:lang w:val="fr-FR"/>
         </w:rPr>
       </w:pPr>
-      <w:bookmarkStart w:id="14" w:name="_Toc222346652"/>
+      <w:bookmarkStart w:id="14" w:name="_Toc222346871"/>
       <w:r>
         <w:rPr>
           <w:lang w:val="fr-FR"/>
@@ -4163,7 +4379,7 @@
           <w:lang w:val="fr-FR"/>
         </w:rPr>
       </w:pPr>
-      <w:bookmarkStart w:id="15" w:name="_Toc222346653"/>
+      <w:bookmarkStart w:id="15" w:name="_Toc222346872"/>
       <w:r>
         <w:rPr>
           <w:lang w:val="fr-FR"/>
@@ -4206,7 +4422,7 @@
           <w:lang w:val="fr-FR"/>
         </w:rPr>
       </w:pPr>
-      <w:bookmarkStart w:id="16" w:name="_Toc222346654"/>
+      <w:bookmarkStart w:id="16" w:name="_Toc222346873"/>
       <w:r>
         <w:rPr>
           <w:lang w:val="fr-FR"/>
@@ -4235,7 +4451,7 @@
           <w:lang w:val="fr-FR"/>
         </w:rPr>
       </w:pPr>
-      <w:bookmarkStart w:id="17" w:name="_Toc222346655"/>
+      <w:bookmarkStart w:id="17" w:name="_Toc222346874"/>
       <w:r>
         <w:rPr>
           <w:lang w:val="fr-FR"/>
@@ -4350,7 +4566,7 @@
           <w:lang w:val="fr-FR"/>
         </w:rPr>
       </w:pPr>
-      <w:bookmarkStart w:id="18" w:name="_Toc222346656"/>
+      <w:bookmarkStart w:id="18" w:name="_Toc222346875"/>
       <w:r>
         <w:rPr>
           <w:lang w:val="fr-FR"/>
@@ -4415,7 +4631,7 @@
           <w:lang w:val="fr-FR"/>
         </w:rPr>
       </w:pPr>
-      <w:bookmarkStart w:id="19" w:name="_Toc222346657"/>
+      <w:bookmarkStart w:id="19" w:name="_Toc222346876"/>
       <w:r>
         <w:rPr>
           <w:lang w:val="fr-FR"/>
@@ -4458,7 +4674,7 @@
           <w:lang w:val="fr-FR"/>
         </w:rPr>
       </w:pPr>
-      <w:bookmarkStart w:id="20" w:name="_Toc222346658"/>
+      <w:bookmarkStart w:id="20" w:name="_Toc222346877"/>
       <w:r>
         <w:rPr>
           <w:lang w:val="fr-FR"/>
@@ -4543,7 +4759,7 @@
           <w:lang w:val="fr-FR"/>
         </w:rPr>
       </w:pPr>
-      <w:bookmarkStart w:id="21" w:name="_Toc222346659"/>
+      <w:bookmarkStart w:id="21" w:name="_Toc222346878"/>
       <w:r>
         <w:rPr>
           <w:lang w:val="fr-FR"/>
@@ -4572,7 +4788,7 @@
           <w:lang w:val="fr-FR"/>
         </w:rPr>
       </w:pPr>
-      <w:bookmarkStart w:id="22" w:name="_Toc222346660"/>
+      <w:bookmarkStart w:id="22" w:name="_Toc222346879"/>
       <w:r>
         <w:rPr>
           <w:lang w:val="fr-FR"/>
@@ -4614,7 +4830,7 @@
           <w:lang w:val="fr-FR"/>
         </w:rPr>
       </w:pPr>
-      <w:bookmarkStart w:id="23" w:name="_Toc222346661"/>
+      <w:bookmarkStart w:id="23" w:name="_Toc222346880"/>
       <w:r>
         <w:rPr>
           <w:lang w:val="fr-FR"/>
@@ -4631,7 +4847,7 @@
           <w:lang w:val="fr-FR"/>
         </w:rPr>
       </w:pPr>
-      <w:bookmarkStart w:id="24" w:name="_Toc222346662"/>
+      <w:bookmarkStart w:id="24" w:name="_Toc222346881"/>
       <w:r>
         <w:rPr>
           <w:lang w:val="fr-FR"/>
@@ -4758,7 +4974,7 @@
           <w:lang w:val="fr-FR"/>
         </w:rPr>
       </w:pPr>
-      <w:bookmarkStart w:id="25" w:name="_Toc222346663"/>
+      <w:bookmarkStart w:id="25" w:name="_Toc222346882"/>
       <w:r>
         <w:rPr>
           <w:lang w:val="fr-FR"/>
@@ -4863,7 +5079,7 @@
           <w:lang w:val="fr-FR"/>
         </w:rPr>
       </w:pPr>
-      <w:bookmarkStart w:id="26" w:name="_Toc222346664"/>
+      <w:bookmarkStart w:id="26" w:name="_Toc222346883"/>
       <w:r>
         <w:rPr>
           <w:lang w:val="fr-FR"/>
@@ -4999,7 +5215,7 @@
           <w:lang w:val="fr-FR"/>
         </w:rPr>
       </w:pPr>
-      <w:bookmarkStart w:id="27" w:name="_Toc222346665"/>
+      <w:bookmarkStart w:id="27" w:name="_Toc222346884"/>
       <w:r>
         <w:rPr>
           <w:lang w:val="fr-FR"/>
@@ -5089,7 +5305,7 @@
           <w:lang w:val="fr-FR"/>
         </w:rPr>
       </w:pPr>
-      <w:bookmarkStart w:id="28" w:name="_Toc222346666"/>
+      <w:bookmarkStart w:id="28" w:name="_Toc222346885"/>
       <w:r>
         <w:rPr>
           <w:lang w:val="fr-FR"/>
@@ -5224,7 +5440,7 @@
           <w:lang w:val="fr-FR"/>
         </w:rPr>
       </w:pPr>
-      <w:bookmarkStart w:id="29" w:name="_Toc222346667"/>
+      <w:bookmarkStart w:id="29" w:name="_Toc222346886"/>
       <w:r>
         <w:rPr>
           <w:lang w:val="fr-FR"/>
@@ -5350,7 +5566,7 @@
           <w:lang w:val="fr-FR"/>
         </w:rPr>
       </w:pPr>
-      <w:bookmarkStart w:id="30" w:name="_Toc222346668"/>
+      <w:bookmarkStart w:id="30" w:name="_Toc222346887"/>
       <w:r>
         <w:rPr>
           <w:lang w:val="fr-FR"/>
@@ -5492,7 +5708,7 @@
           <w:lang w:val="fr-FR"/>
         </w:rPr>
       </w:pPr>
-      <w:bookmarkStart w:id="31" w:name="_Toc222346669"/>
+      <w:bookmarkStart w:id="31" w:name="_Toc222346888"/>
       <w:r>
         <w:rPr>
           <w:lang w:val="fr-FR"/>
@@ -5598,7 +5814,7 @@
           <w:lang w:val="fr-FR"/>
         </w:rPr>
       </w:pPr>
-      <w:bookmarkStart w:id="32" w:name="_Toc222346670"/>
+      <w:bookmarkStart w:id="32" w:name="_Toc222346889"/>
       <w:r>
         <w:rPr>
           <w:lang w:val="fr-FR"/>
@@ -5719,7 +5935,7 @@
           <w:lang w:val="fr-FR"/>
         </w:rPr>
       </w:pPr>
-      <w:bookmarkStart w:id="33" w:name="_Toc222346671"/>
+      <w:bookmarkStart w:id="33" w:name="_Toc222346890"/>
       <w:r>
         <w:rPr>
           <w:lang w:val="fr-FR"/>
@@ -5844,7 +6060,7 @@
           <w:lang w:val="fr-FR"/>
         </w:rPr>
       </w:pPr>
-      <w:bookmarkStart w:id="34" w:name="_Toc222346672"/>
+      <w:bookmarkStart w:id="34" w:name="_Toc222346891"/>
       <w:r>
         <w:rPr>
           <w:lang w:val="fr-FR"/>
@@ -5977,7 +6193,7 @@
           <w:lang w:val="fr-FR"/>
         </w:rPr>
       </w:pPr>
-      <w:bookmarkStart w:id="35" w:name="_Toc222346673"/>
+      <w:bookmarkStart w:id="35" w:name="_Toc222346892"/>
       <w:r>
         <w:rPr>
           <w:lang w:val="fr-FR"/>
@@ -6175,7 +6391,7 @@
           <w:lang w:val="fr-FR"/>
         </w:rPr>
       </w:pPr>
-      <w:bookmarkStart w:id="36" w:name="_Toc222346674"/>
+      <w:bookmarkStart w:id="36" w:name="_Toc222346893"/>
       <w:r>
         <w:rPr>
           <w:lang w:val="fr-FR"/>
@@ -6356,7 +6572,7 @@
           <w:lang w:val="fr-FR"/>
         </w:rPr>
       </w:pPr>
-      <w:bookmarkStart w:id="37" w:name="_Toc222346675"/>
+      <w:bookmarkStart w:id="37" w:name="_Toc222346894"/>
       <w:r>
         <w:rPr>
           <w:lang w:val="fr-FR"/>

</xml_diff>